<commit_message>
starting the server implementation
</commit_message>
<xml_diff>
--- a/TheProspector/Assets/Docs/Related School Work/LUT/Game Design Document.docx
+++ b/TheProspector/Assets/Docs/Related School Work/LUT/Game Design Document.docx
@@ -5257,6 +5257,94 @@
         <w:t>Gestation actions create ideas, which are aspects that carry tags. Gestation actions also involve tape-trade and exchange of ideas in general between players.</w:t>
       </w:r>
       <w:r>
+        <w:t xml:space="preserve"> </w:t>
+      </w:r>
+      <w:r>
+        <w:t>List of gestation actions:</w:t>
+      </w:r>
+    </w:p>
+    <w:p>
+      <w:pPr>
+        <w:pStyle w:val="Normaali2"/>
+        <w:numPr>
+          <w:ilvl w:val="0"/>
+          <w:numId w:val="5"/>
+        </w:numPr>
+      </w:pPr>
+      <w:r>
+        <w:t>extract a resonance tag from another game entity into a character’s transient tag slot</w:t>
+      </w:r>
+    </w:p>
+    <w:p>
+      <w:pPr>
+        <w:pStyle w:val="Normaali2"/>
+        <w:numPr>
+          <w:ilvl w:val="0"/>
+          <w:numId w:val="5"/>
+        </w:numPr>
+      </w:pPr>
+      <w:r>
+        <w:t>impregnate an aspect with a tag from any own tag slot</w:t>
+      </w:r>
+    </w:p>
+    <w:p>
+      <w:pPr>
+        <w:pStyle w:val="Normaali2"/>
+      </w:pPr>
+    </w:p>
+    <w:p>
+      <w:pPr>
+        <w:pStyle w:val="Normaali2"/>
+      </w:pPr>
+      <w:r>
+        <w:t xml:space="preserve">Strain penalty: </w:t>
+      </w:r>
+      <w:r>
+        <w:rPr>
+          <w:b/>
+          <w:bCs/>
+        </w:rPr>
+        <w:t>All over the place.</w:t>
+      </w:r>
+      <w:r>
+        <w:rPr>
+          <w:b/>
+          <w:bCs/>
+        </w:rPr>
+        <w:t xml:space="preserve"> </w:t>
+      </w:r>
+      <w:r>
+        <w:t>The character must either play their transient tag into an idea or abandon it for another one</w:t>
+      </w:r>
+      <w:r>
+        <w:t xml:space="preserve"> available</w:t>
+      </w:r>
+      <w:r>
+        <w:t xml:space="preserve"> (within reach)</w:t>
+      </w:r>
+      <w:r>
+        <w:t>.</w:t>
+      </w:r>
+      <w:r>
+        <w:t xml:space="preserve"> At the end of the action, their transient tag must have changed.</w:t>
+      </w:r>
+    </w:p>
+    <w:p>
+      <w:pPr>
+        <w:pStyle w:val="Otsikko4"/>
+      </w:pPr>
+      <w:r>
+        <w:t>4.2.2 Rehearsal Actions</w:t>
+      </w:r>
+    </w:p>
+    <w:p>
+      <w:pPr>
+        <w:pStyle w:val="Normaali2"/>
+      </w:pPr>
+      <w:r>
+        <w:t>Rehearsal actions are for sharpening the gestated ideas into perfection and recording them down unto a demo tape.</w:t>
+      </w:r>
+      <w:r>
         <w:t xml:space="preserve"> Strain penalty: </w:t>
       </w:r>
       <w:r>
@@ -5264,7 +5352,7 @@
           <w:b/>
           <w:bCs/>
         </w:rPr>
-        <w:t>All over the place.</w:t>
+        <w:t>Burnout.</w:t>
       </w:r>
       <w:r>
         <w:rPr>
@@ -5274,24 +5362,21 @@
         <w:t xml:space="preserve"> </w:t>
       </w:r>
       <w:r>
-        <w:t>The character must either play their transient tag into an idea or abandon it for another one</w:t>
-      </w:r>
-      <w:r>
-        <w:t xml:space="preserve"> available</w:t>
+        <w:t>The character cannot access their mood tag</w:t>
+      </w:r>
+      <w:r>
+        <w:t>, and loose momentarily anything attached to it</w:t>
       </w:r>
       <w:r>
         <w:t>.</w:t>
       </w:r>
-      <w:r>
-        <w:t xml:space="preserve"> At the end of the action, their transient tag must have changed.</w:t>
-      </w:r>
     </w:p>
     <w:p>
       <w:pPr>
         <w:pStyle w:val="Otsikko4"/>
       </w:pPr>
       <w:r>
-        <w:t>4.2.2 Rehearsal Actions</w:t>
+        <w:t>4.2.3 Promotional Actions</w:t>
       </w:r>
     </w:p>
     <w:p>
@@ -5299,7 +5384,46 @@
         <w:pStyle w:val="Normaali2"/>
       </w:pPr>
       <w:r>
-        <w:t>Rehearsal actions are for sharpening the gestated ideas into perfection and recording them down unto a demo tape.</w:t>
+        <w:t xml:space="preserve">Promotional actions are for getting others acquainted with your materials beyond the Keeper’s supervision. </w:t>
+      </w:r>
+      <w:r>
+        <w:t>Strain penalty:</w:t>
+      </w:r>
+      <w:r>
+        <w:t xml:space="preserve"> </w:t>
+      </w:r>
+      <w:r>
+        <w:rPr>
+          <w:b/>
+          <w:bCs/>
+        </w:rPr>
+        <w:t>Too on the nose.</w:t>
+      </w:r>
+      <w:r>
+        <w:t xml:space="preserve"> </w:t>
+      </w:r>
+      <w:r>
+        <w:t>The character must interact with any instance of their convictional anti-tag at the next convenient moment.</w:t>
+      </w:r>
+    </w:p>
+    <w:p>
+      <w:pPr>
+        <w:pStyle w:val="Otsikko4"/>
+      </w:pPr>
+      <w:r>
+        <w:lastRenderedPageBreak/>
+        <w:t>4.2.4 Keeper Actions</w:t>
+      </w:r>
+    </w:p>
+    <w:p>
+      <w:r>
+        <w:t>The Keeper has powerful, genre-bending decisions at their disposal. For example, they can declare a demo as black metal even if it lacks the genre defining re-sacralising tag-pair (see 4.5). They can lose other people’s demos and thus hinder their circulation in the scene. They can also take credit from other people’s actions at slightest hints of involvement.</w:t>
+      </w:r>
+      <w:r>
+        <w:t xml:space="preserve"> </w:t>
+      </w:r>
+      <w:r>
+        <w:t>They can declare a relatively weak aspect or tag as heretical to the sound, or conversely, bring an aspect or tag that seems on the periphery of True into the fold legitimately. The price for these actions is that the next Keeper in line has access to the same actions and might be able to retaliate.</w:t>
       </w:r>
       <w:r>
         <w:t xml:space="preserve"> Strain penalty: </w:t>
@@ -5309,7 +5433,7 @@
           <w:b/>
           <w:bCs/>
         </w:rPr>
-        <w:t>Burnout.</w:t>
+        <w:t>Overreach.</w:t>
       </w:r>
       <w:r>
         <w:rPr>
@@ -5319,91 +5443,7 @@
         <w:t xml:space="preserve"> </w:t>
       </w:r>
       <w:r>
-        <w:t>The character cannot access their mood tag</w:t>
-      </w:r>
-      <w:r>
-        <w:t>, and loose momentarily anything attached to it</w:t>
-      </w:r>
-      <w:r>
-        <w:t>.</w:t>
-      </w:r>
-    </w:p>
-    <w:p>
-      <w:pPr>
-        <w:pStyle w:val="Otsikko4"/>
-      </w:pPr>
-      <w:r>
-        <w:t>4.2.3 Promotional Actions</w:t>
-      </w:r>
-    </w:p>
-    <w:p>
-      <w:pPr>
-        <w:pStyle w:val="Normaali2"/>
-      </w:pPr>
-      <w:r>
-        <w:t xml:space="preserve">Promotional actions are for getting others acquainted with your materials beyond the Keeper’s supervision. </w:t>
-      </w:r>
-      <w:r>
-        <w:t>Strain penalty:</w:t>
-      </w:r>
-      <w:r>
-        <w:t xml:space="preserve"> </w:t>
-      </w:r>
-      <w:r>
-        <w:rPr>
-          <w:b/>
-          <w:bCs/>
-        </w:rPr>
-        <w:t>Too on the nose.</w:t>
-      </w:r>
-      <w:r>
-        <w:t xml:space="preserve"> </w:t>
-      </w:r>
-      <w:r>
-        <w:t>The character must interact with any instance of their convictional anti-tag at the next convenient moment.</w:t>
-      </w:r>
-    </w:p>
-    <w:p>
-      <w:pPr>
-        <w:pStyle w:val="Otsikko4"/>
-      </w:pPr>
-      <w:r>
-        <w:t>4.2.4 Keeper Actions</w:t>
-      </w:r>
-    </w:p>
-    <w:p>
-      <w:r>
-        <w:t>The Keeper has powerful, genre-bending decisions at their disposal. For example, they can declare a demo as black metal even if it lacks the genre defining re-sacralising tag-pair (see 4.5). They can lose other people’s demos and thus hinder their circulation in the scene. They can also take credit from other people’s actions at slightest hints of involvement.</w:t>
-      </w:r>
-      <w:r>
-        <w:t xml:space="preserve"> </w:t>
-      </w:r>
-      <w:r>
-        <w:t>They can declare a relatively weak aspect or tag as heretical to the sound, or conversely, bring an aspect or tag that seems on the periphery of True into the fold legitimately. The price for these actions is that the next Keeper in line has access to the same actions and might be able to retaliate.</w:t>
-      </w:r>
-      <w:r>
-        <w:t xml:space="preserve"> Strain penalty: </w:t>
-      </w:r>
-      <w:r>
-        <w:rPr>
-          <w:b/>
-          <w:bCs/>
-        </w:rPr>
-        <w:t>Overreach.</w:t>
-      </w:r>
-      <w:r>
-        <w:rPr>
-          <w:b/>
-          <w:bCs/>
-        </w:rPr>
-        <w:t xml:space="preserve"> </w:t>
-      </w:r>
-      <w:r>
-        <w:t xml:space="preserve">When a Keeper over plays their hand, they do </w:t>
-      </w:r>
-      <w:r>
-        <w:lastRenderedPageBreak/>
-        <w:t xml:space="preserve">not receive any influence points during the turn that they start with the penalty. </w:t>
+        <w:t xml:space="preserve">When a Keeper over plays their hand, they do not receive any influence points during the turn that they start with the penalty. </w:t>
       </w:r>
       <w:r>
         <w:br/>
@@ -5513,6 +5553,7 @@
         <w:pStyle w:val="Normaali2"/>
       </w:pPr>
       <w:r>
+        <w:lastRenderedPageBreak/>
         <w:t xml:space="preserve">When a demo tape is replicated, all the conveyance scores of the copy take a hit based on its </w:t>
       </w:r>
       <w:r>
@@ -5557,7 +5598,13 @@
         <w:t>Tags</w:t>
       </w:r>
       <w:r>
-        <w:t xml:space="preserve"> are the single most important trait in the whole </w:t>
+        <w:t xml:space="preserve"> are the single most important </w:t>
+      </w:r>
+      <w:r>
+        <w:t>thing</w:t>
+      </w:r>
+      <w:r>
+        <w:t xml:space="preserve"> in the whole </w:t>
       </w:r>
       <w:r>
         <w:t>game because</w:t>
@@ -5572,15 +5619,17 @@
         <w:t xml:space="preserve"> of tags served via aspects.</w:t>
       </w:r>
       <w:r>
-        <w:t xml:space="preserve"> Tags stand in relation with other tags, so a </w:t>
-      </w:r>
-      <w:r>
-        <w:lastRenderedPageBreak/>
-        <w:t>single tag has a so-called anti-tag and a few tags that have associations with the tag. For example, death</w:t>
+        <w:t xml:space="preserve"> Tags stand in relation with other tags, so a single tag has a so-called anti-tag and a few tags that have associations with the tag. For example, death</w:t>
       </w:r>
       <w:r>
         <w:t>’s anti-tag is life, and it has an association with stillness, silence and darkness tags. Life, in turn, has an association with energy, noise and light.</w:t>
       </w:r>
+      <w:r>
+        <w:t xml:space="preserve"> Usually, only the tag and perhaps its anti-tag are in play, but in few instances a tag can be transmuted to or replaced by its associate tag.</w:t>
+      </w:r>
+      <w:r>
+        <w:t xml:space="preserve"> A person cannot hold both a tag and its anti-tag at the beginning of the turn. </w:t>
+      </w:r>
     </w:p>
     <w:p/>
     <w:p>
@@ -5614,6 +5663,49 @@
       </w:pPr>
       <w:r>
         <w:t xml:space="preserve">Every game entity object carries at least one tag (resonance tag) which means that every such object in the game can be interacted with to reach for that tag. Tags can be found from other sources, too, such as in-season tags that are naturally provided by the current turn (autumn tags are morbid, winter tags are cold, for example). Some game events can spawn special tags, which tend to be the more valuable, the more rare or risky their acquirement is. </w:t>
+      </w:r>
+    </w:p>
+    <w:p>
+      <w:pPr>
+        <w:pStyle w:val="Normaali2"/>
+      </w:pPr>
+    </w:p>
+    <w:p>
+      <w:pPr>
+        <w:pStyle w:val="Normaali2"/>
+      </w:pPr>
+      <w:r>
+        <w:rPr>
+          <w:b/>
+          <w:bCs/>
+        </w:rPr>
+        <w:t xml:space="preserve">Resonance tags </w:t>
+      </w:r>
+      <w:r>
+        <w:t xml:space="preserve">in a character’s control can be used limitlessly without exhausting them. </w:t>
+      </w:r>
+      <w:r>
+        <w:rPr>
+          <w:b/>
+          <w:bCs/>
+        </w:rPr>
+        <w:t xml:space="preserve">Mood tags </w:t>
+      </w:r>
+      <w:r>
+        <w:t xml:space="preserve">can only be used once per turn. If tried to access more, the second (or even third) mood tag will be labelled “simulacra” which means it doesn’t carry the actual emotional energy but goes through the motions only. As an idea, it has a diminished value. </w:t>
+      </w:r>
+      <w:r>
+        <w:rPr>
+          <w:b/>
+          <w:bCs/>
+        </w:rPr>
+        <w:t>A conviction tag</w:t>
+      </w:r>
+      <w:r>
+        <w:t xml:space="preserve"> can be </w:t>
+      </w:r>
+      <w:r>
+        <w:t>accessed any number of times per turn, but a third time it is used in the same track counts as proselytizing.</w:t>
       </w:r>
     </w:p>
     <w:p>
@@ -5698,11 +5790,7 @@
         <w:t>do not</w:t>
       </w:r>
       <w:r>
-        <w:t xml:space="preserve"> have to carry it around as a transient). They </w:t>
-      </w:r>
-      <w:r>
-        <w:lastRenderedPageBreak/>
-        <w:t xml:space="preserve">attach the pagan tag into the same idea, so the pagan-organized religion tag pair is hosted safely inside the idea. </w:t>
+        <w:t xml:space="preserve"> have to carry it around as a transient). They attach the pagan tag into the same idea, so the pagan-organized religion tag pair is hosted safely inside the idea. </w:t>
       </w:r>
     </w:p>
     <w:p>
@@ -5750,7 +5838,11 @@
         <w:t>n</w:t>
       </w:r>
       <w:r>
-        <w:t xml:space="preserve"> what is superficially considered “true” in the game. The surface level true is just the prevalent tags already present in the game as influential demo tapes. This simplistic level of true is the primary way in which the players accumulate resources. They make “true sounding” music for the scene by matching the correct tags and aspects to what is expected of them. “Screaming about the devil alongside basic band instruments played in a certain fashion” passes for true to most listeners. Each tag they manage to put to play, gives them a score yield (along with the person who originally put the tag in play). </w:t>
+        <w:t xml:space="preserve"> what is superficially considered “true” in the game. The surface level true is just the prevalent tags already present in the game as influential demo tapes. This simplistic level of true is the primary way in </w:t>
+      </w:r>
+      <w:r>
+        <w:lastRenderedPageBreak/>
+        <w:t xml:space="preserve">which the players accumulate resources. They make “true sounding” music for the scene by matching the correct tags and aspects to what is expected of them. “Screaming about the devil alongside basic band instruments played in a certain fashion” passes for true to most listeners. Each tag they manage to put to play, gives them a score yield (along with the person who originally put the tag in play). </w:t>
       </w:r>
     </w:p>
     <w:p>
@@ -5807,13 +5899,31 @@
       </w:r>
       <w:bookmarkEnd w:id="11"/>
     </w:p>
-    <w:p/>
     <w:p>
       <w:pPr>
         <w:pStyle w:val="Normaali2"/>
       </w:pPr>
-      <w:r>
-        <w:t>Next, Nullsvorn uses another aspect, to create a fry vocals idea that hosts the lyrical idea. Finally, Nullsvorn uses the final idea on a recording, and the lyrics of that track are mechanically considered “true.”</w:t>
+    </w:p>
+    <w:p>
+      <w:pPr>
+        <w:pStyle w:val="Normaali2"/>
+      </w:pPr>
+      <w:r>
+        <w:t xml:space="preserve">The goal of the game is to create demo tapes, which are made of tracks, which are made of ideas, which are made of aspects and tags. The aspects and tags are owned by game objects of the game entity class, such as buildings, environments and people. </w:t>
+      </w:r>
+    </w:p>
+    <w:p>
+      <w:pPr>
+        <w:pStyle w:val="Normaali2"/>
+      </w:pPr>
+      <w:r>
+        <w:t>When a band leader chooses their band collective to go gestate, the whole collective is locked into gestating actions. These actions have to do with extracting tags from game entities. It is easier to interact in this manner with things you “own” such as characters of your band</w:t>
+      </w:r>
+      <w:r>
+        <w:t>, than with objects that stand outside of your immediate perimeter of control. For example, transient tags can be switched between band members freely within one turn, and any band member’s tag can be accessed by any other band member’s gestation action.</w:t>
+      </w:r>
+      <w:r>
+        <w:t xml:space="preserve"> </w:t>
       </w:r>
     </w:p>
     <w:p/>
@@ -6639,6 +6749,119 @@
       </w:pPr>
     </w:lvl>
   </w:abstractNum>
+  <w:abstractNum w:abstractNumId="4" w15:restartNumberingAfterBreak="0">
+    <w:nsid w:val="7F1930B3"/>
+    <w:multiLevelType w:val="hybridMultilevel"/>
+    <w:tmpl w:val="D4740EC0"/>
+    <w:lvl w:ilvl="0" w:tplc="71AEA852">
+      <w:start w:val="4"/>
+      <w:numFmt w:val="bullet"/>
+      <w:lvlText w:val="-"/>
+      <w:lvlJc w:val="left"/>
+      <w:pPr>
+        <w:ind w:left="720" w:hanging="360"/>
+      </w:pPr>
+      <w:rPr>
+        <w:rFonts w:ascii="Arial" w:eastAsia="Arial" w:hAnsi="Arial" w:cs="Arial" w:hint="default"/>
+      </w:rPr>
+    </w:lvl>
+    <w:lvl w:ilvl="1" w:tplc="040B0003" w:tentative="1">
+      <w:start w:val="1"/>
+      <w:numFmt w:val="bullet"/>
+      <w:lvlText w:val="o"/>
+      <w:lvlJc w:val="left"/>
+      <w:pPr>
+        <w:ind w:left="1440" w:hanging="360"/>
+      </w:pPr>
+      <w:rPr>
+        <w:rFonts w:ascii="Courier New" w:hAnsi="Courier New" w:cs="Courier New" w:hint="default"/>
+      </w:rPr>
+    </w:lvl>
+    <w:lvl w:ilvl="2" w:tplc="040B0005" w:tentative="1">
+      <w:start w:val="1"/>
+      <w:numFmt w:val="bullet"/>
+      <w:lvlText w:val=""/>
+      <w:lvlJc w:val="left"/>
+      <w:pPr>
+        <w:ind w:left="2160" w:hanging="360"/>
+      </w:pPr>
+      <w:rPr>
+        <w:rFonts w:ascii="Wingdings" w:hAnsi="Wingdings" w:hint="default"/>
+      </w:rPr>
+    </w:lvl>
+    <w:lvl w:ilvl="3" w:tplc="040B0001" w:tentative="1">
+      <w:start w:val="1"/>
+      <w:numFmt w:val="bullet"/>
+      <w:lvlText w:val=""/>
+      <w:lvlJc w:val="left"/>
+      <w:pPr>
+        <w:ind w:left="2880" w:hanging="360"/>
+      </w:pPr>
+      <w:rPr>
+        <w:rFonts w:ascii="Symbol" w:hAnsi="Symbol" w:hint="default"/>
+      </w:rPr>
+    </w:lvl>
+    <w:lvl w:ilvl="4" w:tplc="040B0003" w:tentative="1">
+      <w:start w:val="1"/>
+      <w:numFmt w:val="bullet"/>
+      <w:lvlText w:val="o"/>
+      <w:lvlJc w:val="left"/>
+      <w:pPr>
+        <w:ind w:left="3600" w:hanging="360"/>
+      </w:pPr>
+      <w:rPr>
+        <w:rFonts w:ascii="Courier New" w:hAnsi="Courier New" w:cs="Courier New" w:hint="default"/>
+      </w:rPr>
+    </w:lvl>
+    <w:lvl w:ilvl="5" w:tplc="040B0005" w:tentative="1">
+      <w:start w:val="1"/>
+      <w:numFmt w:val="bullet"/>
+      <w:lvlText w:val=""/>
+      <w:lvlJc w:val="left"/>
+      <w:pPr>
+        <w:ind w:left="4320" w:hanging="360"/>
+      </w:pPr>
+      <w:rPr>
+        <w:rFonts w:ascii="Wingdings" w:hAnsi="Wingdings" w:hint="default"/>
+      </w:rPr>
+    </w:lvl>
+    <w:lvl w:ilvl="6" w:tplc="040B0001" w:tentative="1">
+      <w:start w:val="1"/>
+      <w:numFmt w:val="bullet"/>
+      <w:lvlText w:val=""/>
+      <w:lvlJc w:val="left"/>
+      <w:pPr>
+        <w:ind w:left="5040" w:hanging="360"/>
+      </w:pPr>
+      <w:rPr>
+        <w:rFonts w:ascii="Symbol" w:hAnsi="Symbol" w:hint="default"/>
+      </w:rPr>
+    </w:lvl>
+    <w:lvl w:ilvl="7" w:tplc="040B0003" w:tentative="1">
+      <w:start w:val="1"/>
+      <w:numFmt w:val="bullet"/>
+      <w:lvlText w:val="o"/>
+      <w:lvlJc w:val="left"/>
+      <w:pPr>
+        <w:ind w:left="5760" w:hanging="360"/>
+      </w:pPr>
+      <w:rPr>
+        <w:rFonts w:ascii="Courier New" w:hAnsi="Courier New" w:cs="Courier New" w:hint="default"/>
+      </w:rPr>
+    </w:lvl>
+    <w:lvl w:ilvl="8" w:tplc="040B0005" w:tentative="1">
+      <w:start w:val="1"/>
+      <w:numFmt w:val="bullet"/>
+      <w:lvlText w:val=""/>
+      <w:lvlJc w:val="left"/>
+      <w:pPr>
+        <w:ind w:left="6480" w:hanging="360"/>
+      </w:pPr>
+      <w:rPr>
+        <w:rFonts w:ascii="Wingdings" w:hAnsi="Wingdings" w:hint="default"/>
+      </w:rPr>
+    </w:lvl>
+  </w:abstractNum>
   <w:num w:numId="1" w16cid:durableId="429663714">
     <w:abstractNumId w:val="2"/>
   </w:num>
@@ -6650,6 +6873,9 @@
   </w:num>
   <w:num w:numId="4" w16cid:durableId="1209803200">
     <w:abstractNumId w:val="0"/>
+  </w:num>
+  <w:num w:numId="5" w16cid:durableId="735394227">
+    <w:abstractNumId w:val="4"/>
   </w:num>
 </w:numbering>
 </file>

</xml_diff>

<commit_message>
Edited uncertain aspects away from the GDD into two new docs
</commit_message>
<xml_diff>
--- a/TheProspector/Assets/Docs/Related School Work/LUT/Game Design Document.docx
+++ b/TheProspector/Assets/Docs/Related School Work/LUT/Game Design Document.docx
@@ -1513,7 +1513,7 @@
           <w:r>
             <w:fldChar w:fldCharType="separate"/>
           </w:r>
-          <w:hyperlink w:anchor="_Toc215658186" w:history="1">
+          <w:hyperlink w:anchor="_Toc215741166" w:history="1">
             <w:r>
               <w:rPr>
                 <w:rStyle w:val="Hyperlinkki"/>
@@ -1540,7 +1540,7 @@
                 <w:noProof/>
                 <w:webHidden/>
               </w:rPr>
-              <w:instrText xml:space="preserve"> PAGEREF _Toc215658186 \h </w:instrText>
+              <w:instrText xml:space="preserve"> PAGEREF _Toc215741166 \h </w:instrText>
             </w:r>
             <w:r>
               <w:rPr>
@@ -1587,7 +1587,7 @@
               <w14:ligatures w14:val="standardContextual"/>
             </w:rPr>
           </w:pPr>
-          <w:hyperlink w:anchor="_Toc215658187" w:history="1">
+          <w:hyperlink w:anchor="_Toc215741167" w:history="1">
             <w:r>
               <w:rPr>
                 <w:rStyle w:val="Hyperlinkki"/>
@@ -1614,7 +1614,7 @@
                 <w:noProof/>
                 <w:webHidden/>
               </w:rPr>
-              <w:instrText xml:space="preserve"> PAGEREF _Toc215658187 \h </w:instrText>
+              <w:instrText xml:space="preserve"> PAGEREF _Toc215741167 \h </w:instrText>
             </w:r>
             <w:r>
               <w:rPr>
@@ -1634,7 +1634,7 @@
                 <w:noProof/>
                 <w:webHidden/>
               </w:rPr>
-              <w:t>7</w:t>
+              <w:t>6</w:t>
             </w:r>
             <w:r>
               <w:rPr>
@@ -1661,7 +1661,7 @@
               <w14:ligatures w14:val="standardContextual"/>
             </w:rPr>
           </w:pPr>
-          <w:hyperlink w:anchor="_Toc215658188" w:history="1">
+          <w:hyperlink w:anchor="_Toc215741168" w:history="1">
             <w:r>
               <w:rPr>
                 <w:rStyle w:val="Hyperlinkki"/>
@@ -1688,7 +1688,7 @@
                 <w:noProof/>
                 <w:webHidden/>
               </w:rPr>
-              <w:instrText xml:space="preserve"> PAGEREF _Toc215658188 \h </w:instrText>
+              <w:instrText xml:space="preserve"> PAGEREF _Toc215741168 \h </w:instrText>
             </w:r>
             <w:r>
               <w:rPr>
@@ -1708,7 +1708,7 @@
                 <w:noProof/>
                 <w:webHidden/>
               </w:rPr>
-              <w:t>8</w:t>
+              <w:t>7</w:t>
             </w:r>
             <w:r>
               <w:rPr>
@@ -1735,7 +1735,7 @@
               <w14:ligatures w14:val="standardContextual"/>
             </w:rPr>
           </w:pPr>
-          <w:hyperlink w:anchor="_Toc215658189" w:history="1">
+          <w:hyperlink w:anchor="_Toc215741169" w:history="1">
             <w:r>
               <w:rPr>
                 <w:rStyle w:val="Hyperlinkki"/>
@@ -1762,7 +1762,7 @@
                 <w:noProof/>
                 <w:webHidden/>
               </w:rPr>
-              <w:instrText xml:space="preserve"> PAGEREF _Toc215658189 \h </w:instrText>
+              <w:instrText xml:space="preserve"> PAGEREF _Toc215741169 \h </w:instrText>
             </w:r>
             <w:r>
               <w:rPr>
@@ -1782,7 +1782,7 @@
                 <w:noProof/>
                 <w:webHidden/>
               </w:rPr>
-              <w:t>10</w:t>
+              <w:t>9</w:t>
             </w:r>
             <w:r>
               <w:rPr>
@@ -1809,7 +1809,7 @@
               <w14:ligatures w14:val="standardContextual"/>
             </w:rPr>
           </w:pPr>
-          <w:hyperlink w:anchor="_Toc215658190" w:history="1">
+          <w:hyperlink w:anchor="_Toc215741170" w:history="1">
             <w:r>
               <w:rPr>
                 <w:rStyle w:val="Hyperlinkki"/>
@@ -1836,7 +1836,7 @@
                 <w:noProof/>
                 <w:webHidden/>
               </w:rPr>
-              <w:instrText xml:space="preserve"> PAGEREF _Toc215658190 \h </w:instrText>
+              <w:instrText xml:space="preserve"> PAGEREF _Toc215741170 \h </w:instrText>
             </w:r>
             <w:r>
               <w:rPr>
@@ -1856,7 +1856,7 @@
                 <w:noProof/>
                 <w:webHidden/>
               </w:rPr>
-              <w:t>10</w:t>
+              <w:t>9</w:t>
             </w:r>
             <w:r>
               <w:rPr>
@@ -1883,7 +1883,7 @@
               <w14:ligatures w14:val="standardContextual"/>
             </w:rPr>
           </w:pPr>
-          <w:hyperlink w:anchor="_Toc215658191" w:history="1">
+          <w:hyperlink w:anchor="_Toc215741171" w:history="1">
             <w:r>
               <w:rPr>
                 <w:rStyle w:val="Hyperlinkki"/>
@@ -1910,7 +1910,7 @@
                 <w:noProof/>
                 <w:webHidden/>
               </w:rPr>
-              <w:instrText xml:space="preserve"> PAGEREF _Toc215658191 \h </w:instrText>
+              <w:instrText xml:space="preserve"> PAGEREF _Toc215741171 \h </w:instrText>
             </w:r>
             <w:r>
               <w:rPr>
@@ -1930,7 +1930,7 @@
                 <w:noProof/>
                 <w:webHidden/>
               </w:rPr>
-              <w:t>11</w:t>
+              <w:t>10</w:t>
             </w:r>
             <w:r>
               <w:rPr>
@@ -1957,7 +1957,7 @@
               <w14:ligatures w14:val="standardContextual"/>
             </w:rPr>
           </w:pPr>
-          <w:hyperlink w:anchor="_Toc215658192" w:history="1">
+          <w:hyperlink w:anchor="_Toc215741172" w:history="1">
             <w:r>
               <w:rPr>
                 <w:rStyle w:val="Hyperlinkki"/>
@@ -1984,7 +1984,7 @@
                 <w:noProof/>
                 <w:webHidden/>
               </w:rPr>
-              <w:instrText xml:space="preserve"> PAGEREF _Toc215658192 \h </w:instrText>
+              <w:instrText xml:space="preserve"> PAGEREF _Toc215741172 \h </w:instrText>
             </w:r>
             <w:r>
               <w:rPr>
@@ -2004,7 +2004,7 @@
                 <w:noProof/>
                 <w:webHidden/>
               </w:rPr>
-              <w:t>14</w:t>
+              <w:t>13</w:t>
             </w:r>
             <w:r>
               <w:rPr>
@@ -2031,7 +2031,7 @@
               <w14:ligatures w14:val="standardContextual"/>
             </w:rPr>
           </w:pPr>
-          <w:hyperlink w:anchor="_Toc215658193" w:history="1">
+          <w:hyperlink w:anchor="_Toc215741173" w:history="1">
             <w:r>
               <w:rPr>
                 <w:rStyle w:val="Hyperlinkki"/>
@@ -2058,7 +2058,7 @@
                 <w:noProof/>
                 <w:webHidden/>
               </w:rPr>
-              <w:instrText xml:space="preserve"> PAGEREF _Toc215658193 \h </w:instrText>
+              <w:instrText xml:space="preserve"> PAGEREF _Toc215741173 \h </w:instrText>
             </w:r>
             <w:r>
               <w:rPr>
@@ -2078,7 +2078,7 @@
                 <w:noProof/>
                 <w:webHidden/>
               </w:rPr>
-              <w:t>15</w:t>
+              <w:t>14</w:t>
             </w:r>
             <w:r>
               <w:rPr>
@@ -2105,7 +2105,7 @@
               <w14:ligatures w14:val="standardContextual"/>
             </w:rPr>
           </w:pPr>
-          <w:hyperlink w:anchor="_Toc215658194" w:history="1">
+          <w:hyperlink w:anchor="_Toc215741174" w:history="1">
             <w:r>
               <w:rPr>
                 <w:rStyle w:val="Hyperlinkki"/>
@@ -2132,7 +2132,7 @@
                 <w:noProof/>
                 <w:webHidden/>
               </w:rPr>
-              <w:instrText xml:space="preserve"> PAGEREF _Toc215658194 \h </w:instrText>
+              <w:instrText xml:space="preserve"> PAGEREF _Toc215741174 \h </w:instrText>
             </w:r>
             <w:r>
               <w:rPr>
@@ -2152,7 +2152,7 @@
                 <w:noProof/>
                 <w:webHidden/>
               </w:rPr>
-              <w:t>16</w:t>
+              <w:t>15</w:t>
             </w:r>
             <w:r>
               <w:rPr>
@@ -2179,7 +2179,7 @@
               <w14:ligatures w14:val="standardContextual"/>
             </w:rPr>
           </w:pPr>
-          <w:hyperlink w:anchor="_Toc215658195" w:history="1">
+          <w:hyperlink w:anchor="_Toc215741175" w:history="1">
             <w:r>
               <w:rPr>
                 <w:rStyle w:val="Hyperlinkki"/>
@@ -2206,7 +2206,7 @@
                 <w:noProof/>
                 <w:webHidden/>
               </w:rPr>
-              <w:instrText xml:space="preserve"> PAGEREF _Toc215658195 \h </w:instrText>
+              <w:instrText xml:space="preserve"> PAGEREF _Toc215741175 \h </w:instrText>
             </w:r>
             <w:r>
               <w:rPr>
@@ -2226,7 +2226,7 @@
                 <w:noProof/>
                 <w:webHidden/>
               </w:rPr>
-              <w:t>17</w:t>
+              <w:t>16</w:t>
             </w:r>
             <w:r>
               <w:rPr>
@@ -2253,7 +2253,7 @@
               <w14:ligatures w14:val="standardContextual"/>
             </w:rPr>
           </w:pPr>
-          <w:hyperlink w:anchor="_Toc215658196" w:history="1">
+          <w:hyperlink w:anchor="_Toc215741176" w:history="1">
             <w:r>
               <w:rPr>
                 <w:rStyle w:val="Hyperlinkki"/>
@@ -2280,7 +2280,7 @@
                 <w:noProof/>
                 <w:webHidden/>
               </w:rPr>
-              <w:instrText xml:space="preserve"> PAGEREF _Toc215658196 \h </w:instrText>
+              <w:instrText xml:space="preserve"> PAGEREF _Toc215741176 \h </w:instrText>
             </w:r>
             <w:r>
               <w:rPr>
@@ -2300,7 +2300,7 @@
                 <w:noProof/>
                 <w:webHidden/>
               </w:rPr>
-              <w:t>18</w:t>
+              <w:t>17</w:t>
             </w:r>
             <w:r>
               <w:rPr>
@@ -2327,7 +2327,7 @@
               <w14:ligatures w14:val="standardContextual"/>
             </w:rPr>
           </w:pPr>
-          <w:hyperlink w:anchor="_Toc215658197" w:history="1">
+          <w:hyperlink w:anchor="_Toc215741177" w:history="1">
             <w:r>
               <w:rPr>
                 <w:rStyle w:val="Hyperlinkki"/>
@@ -2354,7 +2354,7 @@
                 <w:noProof/>
                 <w:webHidden/>
               </w:rPr>
-              <w:instrText xml:space="preserve"> PAGEREF _Toc215658197 \h </w:instrText>
+              <w:instrText xml:space="preserve"> PAGEREF _Toc215741177 \h </w:instrText>
             </w:r>
             <w:r>
               <w:rPr>
@@ -2374,7 +2374,7 @@
                 <w:noProof/>
                 <w:webHidden/>
               </w:rPr>
-              <w:t>18</w:t>
+              <w:t>17</w:t>
             </w:r>
             <w:r>
               <w:rPr>
@@ -2401,7 +2401,7 @@
               <w14:ligatures w14:val="standardContextual"/>
             </w:rPr>
           </w:pPr>
-          <w:hyperlink w:anchor="_Toc215658198" w:history="1">
+          <w:hyperlink w:anchor="_Toc215741178" w:history="1">
             <w:r>
               <w:rPr>
                 <w:rStyle w:val="Hyperlinkki"/>
@@ -2428,7 +2428,7 @@
                 <w:noProof/>
                 <w:webHidden/>
               </w:rPr>
-              <w:instrText xml:space="preserve"> PAGEREF _Toc215658198 \h </w:instrText>
+              <w:instrText xml:space="preserve"> PAGEREF _Toc215741178 \h </w:instrText>
             </w:r>
             <w:r>
               <w:rPr>
@@ -2448,7 +2448,7 @@
                 <w:noProof/>
                 <w:webHidden/>
               </w:rPr>
-              <w:t>18</w:t>
+              <w:t>17</w:t>
             </w:r>
             <w:r>
               <w:rPr>
@@ -2475,7 +2475,7 @@
               <w14:ligatures w14:val="standardContextual"/>
             </w:rPr>
           </w:pPr>
-          <w:hyperlink w:anchor="_Toc215658199" w:history="1">
+          <w:hyperlink w:anchor="_Toc215741179" w:history="1">
             <w:r>
               <w:rPr>
                 <w:rStyle w:val="Hyperlinkki"/>
@@ -2502,7 +2502,7 @@
                 <w:noProof/>
                 <w:webHidden/>
               </w:rPr>
-              <w:instrText xml:space="preserve"> PAGEREF _Toc215658199 \h </w:instrText>
+              <w:instrText xml:space="preserve"> PAGEREF _Toc215741179 \h </w:instrText>
             </w:r>
             <w:r>
               <w:rPr>
@@ -2522,7 +2522,7 @@
                 <w:noProof/>
                 <w:webHidden/>
               </w:rPr>
-              <w:t>19</w:t>
+              <w:t>18</w:t>
             </w:r>
             <w:r>
               <w:rPr>
@@ -2549,7 +2549,7 @@
               <w14:ligatures w14:val="standardContextual"/>
             </w:rPr>
           </w:pPr>
-          <w:hyperlink w:anchor="_Toc215658200" w:history="1">
+          <w:hyperlink w:anchor="_Toc215741180" w:history="1">
             <w:r>
               <w:rPr>
                 <w:rStyle w:val="Hyperlinkki"/>
@@ -2576,7 +2576,7 @@
                 <w:noProof/>
                 <w:webHidden/>
               </w:rPr>
-              <w:instrText xml:space="preserve"> PAGEREF _Toc215658200 \h </w:instrText>
+              <w:instrText xml:space="preserve"> PAGEREF _Toc215741180 \h </w:instrText>
             </w:r>
             <w:r>
               <w:rPr>
@@ -2596,7 +2596,7 @@
                 <w:noProof/>
                 <w:webHidden/>
               </w:rPr>
-              <w:t>20</w:t>
+              <w:t>19</w:t>
             </w:r>
             <w:r>
               <w:rPr>
@@ -2623,7 +2623,7 @@
               <w14:ligatures w14:val="standardContextual"/>
             </w:rPr>
           </w:pPr>
-          <w:hyperlink w:anchor="_Toc215658201" w:history="1">
+          <w:hyperlink w:anchor="_Toc215741181" w:history="1">
             <w:r>
               <w:rPr>
                 <w:rStyle w:val="Hyperlinkki"/>
@@ -2650,7 +2650,7 @@
                 <w:noProof/>
                 <w:webHidden/>
               </w:rPr>
-              <w:instrText xml:space="preserve"> PAGEREF _Toc215658201 \h </w:instrText>
+              <w:instrText xml:space="preserve"> PAGEREF _Toc215741181 \h </w:instrText>
             </w:r>
             <w:r>
               <w:rPr>
@@ -2670,7 +2670,7 @@
                 <w:noProof/>
                 <w:webHidden/>
               </w:rPr>
-              <w:t>21</w:t>
+              <w:t>20</w:t>
             </w:r>
             <w:r>
               <w:rPr>
@@ -2697,7 +2697,7 @@
               <w14:ligatures w14:val="standardContextual"/>
             </w:rPr>
           </w:pPr>
-          <w:hyperlink w:anchor="_Toc215658202" w:history="1">
+          <w:hyperlink w:anchor="_Toc215741182" w:history="1">
             <w:r>
               <w:rPr>
                 <w:rStyle w:val="Hyperlinkki"/>
@@ -2724,7 +2724,7 @@
                 <w:noProof/>
                 <w:webHidden/>
               </w:rPr>
-              <w:instrText xml:space="preserve"> PAGEREF _Toc215658202 \h </w:instrText>
+              <w:instrText xml:space="preserve"> PAGEREF _Toc215741182 \h </w:instrText>
             </w:r>
             <w:r>
               <w:rPr>
@@ -2744,7 +2744,7 @@
                 <w:noProof/>
                 <w:webHidden/>
               </w:rPr>
-              <w:t>21</w:t>
+              <w:t>20</w:t>
             </w:r>
             <w:r>
               <w:rPr>
@@ -2771,7 +2771,7 @@
               <w14:ligatures w14:val="standardContextual"/>
             </w:rPr>
           </w:pPr>
-          <w:hyperlink w:anchor="_Toc215658203" w:history="1">
+          <w:hyperlink w:anchor="_Toc215741183" w:history="1">
             <w:r>
               <w:rPr>
                 <w:rStyle w:val="Hyperlinkki"/>
@@ -2798,7 +2798,7 @@
                 <w:noProof/>
                 <w:webHidden/>
               </w:rPr>
-              <w:instrText xml:space="preserve"> PAGEREF _Toc215658203 \h </w:instrText>
+              <w:instrText xml:space="preserve"> PAGEREF _Toc215741183 \h </w:instrText>
             </w:r>
             <w:r>
               <w:rPr>
@@ -2818,7 +2818,7 @@
                 <w:noProof/>
                 <w:webHidden/>
               </w:rPr>
-              <w:t>21</w:t>
+              <w:t>20</w:t>
             </w:r>
             <w:r>
               <w:rPr>
@@ -2845,7 +2845,7 @@
               <w14:ligatures w14:val="standardContextual"/>
             </w:rPr>
           </w:pPr>
-          <w:hyperlink w:anchor="_Toc215658204" w:history="1">
+          <w:hyperlink w:anchor="_Toc215741184" w:history="1">
             <w:r>
               <w:rPr>
                 <w:rStyle w:val="Hyperlinkki"/>
@@ -2872,7 +2872,7 @@
                 <w:noProof/>
                 <w:webHidden/>
               </w:rPr>
-              <w:instrText xml:space="preserve"> PAGEREF _Toc215658204 \h </w:instrText>
+              <w:instrText xml:space="preserve"> PAGEREF _Toc215741184 \h </w:instrText>
             </w:r>
             <w:r>
               <w:rPr>
@@ -2892,7 +2892,7 @@
                 <w:noProof/>
                 <w:webHidden/>
               </w:rPr>
-              <w:t>21</w:t>
+              <w:t>20</w:t>
             </w:r>
             <w:r>
               <w:rPr>
@@ -2919,7 +2919,7 @@
               <w14:ligatures w14:val="standardContextual"/>
             </w:rPr>
           </w:pPr>
-          <w:hyperlink w:anchor="_Toc215658205" w:history="1">
+          <w:hyperlink w:anchor="_Toc215741185" w:history="1">
             <w:r>
               <w:rPr>
                 <w:rStyle w:val="Hyperlinkki"/>
@@ -2946,7 +2946,7 @@
                 <w:noProof/>
                 <w:webHidden/>
               </w:rPr>
-              <w:instrText xml:space="preserve"> PAGEREF _Toc215658205 \h </w:instrText>
+              <w:instrText xml:space="preserve"> PAGEREF _Toc215741185 \h </w:instrText>
             </w:r>
             <w:r>
               <w:rPr>
@@ -2966,7 +2966,7 @@
                 <w:noProof/>
                 <w:webHidden/>
               </w:rPr>
-              <w:t>22</w:t>
+              <w:t>21</w:t>
             </w:r>
             <w:r>
               <w:rPr>
@@ -2993,7 +2993,7 @@
               <w14:ligatures w14:val="standardContextual"/>
             </w:rPr>
           </w:pPr>
-          <w:hyperlink w:anchor="_Toc215658206" w:history="1">
+          <w:hyperlink w:anchor="_Toc215741186" w:history="1">
             <w:r>
               <w:rPr>
                 <w:rStyle w:val="Hyperlinkki"/>
@@ -3020,7 +3020,7 @@
                 <w:noProof/>
                 <w:webHidden/>
               </w:rPr>
-              <w:instrText xml:space="preserve"> PAGEREF _Toc215658206 \h </w:instrText>
+              <w:instrText xml:space="preserve"> PAGEREF _Toc215741186 \h </w:instrText>
             </w:r>
             <w:r>
               <w:rPr>
@@ -3040,7 +3040,7 @@
                 <w:noProof/>
                 <w:webHidden/>
               </w:rPr>
-              <w:t>22</w:t>
+              <w:t>21</w:t>
             </w:r>
             <w:r>
               <w:rPr>
@@ -3067,7 +3067,7 @@
               <w14:ligatures w14:val="standardContextual"/>
             </w:rPr>
           </w:pPr>
-          <w:hyperlink w:anchor="_Toc215658207" w:history="1">
+          <w:hyperlink w:anchor="_Toc215741187" w:history="1">
             <w:r>
               <w:rPr>
                 <w:rStyle w:val="Hyperlinkki"/>
@@ -3094,7 +3094,7 @@
                 <w:noProof/>
                 <w:webHidden/>
               </w:rPr>
-              <w:instrText xml:space="preserve"> PAGEREF _Toc215658207 \h </w:instrText>
+              <w:instrText xml:space="preserve"> PAGEREF _Toc215741187 \h </w:instrText>
             </w:r>
             <w:r>
               <w:rPr>
@@ -3114,7 +3114,7 @@
                 <w:noProof/>
                 <w:webHidden/>
               </w:rPr>
-              <w:t>22</w:t>
+              <w:t>21</w:t>
             </w:r>
             <w:r>
               <w:rPr>
@@ -3141,7 +3141,7 @@
               <w14:ligatures w14:val="standardContextual"/>
             </w:rPr>
           </w:pPr>
-          <w:hyperlink w:anchor="_Toc215658208" w:history="1">
+          <w:hyperlink w:anchor="_Toc215741188" w:history="1">
             <w:r>
               <w:rPr>
                 <w:rStyle w:val="Hyperlinkki"/>
@@ -3168,7 +3168,7 @@
                 <w:noProof/>
                 <w:webHidden/>
               </w:rPr>
-              <w:instrText xml:space="preserve"> PAGEREF _Toc215658208 \h </w:instrText>
+              <w:instrText xml:space="preserve"> PAGEREF _Toc215741188 \h </w:instrText>
             </w:r>
             <w:r>
               <w:rPr>
@@ -3188,7 +3188,7 @@
                 <w:noProof/>
                 <w:webHidden/>
               </w:rPr>
-              <w:t>22</w:t>
+              <w:t>21</w:t>
             </w:r>
             <w:r>
               <w:rPr>
@@ -3215,7 +3215,7 @@
               <w14:ligatures w14:val="standardContextual"/>
             </w:rPr>
           </w:pPr>
-          <w:hyperlink w:anchor="_Toc215658209" w:history="1">
+          <w:hyperlink w:anchor="_Toc215741189" w:history="1">
             <w:r>
               <w:rPr>
                 <w:rStyle w:val="Hyperlinkki"/>
@@ -3242,7 +3242,7 @@
                 <w:noProof/>
                 <w:webHidden/>
               </w:rPr>
-              <w:instrText xml:space="preserve"> PAGEREF _Toc215658209 \h </w:instrText>
+              <w:instrText xml:space="preserve"> PAGEREF _Toc215741189 \h </w:instrText>
             </w:r>
             <w:r>
               <w:rPr>
@@ -3262,7 +3262,7 @@
                 <w:noProof/>
                 <w:webHidden/>
               </w:rPr>
-              <w:t>23</w:t>
+              <w:t>22</w:t>
             </w:r>
             <w:r>
               <w:rPr>
@@ -3289,7 +3289,7 @@
               <w14:ligatures w14:val="standardContextual"/>
             </w:rPr>
           </w:pPr>
-          <w:hyperlink w:anchor="_Toc215658210" w:history="1">
+          <w:hyperlink w:anchor="_Toc215741190" w:history="1">
             <w:r>
               <w:rPr>
                 <w:rStyle w:val="Hyperlinkki"/>
@@ -3316,7 +3316,7 @@
                 <w:noProof/>
                 <w:webHidden/>
               </w:rPr>
-              <w:instrText xml:space="preserve"> PAGEREF _Toc215658210 \h </w:instrText>
+              <w:instrText xml:space="preserve"> PAGEREF _Toc215741190 \h </w:instrText>
             </w:r>
             <w:r>
               <w:rPr>
@@ -3336,7 +3336,7 @@
                 <w:noProof/>
                 <w:webHidden/>
               </w:rPr>
-              <w:t>23</w:t>
+              <w:t>22</w:t>
             </w:r>
             <w:r>
               <w:rPr>
@@ -3363,7 +3363,7 @@
               <w14:ligatures w14:val="standardContextual"/>
             </w:rPr>
           </w:pPr>
-          <w:hyperlink w:anchor="_Toc215658211" w:history="1">
+          <w:hyperlink w:anchor="_Toc215741191" w:history="1">
             <w:r>
               <w:rPr>
                 <w:rStyle w:val="Hyperlinkki"/>
@@ -3390,7 +3390,7 @@
                 <w:noProof/>
                 <w:webHidden/>
               </w:rPr>
-              <w:instrText xml:space="preserve"> PAGEREF _Toc215658211 \h </w:instrText>
+              <w:instrText xml:space="preserve"> PAGEREF _Toc215741191 \h </w:instrText>
             </w:r>
             <w:r>
               <w:rPr>
@@ -3410,7 +3410,7 @@
                 <w:noProof/>
                 <w:webHidden/>
               </w:rPr>
-              <w:t>23</w:t>
+              <w:t>22</w:t>
             </w:r>
             <w:r>
               <w:rPr>
@@ -3437,7 +3437,7 @@
               <w14:ligatures w14:val="standardContextual"/>
             </w:rPr>
           </w:pPr>
-          <w:hyperlink w:anchor="_Toc215658212" w:history="1">
+          <w:hyperlink w:anchor="_Toc215741192" w:history="1">
             <w:r>
               <w:rPr>
                 <w:rStyle w:val="Hyperlinkki"/>
@@ -3464,7 +3464,7 @@
                 <w:noProof/>
                 <w:webHidden/>
               </w:rPr>
-              <w:instrText xml:space="preserve"> PAGEREF _Toc215658212 \h </w:instrText>
+              <w:instrText xml:space="preserve"> PAGEREF _Toc215741192 \h </w:instrText>
             </w:r>
             <w:r>
               <w:rPr>
@@ -3484,7 +3484,7 @@
                 <w:noProof/>
                 <w:webHidden/>
               </w:rPr>
-              <w:t>24</w:t>
+              <w:t>23</w:t>
             </w:r>
             <w:r>
               <w:rPr>
@@ -3511,7 +3511,7 @@
               <w14:ligatures w14:val="standardContextual"/>
             </w:rPr>
           </w:pPr>
-          <w:hyperlink w:anchor="_Toc215658213" w:history="1">
+          <w:hyperlink w:anchor="_Toc215741193" w:history="1">
             <w:r>
               <w:rPr>
                 <w:rStyle w:val="Hyperlinkki"/>
@@ -3538,7 +3538,7 @@
                 <w:noProof/>
                 <w:webHidden/>
               </w:rPr>
-              <w:instrText xml:space="preserve"> PAGEREF _Toc215658213 \h </w:instrText>
+              <w:instrText xml:space="preserve"> PAGEREF _Toc215741193 \h </w:instrText>
             </w:r>
             <w:r>
               <w:rPr>
@@ -3558,7 +3558,7 @@
                 <w:noProof/>
                 <w:webHidden/>
               </w:rPr>
-              <w:t>25</w:t>
+              <w:t>24</w:t>
             </w:r>
             <w:r>
               <w:rPr>
@@ -3598,7 +3598,7 @@
         <w:pStyle w:val="Otsikko2"/>
         <w:spacing w:before="0" w:line="240" w:lineRule="auto"/>
       </w:pPr>
-      <w:bookmarkStart w:id="0" w:name="_Toc215658186"/>
+      <w:bookmarkStart w:id="0" w:name="_Toc215741166"/>
       <w:r>
         <w:lastRenderedPageBreak/>
         <w:t>1. Executive Summary, Quick overview</w:t>
@@ -3614,6 +3614,9 @@
         <w:spacing w:line="360" w:lineRule="auto"/>
         <w:jc w:val="both"/>
         <w:rPr>
+          <w:i/>
+          <w:iCs/>
+          <w:color w:val="EE0000"/>
           <w:sz w:val="24"/>
           <w:szCs w:val="24"/>
         </w:rPr>
@@ -3730,14 +3733,14 @@
           <w:sz w:val="24"/>
           <w:szCs w:val="24"/>
         </w:rPr>
-        <w:t xml:space="preserve"> an art project that seeks to embrace both the DIY-spirit of the scene it simulates, and the anti-establishment attitude prevalent in it. It hopes to survive and improve through the struggle itself and to reach its target audience (or users) by “actively” not looking for them.</w:t>
+        <w:t xml:space="preserve"> an art project that seeks to embrace both the DIY-spirit of the scene it simulates, and the anti-establishment attitude prevalent in it</w:t>
       </w:r>
       <w:r>
         <w:rPr>
           <w:sz w:val="24"/>
           <w:szCs w:val="24"/>
         </w:rPr>
-        <w:t xml:space="preserve"> Perhaps it also chooses to be art when facing the otherwise paralyzing gaze of academic peer review.</w:t>
+        <w:t>.</w:t>
       </w:r>
     </w:p>
     <w:p>
@@ -3908,15 +3911,7 @@
           <w:sz w:val="24"/>
           <w:szCs w:val="24"/>
         </w:rPr>
-        <w:t xml:space="preserve">The project acts as a prototype for Scandinavian Extreme Metal Manager ’91 (SEMM91), a future expansion (or the actual version 1.0), where the player manages </w:t>
-      </w:r>
-      <w:r>
-        <w:rPr>
-          <w:sz w:val="24"/>
-          <w:szCs w:val="24"/>
-        </w:rPr>
-        <w:lastRenderedPageBreak/>
-        <w:t xml:space="preserve">their band in a </w:t>
+        <w:t xml:space="preserve">The project acts as a prototype for Scandinavian Extreme Metal Manager ’91 (SEMM91), a future expansion (or the actual version 1.0), where the player manages their band in a </w:t>
       </w:r>
       <w:r>
         <w:rPr>
@@ -3961,114 +3956,10 @@
     </w:p>
     <w:p>
       <w:pPr>
-        <w:spacing w:line="360" w:lineRule="auto"/>
-        <w:jc w:val="both"/>
-        <w:rPr>
-          <w:sz w:val="24"/>
-          <w:szCs w:val="24"/>
-        </w:rPr>
-      </w:pPr>
-    </w:p>
-    <w:p>
-      <w:pPr>
-        <w:spacing w:line="360" w:lineRule="auto"/>
-        <w:jc w:val="both"/>
-        <w:rPr>
-          <w:sz w:val="24"/>
-          <w:szCs w:val="24"/>
-        </w:rPr>
-      </w:pPr>
-      <w:r>
-        <w:rPr>
-          <w:sz w:val="24"/>
-          <w:szCs w:val="24"/>
-        </w:rPr>
-        <w:t>One of the first concepts that the creator mused with over this project was the idea of something that is seen as fundamental slowly shifting into something completely different. Questions like “Can a band release an album as a pack of cigarettes?” or “What if music itself was considered anathema to the scene, how would it sound or look then?” were floating around a lot.</w:t>
-      </w:r>
-      <w:r>
-        <w:rPr>
-          <w:sz w:val="24"/>
-          <w:szCs w:val="24"/>
-        </w:rPr>
-        <w:t xml:space="preserve"> The actual drifting of certain band’s sounds and ideals have inspired these </w:t>
-      </w:r>
-      <w:r>
-        <w:rPr>
-          <w:sz w:val="24"/>
-          <w:szCs w:val="24"/>
-        </w:rPr>
-        <w:t>ideas;</w:t>
-      </w:r>
-      <w:r>
-        <w:rPr>
-          <w:sz w:val="24"/>
-          <w:szCs w:val="24"/>
-        </w:rPr>
-        <w:t xml:space="preserve"> all be it the approach in this game is exaggerated on purpose. Perhaps the easiest example would have been Ulver’s three early records that served as a benchmark for the Norwegian Black Metal sound, only for the band </w:t>
-      </w:r>
-      <w:r>
-        <w:rPr>
-          <w:sz w:val="24"/>
-          <w:szCs w:val="24"/>
-        </w:rPr>
-        <w:t xml:space="preserve">to </w:t>
-      </w:r>
-      <w:r>
-        <w:rPr>
-          <w:sz w:val="24"/>
-          <w:szCs w:val="24"/>
-        </w:rPr>
-        <w:t xml:space="preserve">quickly pivot into something </w:t>
-      </w:r>
-      <w:r>
-        <w:rPr>
-          <w:sz w:val="24"/>
-          <w:szCs w:val="24"/>
-        </w:rPr>
-        <w:t xml:space="preserve">experimental and </w:t>
-      </w:r>
-      <w:r>
-        <w:rPr>
-          <w:sz w:val="24"/>
-          <w:szCs w:val="24"/>
-        </w:rPr>
-        <w:t>entirely different</w:t>
-      </w:r>
-      <w:r>
-        <w:rPr>
-          <w:sz w:val="24"/>
-          <w:szCs w:val="24"/>
-        </w:rPr>
-        <w:t>, a sound</w:t>
-      </w:r>
-      <w:r>
-        <w:rPr>
-          <w:sz w:val="24"/>
-          <w:szCs w:val="24"/>
-        </w:rPr>
-        <w:t xml:space="preserve"> not considered canon in the scene. </w:t>
-      </w:r>
-      <w:r>
-        <w:rPr>
-          <w:sz w:val="24"/>
-          <w:szCs w:val="24"/>
-        </w:rPr>
-        <w:t>Many other bands from that scene had a similar career, but listing those bands here would be beside the point.</w:t>
-      </w:r>
-      <w:r>
-        <w:rPr>
-          <w:sz w:val="24"/>
-          <w:szCs w:val="24"/>
-        </w:rPr>
-        <w:br w:type="page"/>
-      </w:r>
-    </w:p>
-    <w:p>
-      <w:pPr>
         <w:pStyle w:val="Otsikko2"/>
         <w:spacing w:before="0" w:line="240" w:lineRule="auto"/>
       </w:pPr>
-      <w:bookmarkStart w:id="2" w:name="_Toc215658187"/>
+      <w:bookmarkStart w:id="2" w:name="_Toc215741167"/>
       <w:r>
         <w:lastRenderedPageBreak/>
         <w:t>2. Target Audience</w:t>
@@ -4142,44 +4033,10 @@
     </w:p>
     <w:p>
       <w:pPr>
-        <w:pStyle w:val="Normaali2"/>
-      </w:pPr>
-      <w:r>
-        <w:t xml:space="preserve">If Demo(n)Tapes reaches enough notoriety, it could and should be imported to an android game, because for what it’s worth, most of the game play is made of dragging small boxes into larger boxes and then pressing a button. The other half of gameplay, as the Keeper, however, requires engaging with other players socially via audio which does not translate well into a casual smart device game. Hence, the hypothetical smart device app should forsake the Keeper and the emigrating host-gameplay </w:t>
-      </w:r>
-      <w:r>
-        <w:t>entirely and</w:t>
-      </w:r>
-      <w:r>
-        <w:t xml:space="preserve"> draw inspiration from the </w:t>
-      </w:r>
-      <w:r>
-        <w:t>device’s</w:t>
-      </w:r>
-      <w:r>
-        <w:t xml:space="preserve"> portability somehow.</w:t>
-      </w:r>
-      <w:r>
-        <w:t xml:space="preserve"> Perhaps exchanging tapes between players in proximity could be a thing, as would collectibles and trophies visualized as a virtual “battle vest”.</w:t>
-      </w:r>
-    </w:p>
-    <w:p>
-      <w:pPr>
-        <w:rPr>
-          <w:sz w:val="32"/>
-          <w:szCs w:val="32"/>
-        </w:rPr>
-      </w:pPr>
-      <w:r>
-        <w:br w:type="page"/>
-      </w:r>
-    </w:p>
-    <w:p>
-      <w:pPr>
         <w:pStyle w:val="Otsikko2"/>
         <w:spacing w:before="0" w:line="240" w:lineRule="auto"/>
       </w:pPr>
-      <w:bookmarkStart w:id="3" w:name="_Toc215658188"/>
+      <w:bookmarkStart w:id="3" w:name="_Toc215741168"/>
       <w:r>
         <w:lastRenderedPageBreak/>
         <w:t>3. Main Characters</w:t>
@@ -4317,6 +4174,11 @@
     <w:p>
       <w:pPr>
         <w:pStyle w:val="Normaali2"/>
+        <w:rPr>
+          <w:i/>
+          <w:iCs/>
+          <w:color w:val="EE0000"/>
+        </w:rPr>
       </w:pPr>
       <w:r>
         <w:t>The Player’s alter-ego is a nameless and ambivalently gendered front-person of the</w:t>
@@ -4354,20 +4216,28 @@
         <w:t xml:space="preserve"> The “.SNO” hyphen is determined from a drop-down menu, by the country of origin. Many or all these options might be locked down to their defaults, depending on where the project’s development is currently at, and the same goes for the character’s outlook, which would ideally be alterable.</w:t>
       </w:r>
       <w:r>
-        <w:t xml:space="preserve"> The band’s logo is by default as depicted below. At later stages, the program could accept</w:t>
-      </w:r>
-      <w:r>
-        <w:t xml:space="preserve"> small bitmaps</w:t>
-      </w:r>
-      <w:r>
-        <w:t xml:space="preserve"> or even host a simple tool for drawing </w:t>
-      </w:r>
-      <w:r>
-        <w:t>logos for the bands in game.</w:t>
-      </w:r>
-      <w:r>
-        <w:t xml:space="preserve"> And as for the country of origin, if the project takes off properly into the online multiplayer world, the drop-down menu could be replaced by information based on the user’s actual location.</w:t>
-      </w:r>
+        <w:t xml:space="preserve"> The band’s logo is by default as depicted below. </w:t>
+      </w:r>
+    </w:p>
+    <w:p>
+      <w:pPr>
+        <w:pStyle w:val="Normaali2"/>
+        <w:rPr>
+          <w:i/>
+          <w:iCs/>
+          <w:color w:val="EE0000"/>
+        </w:rPr>
+      </w:pPr>
+    </w:p>
+    <w:p>
+      <w:pPr>
+        <w:pStyle w:val="Normaali2"/>
+        <w:rPr>
+          <w:i/>
+          <w:iCs/>
+          <w:color w:val="EE0000"/>
+        </w:rPr>
+      </w:pPr>
     </w:p>
     <w:p>
       <w:pPr>
@@ -4484,372 +4354,362 @@
     <w:p>
       <w:pPr>
         <w:pStyle w:val="Normaali2"/>
-      </w:pPr>
-      <w:r>
-        <w:t xml:space="preserve">The reversed cross in the logo is a nod to other bands and their aesthetics, but </w:t>
-      </w:r>
-      <w:r>
-        <w:t>all</w:t>
-      </w:r>
-      <w:r>
-        <w:t xml:space="preserve"> the band members agree</w:t>
-      </w:r>
-      <w:r>
-        <w:t xml:space="preserve"> on one thing:</w:t>
-      </w:r>
-      <w:r>
-        <w:t xml:space="preserve"> </w:t>
-      </w:r>
-      <w:r>
         <w:rPr>
           <w:i/>
           <w:iCs/>
-        </w:rPr>
-        <w:t>for</w:t>
+          <w:color w:val="EE0000"/>
+        </w:rPr>
+      </w:pPr>
+      <w:r>
+        <w:t xml:space="preserve">The reversed cross in the logo is a nod to other bands and their aesthetics, but </w:t>
+      </w:r>
+      <w:r>
+        <w:t>all</w:t>
+      </w:r>
+      <w:r>
+        <w:t xml:space="preserve"> the band members agree</w:t>
+      </w:r>
+      <w:r>
+        <w:t xml:space="preserve"> on one thing:</w:t>
+      </w:r>
+      <w:r>
+        <w:t xml:space="preserve"> </w:t>
       </w:r>
       <w:r>
         <w:rPr>
           <w:i/>
           <w:iCs/>
         </w:rPr>
-        <w:t xml:space="preserve"> metal to stand for something, </w:t>
+        <w:t>for</w:t>
       </w:r>
       <w:r>
         <w:rPr>
           <w:i/>
           <w:iCs/>
         </w:rPr>
-        <w:t>one</w:t>
+        <w:t xml:space="preserve"> metal to stand for something, </w:t>
       </w:r>
       <w:r>
         <w:rPr>
           <w:i/>
           <w:iCs/>
         </w:rPr>
-        <w:t xml:space="preserve"> really </w:t>
+        <w:t>one</w:t>
       </w:r>
       <w:r>
         <w:rPr>
           <w:i/>
           <w:iCs/>
         </w:rPr>
-        <w:t>must</w:t>
+        <w:t xml:space="preserve"> really </w:t>
       </w:r>
       <w:r>
         <w:rPr>
           <w:i/>
           <w:iCs/>
         </w:rPr>
-        <w:t xml:space="preserve"> do an </w:t>
-      </w:r>
-      <w:r>
-        <w:rPr>
-          <w:b/>
-          <w:bCs/>
+        <w:t>must</w:t>
+      </w:r>
+      <w:r>
+        <w:rPr>
           <w:i/>
           <w:iCs/>
         </w:rPr>
-        <w:t>inversion</w:t>
-      </w:r>
-      <w:r>
-        <w:rPr>
+        <w:t xml:space="preserve"> do an </w:t>
+      </w:r>
+      <w:r>
+        <w:rPr>
+          <w:b/>
+          <w:bCs/>
           <w:i/>
           <w:iCs/>
         </w:rPr>
-        <w:t xml:space="preserve"> of some sort</w:t>
-      </w:r>
-      <w:r>
-        <w:t>.</w:t>
-      </w:r>
-      <w:r>
-        <w:t xml:space="preserve"> Like go against established religion or state or something. </w:t>
-      </w:r>
-      <w:r>
-        <w:t xml:space="preserve">Also, music should be </w:t>
-      </w:r>
-      <w:r>
-        <w:t>True</w:t>
-      </w:r>
-      <w:r>
-        <w:t xml:space="preserve">. Whatever that means. </w:t>
-      </w:r>
-      <w:r>
-        <w:t xml:space="preserve">Who knows? These </w:t>
-      </w:r>
-      <w:r>
-        <w:lastRenderedPageBreak/>
-        <w:t>guys have just been</w:t>
-      </w:r>
-      <w:r>
-        <w:t xml:space="preserve"> drinking</w:t>
-      </w:r>
-      <w:r>
-        <w:t xml:space="preserve"> beer</w:t>
-      </w:r>
-      <w:r>
-        <w:t xml:space="preserve"> </w:t>
-      </w:r>
-      <w:r>
-        <w:t>and playing</w:t>
-      </w:r>
-      <w:r>
-        <w:t xml:space="preserve"> trash metal covers for the past five years, and none of them are philosophy majors.</w:t>
-      </w:r>
-    </w:p>
-    <w:p>
-      <w:pPr>
-        <w:pStyle w:val="Normaali2"/>
-      </w:pPr>
-    </w:p>
-    <w:p>
-      <w:pPr>
-        <w:pStyle w:val="Normaali2"/>
-      </w:pPr>
-      <w:r>
-        <w:rPr>
-          <w:b/>
-          <w:bCs/>
-        </w:rPr>
-        <w:t>Nullsvorn</w:t>
-      </w:r>
-      <w:r>
-        <w:t xml:space="preserve"> as the band leader </w:t>
-      </w:r>
-      <w:r>
-        <w:t>(a controller</w:t>
-      </w:r>
-      <w:r>
-        <w:t>; see chapter 4</w:t>
-      </w:r>
-      <w:r>
-        <w:t xml:space="preserve">) </w:t>
-      </w:r>
-      <w:r>
-        <w:t>has their hands full with executive decisions such as how much of an effort the band in general puts to gestating (</w:t>
-      </w:r>
-      <w:r>
-        <w:t>producing</w:t>
-      </w:r>
-      <w:r>
-        <w:t xml:space="preserve"> material</w:t>
-      </w:r>
-      <w:r>
-        <w:t>; chapter 4</w:t>
-      </w:r>
-      <w:r>
-        <w:t xml:space="preserve">), rehearsals or leisure time. Besides this, Nullsvorn is also the lyricist and the vocalist of the band, so they contribute the voice into the end goal of the band, which is </w:t>
-      </w:r>
-      <w:r>
-        <w:t xml:space="preserve">always </w:t>
-      </w:r>
-      <w:r>
-        <w:t xml:space="preserve">the next demo tape. There are three other </w:t>
-      </w:r>
-      <w:r>
-        <w:rPr>
-          <w:b/>
-          <w:bCs/>
-        </w:rPr>
-        <w:t>band members</w:t>
-      </w:r>
-      <w:r>
-        <w:rPr>
-          <w:b/>
-          <w:bCs/>
-        </w:rPr>
-        <w:t xml:space="preserve"> </w:t>
-      </w:r>
-      <w:r>
-        <w:t>(actors</w:t>
-      </w:r>
-      <w:r>
-        <w:t>; chapter 4</w:t>
-      </w:r>
-      <w:r>
-        <w:t>)</w:t>
-      </w:r>
-      <w:r>
-        <w:t>. One plays the bass</w:t>
-      </w:r>
-      <w:r>
-        <w:t xml:space="preserve">, </w:t>
-      </w:r>
-      <w:r>
-        <w:t>Sithrogürd, one plays the electric guitar</w:t>
-      </w:r>
-      <w:r>
-        <w:t xml:space="preserve">, </w:t>
-      </w:r>
-      <w:r>
-        <w:t>Keiser, and another does the drumming</w:t>
-      </w:r>
-      <w:r>
-        <w:t xml:space="preserve">, </w:t>
-      </w:r>
-      <w:r>
-        <w:t>Molotov.</w:t>
-      </w:r>
-      <w:r>
-        <w:t xml:space="preserve"> Sithrogürd has a brother, Oystein</w:t>
-      </w:r>
-      <w:r>
-        <w:t xml:space="preserve"> (an agent)</w:t>
-      </w:r>
-      <w:r>
-        <w:t xml:space="preserve">, who is </w:t>
-      </w:r>
-      <w:r>
-        <w:t>hiding the police</w:t>
-      </w:r>
-      <w:r>
-        <w:t xml:space="preserve"> for </w:t>
-      </w:r>
-      <w:r>
-        <w:t xml:space="preserve">trying to </w:t>
-      </w:r>
-      <w:r>
-        <w:t xml:space="preserve">burn </w:t>
-      </w:r>
-      <w:r>
-        <w:t>their ex’s house, and the ex is also in play, dating Nullsvorn (a groupie).</w:t>
-      </w:r>
-    </w:p>
-    <w:p>
-      <w:pPr>
-        <w:pStyle w:val="Normaali2"/>
-      </w:pPr>
-    </w:p>
-    <w:p>
-      <w:pPr>
-        <w:pStyle w:val="Normaali2"/>
-        <w:rPr>
-          <w:color w:val="EE0000"/>
-        </w:rPr>
-      </w:pPr>
-      <w:r>
-        <w:t xml:space="preserve">Each character who is directly participating in the demo recording process has </w:t>
-      </w:r>
-      <w:r>
-        <w:rPr>
-          <w:b/>
-          <w:bCs/>
-        </w:rPr>
-        <w:t>aspects</w:t>
-      </w:r>
-      <w:r>
-        <w:t xml:space="preserve"> and </w:t>
-      </w:r>
-      <w:r>
-        <w:rPr>
-          <w:b/>
-          <w:bCs/>
-        </w:rPr>
-        <w:t>tags.</w:t>
-      </w:r>
-      <w:r>
-        <w:t xml:space="preserve"> </w:t>
-      </w:r>
-      <w:r>
-        <w:rPr>
-          <w:b/>
-          <w:bCs/>
-        </w:rPr>
-        <w:t>Aspects</w:t>
-      </w:r>
-      <w:r>
-        <w:t xml:space="preserve"> measure the way they participate – Nullsvorn’s aspects are </w:t>
+        <w:t>inversion</w:t>
       </w:r>
       <w:r>
         <w:rPr>
           <w:i/>
           <w:iCs/>
         </w:rPr>
-        <w:t xml:space="preserve">fry-vocals </w:t>
-      </w:r>
-      <w:r>
-        <w:t xml:space="preserve">and </w:t>
+        <w:t xml:space="preserve"> of some sort</w:t>
+      </w:r>
+      <w:r>
+        <w:t>.</w:t>
+      </w:r>
+      <w:r>
+        <w:t xml:space="preserve"> Like go against established religion or state or something. </w:t>
+      </w:r>
+      <w:r>
+        <w:t xml:space="preserve">Also, music should be </w:t>
+      </w:r>
+      <w:r>
+        <w:t>True</w:t>
+      </w:r>
+      <w:r>
+        <w:t xml:space="preserve">. Whatever that means. </w:t>
+      </w:r>
+      <w:r>
+        <w:t xml:space="preserve">Who knows? </w:t>
+      </w:r>
+    </w:p>
+    <w:p>
+      <w:pPr>
+        <w:pStyle w:val="Normaali2"/>
+      </w:pPr>
+    </w:p>
+    <w:p>
+      <w:pPr>
+        <w:pStyle w:val="Normaali2"/>
+      </w:pPr>
+      <w:r>
+        <w:rPr>
+          <w:b/>
+          <w:bCs/>
+        </w:rPr>
+        <w:t>Nullsvorn</w:t>
+      </w:r>
+      <w:r>
+        <w:t xml:space="preserve"> as the band leader </w:t>
+      </w:r>
+      <w:r>
+        <w:t>(a controller</w:t>
+      </w:r>
+      <w:r>
+        <w:t>; see chapter 4</w:t>
+      </w:r>
+      <w:r>
+        <w:t xml:space="preserve">) </w:t>
+      </w:r>
+      <w:r>
+        <w:t xml:space="preserve">has their hands full with executive decisions such as how much of an effort the band in general puts to </w:t>
+      </w:r>
+      <w:r>
+        <w:lastRenderedPageBreak/>
+        <w:t>gestating (</w:t>
+      </w:r>
+      <w:r>
+        <w:t>producing</w:t>
+      </w:r>
+      <w:r>
+        <w:t xml:space="preserve"> material</w:t>
+      </w:r>
+      <w:r>
+        <w:t>; chapter 4</w:t>
+      </w:r>
+      <w:r>
+        <w:t xml:space="preserve">), rehearsals or leisure time. Besides this, Nullsvorn is also the lyricist and the vocalist of the band, so they contribute the voice into the end goal of the band, which is </w:t>
+      </w:r>
+      <w:r>
+        <w:t xml:space="preserve">always </w:t>
+      </w:r>
+      <w:r>
+        <w:t xml:space="preserve">the next demo tape. There are three other </w:t>
+      </w:r>
+      <w:r>
+        <w:rPr>
+          <w:b/>
+          <w:bCs/>
+        </w:rPr>
+        <w:t>band members</w:t>
+      </w:r>
+      <w:r>
+        <w:rPr>
+          <w:b/>
+          <w:bCs/>
+        </w:rPr>
+        <w:t xml:space="preserve"> </w:t>
+      </w:r>
+      <w:r>
+        <w:t>(actors</w:t>
+      </w:r>
+      <w:r>
+        <w:t>; chapter 4</w:t>
+      </w:r>
+      <w:r>
+        <w:t>)</w:t>
+      </w:r>
+      <w:r>
+        <w:t>. One plays the bass</w:t>
+      </w:r>
+      <w:r>
+        <w:t xml:space="preserve">, </w:t>
+      </w:r>
+      <w:r>
+        <w:t>Sithrogürd, one plays the electric guitar</w:t>
+      </w:r>
+      <w:r>
+        <w:t xml:space="preserve">, </w:t>
+      </w:r>
+      <w:r>
+        <w:t>Keiser, and another does the drumming</w:t>
+      </w:r>
+      <w:r>
+        <w:t xml:space="preserve">, </w:t>
+      </w:r>
+      <w:r>
+        <w:t>Molotov.</w:t>
+      </w:r>
+      <w:r>
+        <w:t xml:space="preserve"> Sithrogürd has a brother, Oystein</w:t>
+      </w:r>
+      <w:r>
+        <w:t xml:space="preserve"> (an agent)</w:t>
+      </w:r>
+      <w:r>
+        <w:t xml:space="preserve">, who is </w:t>
+      </w:r>
+      <w:r>
+        <w:t>hiding the police</w:t>
+      </w:r>
+      <w:r>
+        <w:t xml:space="preserve"> for </w:t>
+      </w:r>
+      <w:r>
+        <w:t xml:space="preserve">trying to </w:t>
+      </w:r>
+      <w:r>
+        <w:t xml:space="preserve">burn </w:t>
+      </w:r>
+      <w:r>
+        <w:t>their ex’s house, and the ex is also in play, dating Nullsvorn (a groupie).</w:t>
+      </w:r>
+    </w:p>
+    <w:p>
+      <w:pPr>
+        <w:pStyle w:val="Normaali2"/>
+      </w:pPr>
+    </w:p>
+    <w:p>
+      <w:pPr>
+        <w:pStyle w:val="Normaali2"/>
+        <w:rPr>
+          <w:color w:val="EE0000"/>
+        </w:rPr>
+      </w:pPr>
+      <w:r>
+        <w:t xml:space="preserve">Each character who is directly participating in the demo recording process has </w:t>
+      </w:r>
+      <w:r>
+        <w:rPr>
+          <w:b/>
+          <w:bCs/>
+        </w:rPr>
+        <w:t>aspects</w:t>
+      </w:r>
+      <w:r>
+        <w:t xml:space="preserve"> and </w:t>
+      </w:r>
+      <w:r>
+        <w:rPr>
+          <w:b/>
+          <w:bCs/>
+        </w:rPr>
+        <w:t>tags.</w:t>
+      </w:r>
+      <w:r>
+        <w:t xml:space="preserve"> </w:t>
+      </w:r>
+      <w:r>
+        <w:rPr>
+          <w:b/>
+          <w:bCs/>
+        </w:rPr>
+        <w:t>Aspects</w:t>
+      </w:r>
+      <w:r>
+        <w:t xml:space="preserve"> measure the way they participate – Nullsvorn’s aspects are </w:t>
       </w:r>
       <w:r>
         <w:rPr>
           <w:i/>
           <w:iCs/>
         </w:rPr>
-        <w:t>lyricism</w:t>
-      </w:r>
-      <w:r>
-        <w:t xml:space="preserve">. </w:t>
-      </w:r>
-      <w:r>
-        <w:t xml:space="preserve">The band itself can also hold aspects: </w:t>
+        <w:t xml:space="preserve">fry-vocals </w:t>
+      </w:r>
+      <w:r>
+        <w:t xml:space="preserve">and </w:t>
       </w:r>
       <w:r>
         <w:rPr>
           <w:i/>
           <w:iCs/>
         </w:rPr>
-        <w:t xml:space="preserve">corpse paint </w:t>
-      </w:r>
-      <w:r>
-        <w:t xml:space="preserve">and </w:t>
+        <w:t>lyricism</w:t>
+      </w:r>
+      <w:r>
+        <w:t xml:space="preserve">. </w:t>
+      </w:r>
+      <w:r>
+        <w:t xml:space="preserve">The band itself can also hold aspects: </w:t>
       </w:r>
       <w:r>
         <w:rPr>
           <w:i/>
           <w:iCs/>
         </w:rPr>
-        <w:t>true snordenmarkians.</w:t>
-      </w:r>
-      <w:r>
-        <w:t xml:space="preserve"> </w:t>
-      </w:r>
-      <w:r>
-        <w:t xml:space="preserve">Sithrogürd has </w:t>
+        <w:t xml:space="preserve">corpse paint </w:t>
+      </w:r>
+      <w:r>
+        <w:t xml:space="preserve">and </w:t>
       </w:r>
       <w:r>
         <w:rPr>
           <w:i/>
           <w:iCs/>
         </w:rPr>
-        <w:t>bass</w:t>
-      </w:r>
-      <w:r>
-        <w:t xml:space="preserve"> and </w:t>
+        <w:t>true snordenmarkians.</w:t>
+      </w:r>
+      <w:r>
+        <w:t xml:space="preserve"> </w:t>
+      </w:r>
+      <w:r>
+        <w:t xml:space="preserve">Sithrogürd has </w:t>
       </w:r>
       <w:r>
         <w:rPr>
           <w:i/>
           <w:iCs/>
         </w:rPr>
-        <w:t>arsonist</w:t>
-      </w:r>
-      <w:r>
-        <w:t xml:space="preserve">. Keiser has </w:t>
+        <w:t>bass</w:t>
+      </w:r>
+      <w:r>
+        <w:t xml:space="preserve"> and </w:t>
       </w:r>
       <w:r>
         <w:rPr>
           <w:i/>
           <w:iCs/>
         </w:rPr>
-        <w:t>guitar</w:t>
-      </w:r>
-      <w:r>
-        <w:t xml:space="preserve"> aspect, and Molotov has both the </w:t>
+        <w:t>arsonist</w:t>
+      </w:r>
+      <w:r>
+        <w:t xml:space="preserve">. Keiser has </w:t>
       </w:r>
       <w:r>
         <w:rPr>
           <w:i/>
           <w:iCs/>
         </w:rPr>
-        <w:t xml:space="preserve">drummer </w:t>
-      </w:r>
-      <w:r>
-        <w:t xml:space="preserve">and </w:t>
+        <w:t>guitar</w:t>
+      </w:r>
+      <w:r>
+        <w:t xml:space="preserve"> aspect, and Molotov has both the </w:t>
       </w:r>
       <w:r>
         <w:rPr>
           <w:i/>
           <w:iCs/>
         </w:rPr>
+        <w:t xml:space="preserve">drummer </w:t>
+      </w:r>
+      <w:r>
+        <w:t xml:space="preserve">and </w:t>
+      </w:r>
+      <w:r>
+        <w:rPr>
+          <w:i/>
+          <w:iCs/>
+        </w:rPr>
         <w:t>keyboard</w:t>
       </w:r>
       <w:r>
@@ -4982,8 +4842,9 @@
         <w:pStyle w:val="Otsikko2"/>
         <w:spacing w:before="0" w:line="240" w:lineRule="auto"/>
       </w:pPr>
-      <w:bookmarkStart w:id="4" w:name="_Toc215658189"/>
-      <w:r>
+      <w:bookmarkStart w:id="4" w:name="_Toc215741169"/>
+      <w:r>
+        <w:lastRenderedPageBreak/>
         <w:t>4. Main Features</w:t>
       </w:r>
       <w:bookmarkEnd w:id="4"/>
@@ -5002,7 +4863,7 @@
       <w:r>
         <w:t xml:space="preserve">  </w:t>
       </w:r>
-      <w:bookmarkStart w:id="5" w:name="_Toc215658190"/>
+      <w:bookmarkStart w:id="5" w:name="_Toc215741170"/>
       <w:r>
         <w:t xml:space="preserve">4.1 </w:t>
       </w:r>
@@ -5166,7 +5027,7 @@
       <w:r>
         <w:t xml:space="preserve">  </w:t>
       </w:r>
-      <w:bookmarkStart w:id="6" w:name="_Toc215658191"/>
+      <w:bookmarkStart w:id="6" w:name="_Toc215741171"/>
       <w:r>
         <w:t xml:space="preserve">4.2 </w:t>
       </w:r>
@@ -5366,10 +5227,39 @@
         <w:t xml:space="preserve"> actions (see below) into collective and character actions. A character within a collective has a set of character actions determined by which collective action their collective has taken (determined by the controller of that collective). A band that is rehearsing, has band members that can only do rehearsing actions.</w:t>
       </w:r>
       <w:r>
-        <w:t xml:space="preserve"> A character can do several actions in one season as determined by the following design choice: 2 for free, third at cost. The third action causes the character the </w:t>
-      </w:r>
-      <w:r>
-        <w:t xml:space="preserve">“tired” status, which can be rested away with one skip character action for the character. </w:t>
+        <w:t xml:space="preserve"> </w:t>
+      </w:r>
+    </w:p>
+    <w:p>
+      <w:pPr>
+        <w:pStyle w:val="Normaali2"/>
+      </w:pPr>
+    </w:p>
+    <w:p>
+      <w:pPr>
+        <w:pStyle w:val="Normaali2"/>
+      </w:pPr>
+      <w:r>
+        <w:t xml:space="preserve">A character can do several actions in one season as determined by the following design choice: </w:t>
+      </w:r>
+      <w:r>
+        <w:rPr>
+          <w:b/>
+          <w:bCs/>
+        </w:rPr>
+        <w:t>2 for free, third at cost</w:t>
+      </w:r>
+      <w:r>
+        <w:t xml:space="preserve">. The third action causes the character the </w:t>
+      </w:r>
+      <w:r>
+        <w:t xml:space="preserve">“tired” status, which can be rested away with one skip character action </w:t>
+      </w:r>
+      <w:r>
+        <w:t>per</w:t>
+      </w:r>
+      <w:r>
+        <w:t xml:space="preserve"> character. </w:t>
       </w:r>
       <w:r>
         <w:t xml:space="preserve">A character who is considered “tired”, cannot take a third action. </w:t>
@@ -5394,6 +5284,25 @@
       </w:r>
       <w:r>
         <w:t xml:space="preserve"> The strain penalty can only influence game play once per season. When the strain penalty is about to influence play, the character can opt out by taking a rest action.</w:t>
+      </w:r>
+      <w:r>
+        <w:t xml:space="preserve"> Keepers handle their Keeper strain penalty automatically, but their actions can keep them in the tired state indefinitely.</w:t>
+      </w:r>
+    </w:p>
+    <w:p>
+      <w:pPr>
+        <w:pStyle w:val="Normaali2"/>
+      </w:pPr>
+    </w:p>
+    <w:p>
+      <w:pPr>
+        <w:pStyle w:val="Normaali2"/>
+      </w:pPr>
+      <w:r>
+        <w:t xml:space="preserve">As a point of clarification: If a character makes three actions in a season, regardless of their outcome, they will begin their next season tired. This tiredness then </w:t>
+      </w:r>
+      <w:r>
+        <w:t>sets them up for a strain penalty in what ever collective action they have chosen. The only exception to this rule is if they get to be the next Keeper. Keeper doesn’t inherit tiredness from non-keeper actions. Likewise, the player who overplayed as keeper and then lost the position, won’t start their next season as a regular player tired.</w:t>
       </w:r>
     </w:p>
     <w:p>
@@ -5461,6 +5370,7 @@
           <w:b/>
           <w:bCs/>
         </w:rPr>
+        <w:lastRenderedPageBreak/>
         <w:t>Strain penalty:</w:t>
       </w:r>
       <w:r>
@@ -5539,7 +5449,6 @@
         </w:numPr>
       </w:pPr>
       <w:r>
-        <w:lastRenderedPageBreak/>
         <w:t>Compose action either starts an empty track, to be named by the player as the first idea is placed on it or contributes to the track currently being worked on. The first idea is called “the root”, and it can be any idea held by any band member. Each band member is expected to contribute one idea to the track. When all band members have contributed, the track can be declared composed, or left open for further compose actions.</w:t>
       </w:r>
     </w:p>
@@ -5676,7 +5585,11 @@
         <w:pStyle w:val="Normaali2"/>
       </w:pPr>
       <w:r>
-        <w:t>The Keeper has powerful, genre-bending decisions at their disposal. For example, they can declare a demo as black metal even if it lacks the genre defining re-sacralising tag-pair (see 4.5). They can lose other people’s demos and thus hinder their circulation in the scene. They can also take credit from other people’s actions at slightest hints of involvement.</w:t>
+        <w:t xml:space="preserve">The Keeper has powerful, genre-bending decisions at their disposal. For example, they can declare a demo as black metal even if it lacks the genre defining re-sacralising tag-pair (see 4.5). They can lose other people’s demos and thus hinder </w:t>
+      </w:r>
+      <w:r>
+        <w:lastRenderedPageBreak/>
+        <w:t>their circulation in the scene. They can also take credit from other people’s actions at slightest hints of involvement.</w:t>
       </w:r>
       <w:r>
         <w:t xml:space="preserve"> </w:t>
@@ -5693,11 +5606,7 @@
         <w:pStyle w:val="Normaali2"/>
       </w:pPr>
       <w:r>
-        <w:t xml:space="preserve">Keepers have a trait called “Pull”, that is derived from their influence at the start of their position as Keeper. It is an expendable resource, that gets somewhat replenished at the start of each new round (unless the Keeper changes). All Keeper actions cost Pull, and the bigger the actions, the bigger the cost. If a keeper goes past their max Pull </w:t>
-      </w:r>
-      <w:r>
-        <w:lastRenderedPageBreak/>
-        <w:t xml:space="preserve">with an action, they can no longer do Keeper actions and are considered tired and suffer the strain penalty. </w:t>
+        <w:t xml:space="preserve">Keepers have a trait called “Pull”, that is derived from their influence at the start of their position as Keeper. It is an expendable resource, that gets somewhat replenished at the start of each new round (unless the Keeper changes). All Keeper actions cost Pull, and the bigger the actions, the bigger the cost. If a keeper goes past their max Pull with an action, they can no longer do Keeper actions and are considered tired and suffer the strain penalty. </w:t>
       </w:r>
     </w:p>
     <w:p>
@@ -5771,7 +5680,7 @@
       <w:r>
         <w:t xml:space="preserve">  </w:t>
       </w:r>
-      <w:bookmarkStart w:id="7" w:name="_Toc215658192"/>
+      <w:bookmarkStart w:id="7" w:name="_Toc215741172"/>
       <w:r>
         <w:t xml:space="preserve">4.3 </w:t>
       </w:r>
@@ -5789,7 +5698,13 @@
         <w:pStyle w:val="Normaali2"/>
       </w:pPr>
       <w:r>
-        <w:t xml:space="preserve">An aspect is a loose term of traits characters can possess in the game. Mechanics-wise, it is most easily described as simply a thing that can host a tag to become an idea. For example, a guitar riff is an </w:t>
+        <w:t xml:space="preserve">An aspect is </w:t>
+      </w:r>
+      <w:r>
+        <w:t>any trait an entity possesses that can host a tag to form an idea</w:t>
+      </w:r>
+      <w:r>
+        <w:t xml:space="preserve">. For example, a guitar riff is an </w:t>
       </w:r>
       <w:r>
         <w:t>idea</w:t>
@@ -5816,6 +5731,11 @@
     <w:p>
       <w:pPr>
         <w:pStyle w:val="Normaali2"/>
+        <w:rPr>
+          <w:i/>
+          <w:iCs/>
+          <w:color w:val="EE0000"/>
+        </w:rPr>
       </w:pPr>
       <w:r>
         <w:t>An aspect does not do much by itself, but it can be instantiated into an idea, and an idea can (and must) host a tag (see below). Each character has a capacity to indefinitely hold a set number of ideas, but the idea must be built again once expended.</w:t>
@@ -5827,19 +5747,7 @@
         <w:t>and</w:t>
       </w:r>
       <w:r>
-        <w:t xml:space="preserve"> the association with those ideas is permanent and always accessible to the members of the collective. A certain True Snordenmarkian Black M</w:t>
-      </w:r>
-      <w:r>
-        <w:t>e</w:t>
-      </w:r>
-      <w:r>
-        <w:t>tal band is known to wear corpse paint, and as the tagline already told us, they are heavily associated with their country of origin, too</w:t>
-      </w:r>
-      <w:r>
-        <w:t xml:space="preserve"> – that’s another easily accessible aspect</w:t>
-      </w:r>
-      <w:r>
-        <w:t xml:space="preserve">. </w:t>
+        <w:t xml:space="preserve"> the association with those ideas is permanent and always accessible to the members of the collective. </w:t>
       </w:r>
     </w:p>
     <w:p>
@@ -5847,12 +5755,21 @@
         <w:pStyle w:val="Normaali2"/>
       </w:pPr>
       <w:r>
-        <w:t>Besides being the natural path for tags to come to play, aspects carry different kinds of modifiers, depending on how the scene prefers things to be handled. If corpse paint is something desirable in what is considered TRUE, then it yields a bonus for the band utilizing it. If the bagpipe aspect is considered something unheard of in the scene, it might carry a penalty, unless it manages to do the exact opposite and the novelty itself gives it a bonus instead.</w:t>
+        <w:t xml:space="preserve">Besides being the natural path for tags to come to play, aspects carry different kinds of modifiers, depending on how the scene prefers things to be handled. If corpse paint is something desirable in what is considered TRUE, then it yields a bonus for the band utilizing it. If the bagpipe aspect is considered something unheard of in the scene, it </w:t>
+      </w:r>
+      <w:r>
+        <w:lastRenderedPageBreak/>
+        <w:t>might carry a penalty, unless it manages to do the exact opposite and the novelty itself gives it a bonus instead.</w:t>
       </w:r>
     </w:p>
     <w:p>
       <w:pPr>
         <w:pStyle w:val="Normaali2"/>
+        <w:rPr>
+          <w:i/>
+          <w:iCs/>
+          <w:color w:val="EE0000"/>
+        </w:rPr>
       </w:pPr>
       <w:r>
         <w:t xml:space="preserve">Finally, on aspect relate note, there is a trait called </w:t>
@@ -5865,17 +5782,7 @@
         <w:t>conveyance</w:t>
       </w:r>
       <w:r>
-        <w:t xml:space="preserve"> attached to the idea, which stands for the level of clarity at which the idea can be presented. This is as close as we get to “musicianship” or “technical skill value” in this game. It’s a normalized floating-point number that quite simply tells us how well the idea comes through to the </w:t>
-      </w:r>
-      <w:r>
-        <w:lastRenderedPageBreak/>
-        <w:t xml:space="preserve">audience. At conveyance 0.1, Nullsvorn has just plastered some paint on their face because that’s what they do, at 1.0 they are carrying a pagan war paint and are out to reclaim Snordenmark for the glory of </w:t>
-      </w:r>
-      <w:r>
-        <w:t>Wo</w:t>
-      </w:r>
-      <w:r>
-        <w:t>din.</w:t>
+        <w:t xml:space="preserve"> attached to the idea, which stands for the level of clarity at which the idea can be presented. This is as close as we get to “musicianship” or “technical skill value” in this game. It’s a normalized floating-point number that quite simply tells us how well the idea comes through to the audience. </w:t>
       </w:r>
     </w:p>
     <w:p>
@@ -5929,7 +5836,7 @@
       <w:r>
         <w:t xml:space="preserve">  </w:t>
       </w:r>
-      <w:bookmarkStart w:id="8" w:name="_Toc215658193"/>
+      <w:bookmarkStart w:id="8" w:name="_Toc215741173"/>
       <w:r>
         <w:t xml:space="preserve">4.4 </w:t>
       </w:r>
@@ -6015,7 +5922,11 @@
         <w:pStyle w:val="Normaali2"/>
       </w:pPr>
       <w:r>
-        <w:t xml:space="preserve">Every game entity object carries at least one tag (resonance tag) which means that every such object in the game can be interacted with to reach for that tag. Tags can be found from other sources, too, such as in-season tags that are naturally provided by the current turn (autumn tags are morbid, winter tags are cold, for example). Some game events can spawn special tags, which tend to be the more valuable, the more rare or risky their acquirement is. </w:t>
+        <w:t xml:space="preserve">Every game entity object carries at least one tag (resonance tag) which means that every such object in the game can be interacted with to reach for that tag. Tags can be found from other sources, too, such as in-season tags that are naturally provided by the current turn (autumn tags are morbid, winter tags are cold, for example). Some </w:t>
+      </w:r>
+      <w:r>
+        <w:lastRenderedPageBreak/>
+        <w:t xml:space="preserve">game events can spawn special tags, which tend to be the more valuable, the more rare or risky their acquirement is. </w:t>
       </w:r>
     </w:p>
     <w:p>
@@ -6032,7 +5943,6 @@
           <w:b/>
           <w:bCs/>
         </w:rPr>
-        <w:lastRenderedPageBreak/>
         <w:t xml:space="preserve">Resonance tags </w:t>
       </w:r>
       <w:r>
@@ -6081,7 +5991,7 @@
       <w:r>
         <w:t xml:space="preserve">  </w:t>
       </w:r>
-      <w:bookmarkStart w:id="9" w:name="_Toc215658194"/>
+      <w:bookmarkStart w:id="9" w:name="_Toc215741174"/>
       <w:r>
         <w:t>4.5 Tag-Pairs and genre specific systems</w:t>
       </w:r>
@@ -6091,11 +6001,16 @@
     <w:p>
       <w:pPr>
         <w:pStyle w:val="Normaali2"/>
-      </w:pPr>
-      <w:r>
         <w:rPr>
           <w:i/>
           <w:iCs/>
+          <w:color w:val="EE0000"/>
+        </w:rPr>
+      </w:pPr>
+      <w:r>
+        <w:rPr>
+          <w:i/>
+          <w:iCs/>
         </w:rPr>
         <w:t>Transient tags are used to create tag-pairs</w:t>
       </w:r>
@@ -6113,24 +6028,7 @@
         <w:t xml:space="preserve"> present in the record.</w:t>
       </w:r>
       <w:r>
-        <w:t xml:space="preserve"> Tag must be paired with its anti-tag. Beyond the scope of this project for the time being, but noteworthy enough to be mentioned are the </w:t>
-      </w:r>
-      <w:r>
-        <w:rPr>
-          <w:b/>
-          <w:bCs/>
-        </w:rPr>
-        <w:t>de-sacralising (tag vs NULL-tag) and sacralising (2 x tag) tags of death metal and doom metal.</w:t>
-      </w:r>
-      <w:r>
-        <w:rPr>
-          <w:b/>
-          <w:bCs/>
-        </w:rPr>
-        <w:t xml:space="preserve"> </w:t>
-      </w:r>
-      <w:r>
-        <w:t xml:space="preserve">Writing blackened death or doom is a valid strategy, however, and having multiple tag-pairs provides a better score yield per track. </w:t>
+        <w:t xml:space="preserve"> Tag must be paired with its anti-tag. </w:t>
       </w:r>
     </w:p>
     <w:p>
@@ -6172,8 +6070,9 @@
       <w:pPr>
         <w:pStyle w:val="Otsikko3"/>
       </w:pPr>
-      <w:bookmarkStart w:id="10" w:name="_Toc215658195"/>
-      <w:r>
+      <w:bookmarkStart w:id="10" w:name="_Toc215741175"/>
+      <w:r>
+        <w:lastRenderedPageBreak/>
         <w:t xml:space="preserve">4.6. There is </w:t>
       </w:r>
       <w:r>
@@ -6306,7 +6205,7 @@
       <w:r>
         <w:t xml:space="preserve">  </w:t>
       </w:r>
-      <w:bookmarkStart w:id="11" w:name="_Toc215658196"/>
+      <w:bookmarkStart w:id="11" w:name="_Toc215741176"/>
       <w:r>
         <w:t>4.</w:t>
       </w:r>
@@ -6354,7 +6253,7 @@
       <w:r>
         <w:t xml:space="preserve">  </w:t>
       </w:r>
-      <w:bookmarkStart w:id="12" w:name="_Toc215658197"/>
+      <w:bookmarkStart w:id="12" w:name="_Toc215741177"/>
       <w:r>
         <w:t>4.</w:t>
       </w:r>
@@ -6374,7 +6273,7 @@
       <w:r>
         <w:t xml:space="preserve">  </w:t>
       </w:r>
-      <w:bookmarkStart w:id="13" w:name="_Toc215658198"/>
+      <w:bookmarkStart w:id="13" w:name="_Toc215741178"/>
       <w:r>
         <w:t>4.</w:t>
       </w:r>
@@ -6403,7 +6302,7 @@
         <w:pStyle w:val="Otsikko2"/>
         <w:spacing w:before="0" w:line="240" w:lineRule="auto"/>
       </w:pPr>
-      <w:bookmarkStart w:id="14" w:name="_Toc215658199"/>
+      <w:bookmarkStart w:id="14" w:name="_Toc215741179"/>
       <w:r>
         <w:lastRenderedPageBreak/>
         <w:t>5. Genre, Setting, Concept Art book*</w:t>
@@ -6426,7 +6325,7 @@
         <w:pStyle w:val="Otsikko2"/>
         <w:spacing w:before="0" w:line="240" w:lineRule="auto"/>
       </w:pPr>
-      <w:bookmarkStart w:id="15" w:name="_Toc215658200"/>
+      <w:bookmarkStart w:id="15" w:name="_Toc215741180"/>
       <w:r>
         <w:lastRenderedPageBreak/>
         <w:t>6. Enemies, NPCs, Other objects</w:t>
@@ -6449,7 +6348,7 @@
         <w:pStyle w:val="Otsikko2"/>
         <w:spacing w:before="0" w:line="240" w:lineRule="auto"/>
       </w:pPr>
-      <w:bookmarkStart w:id="16" w:name="_Toc215658201"/>
+      <w:bookmarkStart w:id="16" w:name="_Toc215741181"/>
       <w:r>
         <w:lastRenderedPageBreak/>
         <w:t>7. Story board, script*</w:t>
@@ -6464,7 +6363,7 @@
       <w:r>
         <w:t xml:space="preserve">  </w:t>
       </w:r>
-      <w:bookmarkStart w:id="17" w:name="_Toc215658202"/>
+      <w:bookmarkStart w:id="17" w:name="_Toc215741182"/>
       <w:r>
         <w:t>7.1 Story overview</w:t>
       </w:r>
@@ -6478,7 +6377,7 @@
       <w:r>
         <w:t xml:space="preserve">  </w:t>
       </w:r>
-      <w:bookmarkStart w:id="18" w:name="_Toc215658203"/>
+      <w:bookmarkStart w:id="18" w:name="_Toc215741183"/>
       <w:r>
         <w:t>7.2 Progression, World 1</w:t>
       </w:r>
@@ -6492,7 +6391,7 @@
       <w:r>
         <w:t xml:space="preserve">  </w:t>
       </w:r>
-      <w:bookmarkStart w:id="19" w:name="_Toc215658204"/>
+      <w:bookmarkStart w:id="19" w:name="_Toc215741184"/>
       <w:r>
         <w:t xml:space="preserve">7.9 Progression, World </w:t>
       </w:r>
@@ -6517,7 +6416,7 @@
         <w:pStyle w:val="Otsikko2"/>
         <w:spacing w:before="0" w:line="240" w:lineRule="auto"/>
       </w:pPr>
-      <w:bookmarkStart w:id="20" w:name="_Toc215658205"/>
+      <w:bookmarkStart w:id="20" w:name="_Toc215741185"/>
       <w:r>
         <w:lastRenderedPageBreak/>
         <w:t>8. Technical definitions, Tech guide*</w:t>
@@ -6532,7 +6431,7 @@
       <w:r>
         <w:t xml:space="preserve">  </w:t>
       </w:r>
-      <w:bookmarkStart w:id="21" w:name="_Toc215658206"/>
+      <w:bookmarkStart w:id="21" w:name="_Toc215741186"/>
       <w:r>
         <w:t>8.1 Platforms, versions</w:t>
       </w:r>
@@ -6546,7 +6445,7 @@
       <w:r>
         <w:t xml:space="preserve">  </w:t>
       </w:r>
-      <w:bookmarkStart w:id="22" w:name="_Toc215658207"/>
+      <w:bookmarkStart w:id="22" w:name="_Toc215741187"/>
       <w:r>
         <w:t>8.2 Control Scheme</w:t>
       </w:r>
@@ -6560,7 +6459,7 @@
       <w:r>
         <w:t xml:space="preserve">  </w:t>
       </w:r>
-      <w:bookmarkStart w:id="23" w:name="_Toc215658208"/>
+      <w:bookmarkStart w:id="23" w:name="_Toc215741188"/>
       <w:r>
         <w:t>8.3 Limitations</w:t>
       </w:r>
@@ -6582,7 +6481,7 @@
         <w:pStyle w:val="Otsikko2"/>
         <w:spacing w:before="0" w:line="240" w:lineRule="auto"/>
       </w:pPr>
-      <w:bookmarkStart w:id="24" w:name="_Toc215658209"/>
+      <w:bookmarkStart w:id="24" w:name="_Toc215741189"/>
       <w:r>
         <w:lastRenderedPageBreak/>
         <w:t>9. Business definitions*</w:t>
@@ -6597,7 +6496,7 @@
       <w:r>
         <w:t xml:space="preserve">  </w:t>
       </w:r>
-      <w:bookmarkStart w:id="25" w:name="_Toc215658210"/>
+      <w:bookmarkStart w:id="25" w:name="_Toc215741190"/>
       <w:r>
         <w:t>9.1 In-app purchases</w:t>
       </w:r>
@@ -6611,7 +6510,7 @@
       <w:r>
         <w:t xml:space="preserve">  </w:t>
       </w:r>
-      <w:bookmarkStart w:id="26" w:name="_Toc215658211"/>
+      <w:bookmarkStart w:id="26" w:name="_Toc215741191"/>
       <w:r>
         <w:t>9.2 DLC packs</w:t>
       </w:r>
@@ -6633,7 +6532,7 @@
         <w:pStyle w:val="Otsikko2"/>
         <w:spacing w:before="0" w:line="240" w:lineRule="auto"/>
       </w:pPr>
-      <w:bookmarkStart w:id="27" w:name="_Toc215658212"/>
+      <w:bookmarkStart w:id="27" w:name="_Toc215741192"/>
       <w:r>
         <w:lastRenderedPageBreak/>
         <w:t>10. Outsourced/Bought Assets</w:t>
@@ -6723,7 +6622,7 @@
       <w:pPr>
         <w:pStyle w:val="Otsikko2"/>
       </w:pPr>
-      <w:bookmarkStart w:id="28" w:name="_Toc215658213"/>
+      <w:bookmarkStart w:id="28" w:name="_Toc215741193"/>
       <w:r>
         <w:lastRenderedPageBreak/>
         <w:t>11.</w:t>
@@ -11929,6 +11828,7 @@
   <w:style w:type="character" w:default="1" w:styleId="Kappaleenoletusfontti">
     <w:name w:val="Default Paragraph Font"/>
     <w:uiPriority w:val="1"/>
+    <w:semiHidden/>
     <w:unhideWhenUsed/>
   </w:style>
   <w:style w:type="table" w:default="1" w:styleId="Normaalitaulukko">

</xml_diff>

<commit_message>
Improving on images, revising and expanding rules
- Nullsvorn improved
- The concept of Scene Map pondered upon furiously
</commit_message>
<xml_diff>
--- a/TheProspector/Assets/Docs/Related School Work/LUT/Game Design Document.docx
+++ b/TheProspector/Assets/Docs/Related School Work/LUT/Game Design Document.docx
@@ -1258,7 +1258,7 @@
           <w:r>
             <w:fldChar w:fldCharType="separate"/>
           </w:r>
-          <w:hyperlink w:anchor="_Toc220496092" w:history="1">
+          <w:hyperlink w:anchor="_Toc221100881" w:history="1">
             <w:r>
               <w:rPr>
                 <w:rStyle w:val="Hyperlinkki"/>
@@ -1285,7 +1285,7 @@
                 <w:noProof/>
                 <w:webHidden/>
               </w:rPr>
-              <w:instrText xml:space="preserve"> PAGEREF _Toc220496092 \h </w:instrText>
+              <w:instrText xml:space="preserve"> PAGEREF _Toc221100881 \h </w:instrText>
             </w:r>
             <w:r>
               <w:rPr>
@@ -1332,7 +1332,7 @@
               <w14:ligatures w14:val="standardContextual"/>
             </w:rPr>
           </w:pPr>
-          <w:hyperlink w:anchor="_Toc220496093" w:history="1">
+          <w:hyperlink w:anchor="_Toc221100882" w:history="1">
             <w:r>
               <w:rPr>
                 <w:rStyle w:val="Hyperlinkki"/>
@@ -1359,7 +1359,7 @@
                 <w:noProof/>
                 <w:webHidden/>
               </w:rPr>
-              <w:instrText xml:space="preserve"> PAGEREF _Toc220496093 \h </w:instrText>
+              <w:instrText xml:space="preserve"> PAGEREF _Toc221100882 \h </w:instrText>
             </w:r>
             <w:r>
               <w:rPr>
@@ -1406,7 +1406,7 @@
               <w14:ligatures w14:val="standardContextual"/>
             </w:rPr>
           </w:pPr>
-          <w:hyperlink w:anchor="_Toc220496094" w:history="1">
+          <w:hyperlink w:anchor="_Toc221100883" w:history="1">
             <w:r>
               <w:rPr>
                 <w:rStyle w:val="Hyperlinkki"/>
@@ -1433,7 +1433,7 @@
                 <w:noProof/>
                 <w:webHidden/>
               </w:rPr>
-              <w:instrText xml:space="preserve"> PAGEREF _Toc220496094 \h </w:instrText>
+              <w:instrText xml:space="preserve"> PAGEREF _Toc221100883 \h </w:instrText>
             </w:r>
             <w:r>
               <w:rPr>
@@ -1480,7 +1480,7 @@
               <w14:ligatures w14:val="standardContextual"/>
             </w:rPr>
           </w:pPr>
-          <w:hyperlink w:anchor="_Toc220496095" w:history="1">
+          <w:hyperlink w:anchor="_Toc221100884" w:history="1">
             <w:r>
               <w:rPr>
                 <w:rStyle w:val="Hyperlinkki"/>
@@ -1507,7 +1507,7 @@
                 <w:noProof/>
                 <w:webHidden/>
               </w:rPr>
-              <w:instrText xml:space="preserve"> PAGEREF _Toc220496095 \h </w:instrText>
+              <w:instrText xml:space="preserve"> PAGEREF _Toc221100884 \h </w:instrText>
             </w:r>
             <w:r>
               <w:rPr>
@@ -1554,7 +1554,7 @@
               <w14:ligatures w14:val="standardContextual"/>
             </w:rPr>
           </w:pPr>
-          <w:hyperlink w:anchor="_Toc220496096" w:history="1">
+          <w:hyperlink w:anchor="_Toc221100885" w:history="1">
             <w:r>
               <w:rPr>
                 <w:rStyle w:val="Hyperlinkki"/>
@@ -1581,7 +1581,7 @@
                 <w:noProof/>
                 <w:webHidden/>
               </w:rPr>
-              <w:instrText xml:space="preserve"> PAGEREF _Toc220496096 \h </w:instrText>
+              <w:instrText xml:space="preserve"> PAGEREF _Toc221100885 \h </w:instrText>
             </w:r>
             <w:r>
               <w:rPr>
@@ -1628,7 +1628,7 @@
               <w14:ligatures w14:val="standardContextual"/>
             </w:rPr>
           </w:pPr>
-          <w:hyperlink w:anchor="_Toc220496097" w:history="1">
+          <w:hyperlink w:anchor="_Toc221100886" w:history="1">
             <w:r>
               <w:rPr>
                 <w:rStyle w:val="Hyperlinkki"/>
@@ -1655,7 +1655,7 @@
                 <w:noProof/>
                 <w:webHidden/>
               </w:rPr>
-              <w:instrText xml:space="preserve"> PAGEREF _Toc220496097 \h </w:instrText>
+              <w:instrText xml:space="preserve"> PAGEREF _Toc221100886 \h </w:instrText>
             </w:r>
             <w:r>
               <w:rPr>
@@ -1702,7 +1702,7 @@
               <w14:ligatures w14:val="standardContextual"/>
             </w:rPr>
           </w:pPr>
-          <w:hyperlink w:anchor="_Toc220496098" w:history="1">
+          <w:hyperlink w:anchor="_Toc221100887" w:history="1">
             <w:r>
               <w:rPr>
                 <w:rStyle w:val="Hyperlinkki"/>
@@ -1729,7 +1729,7 @@
                 <w:noProof/>
                 <w:webHidden/>
               </w:rPr>
-              <w:instrText xml:space="preserve"> PAGEREF _Toc220496098 \h </w:instrText>
+              <w:instrText xml:space="preserve"> PAGEREF _Toc221100887 \h </w:instrText>
             </w:r>
             <w:r>
               <w:rPr>
@@ -1776,7 +1776,7 @@
               <w14:ligatures w14:val="standardContextual"/>
             </w:rPr>
           </w:pPr>
-          <w:hyperlink w:anchor="_Toc220496099" w:history="1">
+          <w:hyperlink w:anchor="_Toc221100888" w:history="1">
             <w:r>
               <w:rPr>
                 <w:rStyle w:val="Hyperlinkki"/>
@@ -1803,7 +1803,7 @@
                 <w:noProof/>
                 <w:webHidden/>
               </w:rPr>
-              <w:instrText xml:space="preserve"> PAGEREF _Toc220496099 \h </w:instrText>
+              <w:instrText xml:space="preserve"> PAGEREF _Toc221100888 \h </w:instrText>
             </w:r>
             <w:r>
               <w:rPr>
@@ -1850,7 +1850,7 @@
               <w14:ligatures w14:val="standardContextual"/>
             </w:rPr>
           </w:pPr>
-          <w:hyperlink w:anchor="_Toc220496100" w:history="1">
+          <w:hyperlink w:anchor="_Toc221100889" w:history="1">
             <w:r>
               <w:rPr>
                 <w:rStyle w:val="Hyperlinkki"/>
@@ -1877,7 +1877,7 @@
                 <w:noProof/>
                 <w:webHidden/>
               </w:rPr>
-              <w:instrText xml:space="preserve"> PAGEREF _Toc220496100 \h </w:instrText>
+              <w:instrText xml:space="preserve"> PAGEREF _Toc221100889 \h </w:instrText>
             </w:r>
             <w:r>
               <w:rPr>
@@ -1897,7 +1897,7 @@
                 <w:noProof/>
                 <w:webHidden/>
               </w:rPr>
-              <w:t>16</w:t>
+              <w:t>17</w:t>
             </w:r>
             <w:r>
               <w:rPr>
@@ -1924,13 +1924,13 @@
               <w14:ligatures w14:val="standardContextual"/>
             </w:rPr>
           </w:pPr>
-          <w:hyperlink w:anchor="_Toc220496101" w:history="1">
+          <w:hyperlink w:anchor="_Toc221100890" w:history="1">
             <w:r>
               <w:rPr>
                 <w:rStyle w:val="Hyperlinkki"/>
                 <w:noProof/>
               </w:rPr>
-              <w:t>4.5 Tag-Pairs and genre specific systems</w:t>
+              <w:t>4.6 Tag-Pairs and genre specific systems</w:t>
             </w:r>
             <w:r>
               <w:rPr>
@@ -1951,7 +1951,7 @@
                 <w:noProof/>
                 <w:webHidden/>
               </w:rPr>
-              <w:instrText xml:space="preserve"> PAGEREF _Toc220496101 \h </w:instrText>
+              <w:instrText xml:space="preserve"> PAGEREF _Toc221100890 \h </w:instrText>
             </w:r>
             <w:r>
               <w:rPr>
@@ -1971,7 +1971,7 @@
                 <w:noProof/>
                 <w:webHidden/>
               </w:rPr>
-              <w:t>18</w:t>
+              <w:t>19</w:t>
             </w:r>
             <w:r>
               <w:rPr>
@@ -1998,13 +1998,13 @@
               <w14:ligatures w14:val="standardContextual"/>
             </w:rPr>
           </w:pPr>
-          <w:hyperlink w:anchor="_Toc220496102" w:history="1">
+          <w:hyperlink w:anchor="_Toc221100891" w:history="1">
             <w:r>
               <w:rPr>
                 <w:rStyle w:val="Hyperlinkki"/>
                 <w:noProof/>
               </w:rPr>
-              <w:t>4.6. TRUE vs true, novelty, and gravity</w:t>
+              <w:t>4.7. TRUE vs true, novelty, and gravity</w:t>
             </w:r>
             <w:r>
               <w:rPr>
@@ -2025,7 +2025,7 @@
                 <w:noProof/>
                 <w:webHidden/>
               </w:rPr>
-              <w:instrText xml:space="preserve"> PAGEREF _Toc220496102 \h </w:instrText>
+              <w:instrText xml:space="preserve"> PAGEREF _Toc221100891 \h </w:instrText>
             </w:r>
             <w:r>
               <w:rPr>
@@ -2045,7 +2045,7 @@
                 <w:noProof/>
                 <w:webHidden/>
               </w:rPr>
-              <w:t>18</w:t>
+              <w:t>19</w:t>
             </w:r>
             <w:r>
               <w:rPr>
@@ -2072,13 +2072,13 @@
               <w14:ligatures w14:val="standardContextual"/>
             </w:rPr>
           </w:pPr>
-          <w:hyperlink w:anchor="_Toc220496103" w:history="1">
+          <w:hyperlink w:anchor="_Toc221100892" w:history="1">
             <w:r>
               <w:rPr>
                 <w:rStyle w:val="Hyperlinkki"/>
                 <w:noProof/>
               </w:rPr>
-              <w:t>4.7 Track Construction and Recording</w:t>
+              <w:t>4.8 Track Construction and Recording</w:t>
             </w:r>
             <w:r>
               <w:rPr>
@@ -2099,7 +2099,7 @@
                 <w:noProof/>
                 <w:webHidden/>
               </w:rPr>
-              <w:instrText xml:space="preserve"> PAGEREF _Toc220496103 \h </w:instrText>
+              <w:instrText xml:space="preserve"> PAGEREF _Toc221100892 \h </w:instrText>
             </w:r>
             <w:r>
               <w:rPr>
@@ -2119,7 +2119,7 @@
                 <w:noProof/>
                 <w:webHidden/>
               </w:rPr>
-              <w:t>20</w:t>
+              <w:t>21</w:t>
             </w:r>
             <w:r>
               <w:rPr>
@@ -2146,13 +2146,13 @@
               <w14:ligatures w14:val="standardContextual"/>
             </w:rPr>
           </w:pPr>
-          <w:hyperlink w:anchor="_Toc220496104" w:history="1">
+          <w:hyperlink w:anchor="_Toc221100893" w:history="1">
             <w:r>
               <w:rPr>
                 <w:rStyle w:val="Hyperlinkki"/>
                 <w:noProof/>
               </w:rPr>
-              <w:t>4.8 Band and Collective Systems</w:t>
+              <w:t>4.9 Band and Collective Systems</w:t>
             </w:r>
             <w:r>
               <w:rPr>
@@ -2173,7 +2173,7 @@
                 <w:noProof/>
                 <w:webHidden/>
               </w:rPr>
-              <w:instrText xml:space="preserve"> PAGEREF _Toc220496104 \h </w:instrText>
+              <w:instrText xml:space="preserve"> PAGEREF _Toc221100893 \h </w:instrText>
             </w:r>
             <w:r>
               <w:rPr>
@@ -2193,7 +2193,7 @@
                 <w:noProof/>
                 <w:webHidden/>
               </w:rPr>
-              <w:t>20</w:t>
+              <w:t>23</w:t>
             </w:r>
             <w:r>
               <w:rPr>
@@ -2220,13 +2220,13 @@
               <w14:ligatures w14:val="standardContextual"/>
             </w:rPr>
           </w:pPr>
-          <w:hyperlink w:anchor="_Toc220496105" w:history="1">
+          <w:hyperlink w:anchor="_Toc221100894" w:history="1">
             <w:r>
               <w:rPr>
                 <w:rStyle w:val="Hyperlinkki"/>
                 <w:noProof/>
               </w:rPr>
-              <w:t>4.9 Multiplayer Mode</w:t>
+              <w:t>4.10 Items and Item Mechanisms</w:t>
             </w:r>
             <w:r>
               <w:rPr>
@@ -2247,7 +2247,7 @@
                 <w:noProof/>
                 <w:webHidden/>
               </w:rPr>
-              <w:instrText xml:space="preserve"> PAGEREF _Toc220496105 \h </w:instrText>
+              <w:instrText xml:space="preserve"> PAGEREF _Toc221100894 \h </w:instrText>
             </w:r>
             <w:r>
               <w:rPr>
@@ -2267,7 +2267,81 @@
                 <w:noProof/>
                 <w:webHidden/>
               </w:rPr>
-              <w:t>20</w:t>
+              <w:t>24</w:t>
+            </w:r>
+            <w:r>
+              <w:rPr>
+                <w:noProof/>
+                <w:webHidden/>
+              </w:rPr>
+              <w:fldChar w:fldCharType="end"/>
+            </w:r>
+          </w:hyperlink>
+        </w:p>
+        <w:p>
+          <w:pPr>
+            <w:pStyle w:val="Sisluet3"/>
+            <w:tabs>
+              <w:tab w:val="right" w:leader="dot" w:pos="9019"/>
+            </w:tabs>
+            <w:rPr>
+              <w:rFonts w:asciiTheme="minorHAnsi" w:eastAsiaTheme="minorEastAsia" w:hAnsiTheme="minorHAnsi" w:cstheme="minorBidi"/>
+              <w:noProof/>
+              <w:kern w:val="2"/>
+              <w:sz w:val="24"/>
+              <w:szCs w:val="24"/>
+              <w:lang w:val="fi-FI"/>
+              <w14:ligatures w14:val="standardContextual"/>
+            </w:rPr>
+          </w:pPr>
+          <w:hyperlink w:anchor="_Toc221100895" w:history="1">
+            <w:r>
+              <w:rPr>
+                <w:rStyle w:val="Hyperlinkki"/>
+                <w:noProof/>
+              </w:rPr>
+              <w:t>4.11 Multiplayer Mode (The only game in town)</w:t>
+            </w:r>
+            <w:r>
+              <w:rPr>
+                <w:noProof/>
+                <w:webHidden/>
+              </w:rPr>
+              <w:tab/>
+            </w:r>
+            <w:r>
+              <w:rPr>
+                <w:noProof/>
+                <w:webHidden/>
+              </w:rPr>
+              <w:fldChar w:fldCharType="begin"/>
+            </w:r>
+            <w:r>
+              <w:rPr>
+                <w:noProof/>
+                <w:webHidden/>
+              </w:rPr>
+              <w:instrText xml:space="preserve"> PAGEREF _Toc221100895 \h </w:instrText>
+            </w:r>
+            <w:r>
+              <w:rPr>
+                <w:noProof/>
+                <w:webHidden/>
+              </w:rPr>
+            </w:r>
+            <w:r>
+              <w:rPr>
+                <w:noProof/>
+                <w:webHidden/>
+              </w:rPr>
+              <w:fldChar w:fldCharType="separate"/>
+            </w:r>
+            <w:r>
+              <w:rPr>
+                <w:noProof/>
+                <w:webHidden/>
+              </w:rPr>
+              <w:t>25</w:t>
             </w:r>
             <w:r>
               <w:rPr>
@@ -2294,7 +2368,7 @@
               <w14:ligatures w14:val="standardContextual"/>
             </w:rPr>
           </w:pPr>
-          <w:hyperlink w:anchor="_Toc220496106" w:history="1">
+          <w:hyperlink w:anchor="_Toc221100896" w:history="1">
             <w:r>
               <w:rPr>
                 <w:rStyle w:val="Hyperlinkki"/>
@@ -2321,7 +2395,7 @@
                 <w:noProof/>
                 <w:webHidden/>
               </w:rPr>
-              <w:instrText xml:space="preserve"> PAGEREF _Toc220496106 \h </w:instrText>
+              <w:instrText xml:space="preserve"> PAGEREF _Toc221100896 \h </w:instrText>
             </w:r>
             <w:r>
               <w:rPr>
@@ -2341,7 +2415,7 @@
                 <w:noProof/>
                 <w:webHidden/>
               </w:rPr>
-              <w:t>21</w:t>
+              <w:t>26</w:t>
             </w:r>
             <w:r>
               <w:rPr>
@@ -2368,7 +2442,7 @@
               <w14:ligatures w14:val="standardContextual"/>
             </w:rPr>
           </w:pPr>
-          <w:hyperlink w:anchor="_Toc220496107" w:history="1">
+          <w:hyperlink w:anchor="_Toc221100897" w:history="1">
             <w:r>
               <w:rPr>
                 <w:rStyle w:val="Hyperlinkki"/>
@@ -2395,7 +2469,7 @@
                 <w:noProof/>
                 <w:webHidden/>
               </w:rPr>
-              <w:instrText xml:space="preserve"> PAGEREF _Toc220496107 \h </w:instrText>
+              <w:instrText xml:space="preserve"> PAGEREF _Toc221100897 \h </w:instrText>
             </w:r>
             <w:r>
               <w:rPr>
@@ -2415,7 +2489,7 @@
                 <w:noProof/>
                 <w:webHidden/>
               </w:rPr>
-              <w:t>22</w:t>
+              <w:t>27</w:t>
             </w:r>
             <w:r>
               <w:rPr>
@@ -2442,7 +2516,7 @@
               <w14:ligatures w14:val="standardContextual"/>
             </w:rPr>
           </w:pPr>
-          <w:hyperlink w:anchor="_Toc220496108" w:history="1">
+          <w:hyperlink w:anchor="_Toc221100898" w:history="1">
             <w:r>
               <w:rPr>
                 <w:rStyle w:val="Hyperlinkki"/>
@@ -2469,7 +2543,7 @@
                 <w:noProof/>
                 <w:webHidden/>
               </w:rPr>
-              <w:instrText xml:space="preserve"> PAGEREF _Toc220496108 \h </w:instrText>
+              <w:instrText xml:space="preserve"> PAGEREF _Toc221100898 \h </w:instrText>
             </w:r>
             <w:r>
               <w:rPr>
@@ -2489,7 +2563,7 @@
                 <w:noProof/>
                 <w:webHidden/>
               </w:rPr>
-              <w:t>23</w:t>
+              <w:t>28</w:t>
             </w:r>
             <w:r>
               <w:rPr>
@@ -2516,7 +2590,7 @@
               <w14:ligatures w14:val="standardContextual"/>
             </w:rPr>
           </w:pPr>
-          <w:hyperlink w:anchor="_Toc220496109" w:history="1">
+          <w:hyperlink w:anchor="_Toc221100899" w:history="1">
             <w:r>
               <w:rPr>
                 <w:rStyle w:val="Hyperlinkki"/>
@@ -2543,7 +2617,7 @@
                 <w:noProof/>
                 <w:webHidden/>
               </w:rPr>
-              <w:instrText xml:space="preserve"> PAGEREF _Toc220496109 \h </w:instrText>
+              <w:instrText xml:space="preserve"> PAGEREF _Toc221100899 \h </w:instrText>
             </w:r>
             <w:r>
               <w:rPr>
@@ -2563,7 +2637,7 @@
                 <w:noProof/>
                 <w:webHidden/>
               </w:rPr>
-              <w:t>23</w:t>
+              <w:t>28</w:t>
             </w:r>
             <w:r>
               <w:rPr>
@@ -2590,7 +2664,7 @@
               <w14:ligatures w14:val="standardContextual"/>
             </w:rPr>
           </w:pPr>
-          <w:hyperlink w:anchor="_Toc220496110" w:history="1">
+          <w:hyperlink w:anchor="_Toc221100900" w:history="1">
             <w:r>
               <w:rPr>
                 <w:rStyle w:val="Hyperlinkki"/>
@@ -2617,7 +2691,7 @@
                 <w:noProof/>
                 <w:webHidden/>
               </w:rPr>
-              <w:instrText xml:space="preserve"> PAGEREF _Toc220496110 \h </w:instrText>
+              <w:instrText xml:space="preserve"> PAGEREF _Toc221100900 \h </w:instrText>
             </w:r>
             <w:r>
               <w:rPr>
@@ -2637,7 +2711,7 @@
                 <w:noProof/>
                 <w:webHidden/>
               </w:rPr>
-              <w:t>23</w:t>
+              <w:t>28</w:t>
             </w:r>
             <w:r>
               <w:rPr>
@@ -2664,7 +2738,7 @@
               <w14:ligatures w14:val="standardContextual"/>
             </w:rPr>
           </w:pPr>
-          <w:hyperlink w:anchor="_Toc220496111" w:history="1">
+          <w:hyperlink w:anchor="_Toc221100901" w:history="1">
             <w:r>
               <w:rPr>
                 <w:rStyle w:val="Hyperlinkki"/>
@@ -2691,7 +2765,7 @@
                 <w:noProof/>
                 <w:webHidden/>
               </w:rPr>
-              <w:instrText xml:space="preserve"> PAGEREF _Toc220496111 \h </w:instrText>
+              <w:instrText xml:space="preserve"> PAGEREF _Toc221100901 \h </w:instrText>
             </w:r>
             <w:r>
               <w:rPr>
@@ -2711,7 +2785,7 @@
                 <w:noProof/>
                 <w:webHidden/>
               </w:rPr>
-              <w:t>23</w:t>
+              <w:t>28</w:t>
             </w:r>
             <w:r>
               <w:rPr>
@@ -2738,7 +2812,7 @@
               <w14:ligatures w14:val="standardContextual"/>
             </w:rPr>
           </w:pPr>
-          <w:hyperlink w:anchor="_Toc220496112" w:history="1">
+          <w:hyperlink w:anchor="_Toc221100902" w:history="1">
             <w:r>
               <w:rPr>
                 <w:rStyle w:val="Hyperlinkki"/>
@@ -2765,7 +2839,7 @@
                 <w:noProof/>
                 <w:webHidden/>
               </w:rPr>
-              <w:instrText xml:space="preserve"> PAGEREF _Toc220496112 \h </w:instrText>
+              <w:instrText xml:space="preserve"> PAGEREF _Toc221100902 \h </w:instrText>
             </w:r>
             <w:r>
               <w:rPr>
@@ -2785,7 +2859,7 @@
                 <w:noProof/>
                 <w:webHidden/>
               </w:rPr>
-              <w:t>24</w:t>
+              <w:t>29</w:t>
             </w:r>
             <w:r>
               <w:rPr>
@@ -2812,7 +2886,7 @@
               <w14:ligatures w14:val="standardContextual"/>
             </w:rPr>
           </w:pPr>
-          <w:hyperlink w:anchor="_Toc220496113" w:history="1">
+          <w:hyperlink w:anchor="_Toc221100903" w:history="1">
             <w:r>
               <w:rPr>
                 <w:rStyle w:val="Hyperlinkki"/>
@@ -2839,7 +2913,7 @@
                 <w:noProof/>
                 <w:webHidden/>
               </w:rPr>
-              <w:instrText xml:space="preserve"> PAGEREF _Toc220496113 \h </w:instrText>
+              <w:instrText xml:space="preserve"> PAGEREF _Toc221100903 \h </w:instrText>
             </w:r>
             <w:r>
               <w:rPr>
@@ -2859,7 +2933,7 @@
                 <w:noProof/>
                 <w:webHidden/>
               </w:rPr>
-              <w:t>24</w:t>
+              <w:t>29</w:t>
             </w:r>
             <w:r>
               <w:rPr>
@@ -2886,7 +2960,7 @@
               <w14:ligatures w14:val="standardContextual"/>
             </w:rPr>
           </w:pPr>
-          <w:hyperlink w:anchor="_Toc220496114" w:history="1">
+          <w:hyperlink w:anchor="_Toc221100904" w:history="1">
             <w:r>
               <w:rPr>
                 <w:rStyle w:val="Hyperlinkki"/>
@@ -2913,7 +2987,7 @@
                 <w:noProof/>
                 <w:webHidden/>
               </w:rPr>
-              <w:instrText xml:space="preserve"> PAGEREF _Toc220496114 \h </w:instrText>
+              <w:instrText xml:space="preserve"> PAGEREF _Toc221100904 \h </w:instrText>
             </w:r>
             <w:r>
               <w:rPr>
@@ -2933,7 +3007,7 @@
                 <w:noProof/>
                 <w:webHidden/>
               </w:rPr>
-              <w:t>24</w:t>
+              <w:t>29</w:t>
             </w:r>
             <w:r>
               <w:rPr>
@@ -2960,7 +3034,7 @@
               <w14:ligatures w14:val="standardContextual"/>
             </w:rPr>
           </w:pPr>
-          <w:hyperlink w:anchor="_Toc220496115" w:history="1">
+          <w:hyperlink w:anchor="_Toc221100905" w:history="1">
             <w:r>
               <w:rPr>
                 <w:rStyle w:val="Hyperlinkki"/>
@@ -2987,7 +3061,7 @@
                 <w:noProof/>
                 <w:webHidden/>
               </w:rPr>
-              <w:instrText xml:space="preserve"> PAGEREF _Toc220496115 \h </w:instrText>
+              <w:instrText xml:space="preserve"> PAGEREF _Toc221100905 \h </w:instrText>
             </w:r>
             <w:r>
               <w:rPr>
@@ -3007,7 +3081,7 @@
                 <w:noProof/>
                 <w:webHidden/>
               </w:rPr>
-              <w:t>24</w:t>
+              <w:t>29</w:t>
             </w:r>
             <w:r>
               <w:rPr>
@@ -3034,7 +3108,7 @@
               <w14:ligatures w14:val="standardContextual"/>
             </w:rPr>
           </w:pPr>
-          <w:hyperlink w:anchor="_Toc220496116" w:history="1">
+          <w:hyperlink w:anchor="_Toc221100906" w:history="1">
             <w:r>
               <w:rPr>
                 <w:rStyle w:val="Hyperlinkki"/>
@@ -3061,7 +3135,7 @@
                 <w:noProof/>
                 <w:webHidden/>
               </w:rPr>
-              <w:instrText xml:space="preserve"> PAGEREF _Toc220496116 \h </w:instrText>
+              <w:instrText xml:space="preserve"> PAGEREF _Toc221100906 \h </w:instrText>
             </w:r>
             <w:r>
               <w:rPr>
@@ -3081,7 +3155,7 @@
                 <w:noProof/>
                 <w:webHidden/>
               </w:rPr>
-              <w:t>25</w:t>
+              <w:t>30</w:t>
             </w:r>
             <w:r>
               <w:rPr>
@@ -3108,7 +3182,7 @@
               <w14:ligatures w14:val="standardContextual"/>
             </w:rPr>
           </w:pPr>
-          <w:hyperlink w:anchor="_Toc220496117" w:history="1">
+          <w:hyperlink w:anchor="_Toc221100907" w:history="1">
             <w:r>
               <w:rPr>
                 <w:rStyle w:val="Hyperlinkki"/>
@@ -3135,7 +3209,7 @@
                 <w:noProof/>
                 <w:webHidden/>
               </w:rPr>
-              <w:instrText xml:space="preserve"> PAGEREF _Toc220496117 \h </w:instrText>
+              <w:instrText xml:space="preserve"> PAGEREF _Toc221100907 \h </w:instrText>
             </w:r>
             <w:r>
               <w:rPr>
@@ -3155,7 +3229,7 @@
                 <w:noProof/>
                 <w:webHidden/>
               </w:rPr>
-              <w:t>25</w:t>
+              <w:t>30</w:t>
             </w:r>
             <w:r>
               <w:rPr>
@@ -3182,7 +3256,7 @@
               <w14:ligatures w14:val="standardContextual"/>
             </w:rPr>
           </w:pPr>
-          <w:hyperlink w:anchor="_Toc220496118" w:history="1">
+          <w:hyperlink w:anchor="_Toc221100908" w:history="1">
             <w:r>
               <w:rPr>
                 <w:rStyle w:val="Hyperlinkki"/>
@@ -3209,7 +3283,7 @@
                 <w:noProof/>
                 <w:webHidden/>
               </w:rPr>
-              <w:instrText xml:space="preserve"> PAGEREF _Toc220496118 \h </w:instrText>
+              <w:instrText xml:space="preserve"> PAGEREF _Toc221100908 \h </w:instrText>
             </w:r>
             <w:r>
               <w:rPr>
@@ -3229,7 +3303,7 @@
                 <w:noProof/>
                 <w:webHidden/>
               </w:rPr>
-              <w:t>25</w:t>
+              <w:t>30</w:t>
             </w:r>
             <w:r>
               <w:rPr>
@@ -3256,7 +3330,7 @@
               <w14:ligatures w14:val="standardContextual"/>
             </w:rPr>
           </w:pPr>
-          <w:hyperlink w:anchor="_Toc220496119" w:history="1">
+          <w:hyperlink w:anchor="_Toc221100909" w:history="1">
             <w:r>
               <w:rPr>
                 <w:rStyle w:val="Hyperlinkki"/>
@@ -3283,7 +3357,7 @@
                 <w:noProof/>
                 <w:webHidden/>
               </w:rPr>
-              <w:instrText xml:space="preserve"> PAGEREF _Toc220496119 \h </w:instrText>
+              <w:instrText xml:space="preserve"> PAGEREF _Toc221100909 \h </w:instrText>
             </w:r>
             <w:r>
               <w:rPr>
@@ -3303,7 +3377,7 @@
                 <w:noProof/>
                 <w:webHidden/>
               </w:rPr>
-              <w:t>26</w:t>
+              <w:t>31</w:t>
             </w:r>
             <w:r>
               <w:rPr>
@@ -3330,7 +3404,7 @@
               <w14:ligatures w14:val="standardContextual"/>
             </w:rPr>
           </w:pPr>
-          <w:hyperlink w:anchor="_Toc220496120" w:history="1">
+          <w:hyperlink w:anchor="_Toc221100910" w:history="1">
             <w:r>
               <w:rPr>
                 <w:rStyle w:val="Hyperlinkki"/>
@@ -3357,7 +3431,7 @@
                 <w:noProof/>
                 <w:webHidden/>
               </w:rPr>
-              <w:instrText xml:space="preserve"> PAGEREF _Toc220496120 \h </w:instrText>
+              <w:instrText xml:space="preserve"> PAGEREF _Toc221100910 \h </w:instrText>
             </w:r>
             <w:r>
               <w:rPr>
@@ -3377,7 +3451,7 @@
                 <w:noProof/>
                 <w:webHidden/>
               </w:rPr>
-              <w:t>27</w:t>
+              <w:t>32</w:t>
             </w:r>
             <w:r>
               <w:rPr>
@@ -3417,7 +3491,7 @@
         <w:pStyle w:val="Otsikko2"/>
         <w:spacing w:before="0" w:line="240" w:lineRule="auto"/>
       </w:pPr>
-      <w:bookmarkStart w:id="0" w:name="_Toc220496092"/>
+      <w:bookmarkStart w:id="0" w:name="_Toc221100881"/>
       <w:r>
         <w:lastRenderedPageBreak/>
         <w:t>1. Executive Summary, Quick overview</w:t>
@@ -3832,7 +3906,7 @@
         <w:pStyle w:val="Otsikko2"/>
         <w:spacing w:before="0" w:line="240" w:lineRule="auto"/>
       </w:pPr>
-      <w:bookmarkStart w:id="2" w:name="_Toc220496093"/>
+      <w:bookmarkStart w:id="2" w:name="_Toc221100882"/>
       <w:r>
         <w:lastRenderedPageBreak/>
         <w:t>2. Target Audience</w:t>
@@ -3942,42 +4016,110 @@
     </w:p>
     <w:p>
       <w:pPr>
+        <w:rPr>
+          <w:sz w:val="32"/>
+          <w:szCs w:val="32"/>
+        </w:rPr>
+      </w:pPr>
+      <w:r>
+        <w:br w:type="page"/>
+      </w:r>
+    </w:p>
+    <w:p>
+      <w:pPr>
         <w:pStyle w:val="Otsikko2"/>
         <w:spacing w:before="0" w:line="240" w:lineRule="auto"/>
       </w:pPr>
-      <w:bookmarkStart w:id="3" w:name="_Toc220496094"/>
+      <w:bookmarkStart w:id="3" w:name="_Toc221100883"/>
       <w:r>
         <w:lastRenderedPageBreak/>
         <w:t>3. Main Characters</w:t>
       </w:r>
       <w:bookmarkEnd w:id="3"/>
     </w:p>
-    <w:p>
+    <w:p/>
+    <w:p>
+      <w:pPr>
+        <w:rPr>
+          <w:b/>
+          <w:bCs/>
+        </w:rPr>
+      </w:pPr>
+      <w:r>
+        <w:rPr>
+          <w:b/>
+          <w:bCs/>
+        </w:rPr>
+        <w:t>N</w:t>
+      </w:r>
+      <w:r>
+        <w:rPr>
+          <w:b/>
+          <w:bCs/>
+        </w:rPr>
+        <w:t xml:space="preserve">ullsvorn </w:t>
+      </w:r>
+      <w:r>
+        <w:rPr>
+          <w:b/>
+          <w:bCs/>
+        </w:rPr>
+        <w:t>from</w:t>
+      </w:r>
+      <w:r>
+        <w:rPr>
+          <w:b/>
+          <w:bCs/>
+        </w:rPr>
+        <w:t xml:space="preserve"> the band “Not_Saved</w:t>
+      </w:r>
+      <w:r>
+        <w:rPr>
+          <w:b/>
+          <w:bCs/>
+        </w:rPr>
+        <w:t>.SNO</w:t>
+      </w:r>
+      <w:r>
+        <w:rPr>
+          <w:b/>
+          <w:bCs/>
+        </w:rPr>
+        <w:t>” - the default player character.</w:t>
+      </w:r>
+    </w:p>
+    <w:p>
+      <w:pPr>
+        <w:rPr>
+          <w:b/>
+          <w:bCs/>
+        </w:rPr>
+      </w:pPr>
       <w:r>
         <w:rPr>
           <w:noProof/>
         </w:rPr>
         <w:drawing>
-          <wp:anchor distT="0" distB="0" distL="114300" distR="114300" simplePos="0" relativeHeight="251658240" behindDoc="1" locked="0" layoutInCell="1" allowOverlap="1" wp14:anchorId="18C22E67" wp14:editId="79B8D5EA">
+          <wp:anchor distT="0" distB="0" distL="114300" distR="114300" simplePos="0" relativeHeight="251658240" behindDoc="1" locked="0" layoutInCell="1" allowOverlap="1" wp14:anchorId="18C22E67" wp14:editId="19736E90">
             <wp:simplePos x="0" y="0"/>
             <wp:positionH relativeFrom="margin">
-              <wp:align>left</wp:align>
+              <wp:posOffset>-130175</wp:posOffset>
             </wp:positionH>
             <wp:positionV relativeFrom="paragraph">
-              <wp:posOffset>185420</wp:posOffset>
+              <wp:posOffset>193675</wp:posOffset>
             </wp:positionV>
-            <wp:extent cx="2330450" cy="4143375"/>
-            <wp:effectExtent l="0" t="0" r="0" b="9525"/>
+            <wp:extent cx="2330450" cy="4142740"/>
+            <wp:effectExtent l="0" t="0" r="0" b="0"/>
             <wp:wrapTight wrapText="bothSides">
               <wp:wrapPolygon edited="0">
                 <wp:start x="0" y="0"/>
-                <wp:lineTo x="0" y="21550"/>
-                <wp:lineTo x="21365" y="21550"/>
+                <wp:lineTo x="0" y="21454"/>
+                <wp:lineTo x="21365" y="21454"/>
                 <wp:lineTo x="21365" y="0"/>
                 <wp:lineTo x="0" y="0"/>
               </wp:wrapPolygon>
             </wp:wrapTight>
-            <wp:docPr id="1419361742" name="Kuva 1" descr="Kuva, joka sisältää kohteen piirros, luonnos, taide, kuvitus&#10;&#10;Tekoälyllä luotu sisältö voi olla virheellistä."/>
+            <wp:docPr id="1419361742" name="Kuva 1"/>
             <wp:cNvGraphicFramePr>
               <a:graphicFrameLocks xmlns:a="http://schemas.openxmlformats.org/drawingml/2006/main" noChangeAspect="1"/>
             </wp:cNvGraphicFramePr>
@@ -3985,7 +4127,7 @@
               <a:graphicData uri="http://schemas.openxmlformats.org/drawingml/2006/picture">
                 <pic:pic xmlns:pic="http://schemas.openxmlformats.org/drawingml/2006/picture">
                   <pic:nvPicPr>
-                    <pic:cNvPr id="1419361742" name="Kuva 1" descr="Kuva, joka sisältää kohteen piirros, luonnos, taide, kuvitus&#10;&#10;Tekoälyllä luotu sisältö voi olla virheellistä."/>
+                    <pic:cNvPr id="1419361742" name="Kuva 1"/>
                     <pic:cNvPicPr/>
                   </pic:nvPicPr>
                   <pic:blipFill>
@@ -4003,7 +4145,7 @@
                   <pic:spPr>
                     <a:xfrm>
                       <a:off x="0" y="0"/>
-                      <a:ext cx="2330450" cy="4143375"/>
+                      <a:ext cx="2330450" cy="4142740"/>
                     </a:xfrm>
                     <a:prstGeom prst="rect">
                       <a:avLst/>
@@ -4021,64 +4163,6 @@
           </wp:anchor>
         </w:drawing>
       </w:r>
-    </w:p>
-    <w:p>
-      <w:pPr>
-        <w:rPr>
-          <w:b/>
-          <w:bCs/>
-        </w:rPr>
-      </w:pPr>
-      <w:r>
-        <w:rPr>
-          <w:b/>
-          <w:bCs/>
-        </w:rPr>
-        <w:t>N</w:t>
-      </w:r>
-      <w:r>
-        <w:rPr>
-          <w:b/>
-          <w:bCs/>
-        </w:rPr>
-        <w:t xml:space="preserve">ullsvorn </w:t>
-      </w:r>
-      <w:r>
-        <w:rPr>
-          <w:b/>
-          <w:bCs/>
-        </w:rPr>
-        <w:t>from</w:t>
-      </w:r>
-      <w:r>
-        <w:rPr>
-          <w:b/>
-          <w:bCs/>
-        </w:rPr>
-        <w:t xml:space="preserve"> the band “Not_Saved</w:t>
-      </w:r>
-      <w:r>
-        <w:rPr>
-          <w:b/>
-          <w:bCs/>
-        </w:rPr>
-        <w:t>.SNO</w:t>
-      </w:r>
-      <w:r>
-        <w:rPr>
-          <w:b/>
-          <w:bCs/>
-        </w:rPr>
-        <w:t>” - the default player character.</w:t>
-      </w:r>
-    </w:p>
-    <w:p>
-      <w:pPr>
-        <w:rPr>
-          <w:b/>
-          <w:bCs/>
-        </w:rPr>
-      </w:pPr>
     </w:p>
     <w:p>
       <w:pPr>
@@ -4381,6 +4465,7 @@
           <w:b/>
           <w:bCs/>
         </w:rPr>
+        <w:lastRenderedPageBreak/>
         <w:t>Nullsvorn</w:t>
       </w:r>
       <w:r>
@@ -4396,11 +4481,7 @@
         <w:t xml:space="preserve">) </w:t>
       </w:r>
       <w:r>
-        <w:t xml:space="preserve">has their hands full with executive decisions such as how much of an effort the band in general puts to </w:t>
-      </w:r>
-      <w:r>
-        <w:lastRenderedPageBreak/>
-        <w:t>gestating (</w:t>
+        <w:t>has their hands full with executive decisions such as how much of an effort the band in general puts to gestating (</w:t>
       </w:r>
       <w:r>
         <w:t>producing</w:t>
@@ -4772,7 +4853,7 @@
         <w:pStyle w:val="Otsikko2"/>
         <w:spacing w:before="0" w:line="240" w:lineRule="auto"/>
       </w:pPr>
-      <w:bookmarkStart w:id="4" w:name="_Toc220496095"/>
+      <w:bookmarkStart w:id="4" w:name="_Toc221100884"/>
       <w:r>
         <w:lastRenderedPageBreak/>
         <w:t>4. Main Features</w:t>
@@ -4799,7 +4880,7 @@
         <w:pStyle w:val="Otsikko3"/>
         <w:spacing w:before="0" w:line="240" w:lineRule="auto"/>
       </w:pPr>
-      <w:bookmarkStart w:id="5" w:name="_Toc220496096"/>
+      <w:bookmarkStart w:id="5" w:name="_Toc221100885"/>
       <w:r>
         <w:t>4.</w:t>
       </w:r>
@@ -4815,6 +4896,57 @@
       <w:bookmarkEnd w:id="5"/>
     </w:p>
     <w:p/>
+    <w:p>
+      <w:pPr>
+        <w:pStyle w:val="Normaali2"/>
+      </w:pPr>
+      <w:r>
+        <w:rPr>
+          <w:noProof/>
+        </w:rPr>
+        <w:drawing>
+          <wp:inline distT="0" distB="0" distL="0" distR="0" wp14:anchorId="39380C80" wp14:editId="24949E18">
+            <wp:extent cx="5733415" cy="1573530"/>
+            <wp:effectExtent l="0" t="0" r="635" b="7620"/>
+            <wp:docPr id="1129622680" name="Kuva 1" descr="Kuva, joka sisältää kohteen diagrammi, viiva, Suunnitelma, kuvakaappaus&#10;&#10;Tekoälyllä luotu sisältö voi olla virheellistä."/>
+            <wp:cNvGraphicFramePr>
+              <a:graphicFrameLocks xmlns:a="http://schemas.openxmlformats.org/drawingml/2006/main" noChangeAspect="1"/>
+            </wp:cNvGraphicFramePr>
+            <a:graphic xmlns:a="http://schemas.openxmlformats.org/drawingml/2006/main">
+              <a:graphicData uri="http://schemas.openxmlformats.org/drawingml/2006/picture">
+                <pic:pic xmlns:pic="http://schemas.openxmlformats.org/drawingml/2006/picture">
+                  <pic:nvPicPr>
+                    <pic:cNvPr id="1129622680" name="Kuva 1" descr="Kuva, joka sisältää kohteen diagrammi, viiva, Suunnitelma, kuvakaappaus&#10;&#10;Tekoälyllä luotu sisältö voi olla virheellistä."/>
+                    <pic:cNvPicPr/>
+                  </pic:nvPicPr>
+                  <pic:blipFill>
+                    <a:blip r:embed="rId9">
+                      <a:extLst>
+                        <a:ext uri="{28A0092B-C50C-407E-A947-70E740481C1C}">
+                          <a14:useLocalDpi xmlns:a14="http://schemas.microsoft.com/office/drawing/2010/main" val="0"/>
+                        </a:ext>
+                      </a:extLst>
+                    </a:blip>
+                    <a:stretch>
+                      <a:fillRect/>
+                    </a:stretch>
+                  </pic:blipFill>
+                  <pic:spPr>
+                    <a:xfrm>
+                      <a:off x="0" y="0"/>
+                      <a:ext cx="5733415" cy="1573530"/>
+                    </a:xfrm>
+                    <a:prstGeom prst="rect">
+                      <a:avLst/>
+                    </a:prstGeom>
+                  </pic:spPr>
+                </pic:pic>
+              </a:graphicData>
+            </a:graphic>
+          </wp:inline>
+        </w:drawing>
+      </w:r>
+    </w:p>
     <w:p>
       <w:pPr>
         <w:pStyle w:val="Normaali2"/>
@@ -5042,6 +5174,7 @@
         <w:ind w:left="720"/>
       </w:pPr>
       <w:r>
+        <w:lastRenderedPageBreak/>
         <w:t xml:space="preserve">Besides the world map, also </w:t>
       </w:r>
       <w:r>
@@ -5071,6 +5204,9 @@
       </w:r>
       <w:r>
         <w:t>thematic scene map, so hovering mouse over a certain TRUE TAG (see 4.5 and 4.6) causes a loop to be play</w:t>
+      </w:r>
+      <w:r>
+        <w:t>ed</w:t>
       </w:r>
       <w:r>
         <w:t>.</w:t>
@@ -5285,6 +5421,7 @@
         <w:t xml:space="preserve">available </w:t>
       </w:r>
       <w:r>
+        <w:lastRenderedPageBreak/>
         <w:t>tags and arrange them into tracks that first exist as ideas. In the rehearsal space, there is a 4-track recorder, which can be opened and used to create a record of the idea (process described at 4.7).</w:t>
       </w:r>
       <w:r>
@@ -5294,20 +5431,7 @@
         <w:t xml:space="preserve"> </w:t>
       </w:r>
       <w:r>
-        <w:t xml:space="preserve">When a VHS tape is chosen during </w:t>
-      </w:r>
-      <w:r>
-        <w:t>rehearsal</w:t>
-      </w:r>
-      <w:r>
-        <w:t xml:space="preserve"> actions, the UI tells if it’s declared finished or not </w:t>
-      </w:r>
-      <w:r>
-        <w:lastRenderedPageBreak/>
-        <w:t>by showing a mess of hewed notes and beer bottles on a table vs. a clean table for a composed work.</w:t>
-      </w:r>
-      <w:r>
-        <w:t xml:space="preserve"> </w:t>
+        <w:t xml:space="preserve">When a VHS tape is chosen during rehearsal actions, the UI tells if it’s declared finished or not by showing a mess of hewed notes and beer bottles on a table vs. a clean table for a composed work. </w:t>
       </w:r>
     </w:p>
     <w:p>
@@ -5461,7 +5585,7 @@
         <w:pStyle w:val="Otsikko3"/>
         <w:spacing w:before="0" w:line="240" w:lineRule="auto"/>
       </w:pPr>
-      <w:bookmarkStart w:id="6" w:name="_Toc220496097"/>
+      <w:bookmarkStart w:id="6" w:name="_Toc221100886"/>
       <w:r>
         <w:t>4.2 Core Gameplay Loop</w:t>
       </w:r>
@@ -5500,121 +5624,167 @@
         <w:pStyle w:val="Normaali2"/>
       </w:pPr>
       <w:r>
-        <w:t xml:space="preserve">During each season, every collective (such as the player’s band) chooses one collective action, and this action determines which character actions its members are </w:t>
+        <w:t>During each season, every collective (such as the player’s band) chooses one collective action, and this action determines which character actions its members are allowed to perform. A band that is rehearsing can only perform rehearsal-related actions; a band that is gestating can only perform gestation-related actions, and so on.</w:t>
+      </w:r>
+    </w:p>
+    <w:p>
+      <w:pPr>
+        <w:pStyle w:val="Normaali2"/>
+      </w:pPr>
+    </w:p>
+    <w:p>
+      <w:pPr>
+        <w:pStyle w:val="Normaali2"/>
+      </w:pPr>
+      <w:r>
+        <w:t>During their character actions, controllers and actors generate ideas through their aspects, acquire transient tags from the world through interactions, and combine their existing tags into materials that can later be used in the recording process.</w:t>
+      </w:r>
+      <w:r>
+        <w:t xml:space="preserve"> </w:t>
+      </w:r>
+      <w:r>
+        <w:t>Transient tags must be used quickly or they expire, and they are required for the creation of tag-pairs, which are necessary for producing tracks that are perceived as TRUE.</w:t>
+      </w:r>
+      <w:r>
+        <w:t xml:space="preserve"> Besides producing tracks, the band is expected to promote their art by playing shows at underground venues. Without visibility, they are at the mercy of the Keeper.</w:t>
+      </w:r>
+    </w:p>
+    <w:p>
+      <w:pPr>
+        <w:pStyle w:val="Normaali2"/>
+      </w:pPr>
+    </w:p>
+    <w:p>
+      <w:pPr>
+        <w:pStyle w:val="Normaali2"/>
+      </w:pPr>
+      <w:r>
+        <w:t xml:space="preserve">At the end of every season, the results of these actions update the band’s creative progress, ideological profile, and influence </w:t>
+      </w:r>
+      <w:r>
+        <w:t>over</w:t>
+      </w:r>
+      <w:r>
+        <w:t xml:space="preserve"> the scene.</w:t>
+      </w:r>
+      <w:r>
+        <w:t xml:space="preserve"> The culmination of their efforts </w:t>
+      </w:r>
+      <w:r>
+        <w:t>materializes</w:t>
+      </w:r>
+      <w:r>
+        <w:t xml:space="preserve"> as demo tapes, which are shown as entities floating around a </w:t>
+      </w:r>
+      <w:proofErr w:type="gramStart"/>
+      <w:r>
+        <w:t>3 dimensional</w:t>
+      </w:r>
+      <w:proofErr w:type="gramEnd"/>
+      <w:r>
+        <w:t xml:space="preserve"> </w:t>
+      </w:r>
+      <w:r>
+        <w:t>ideological map, called The Scene Map.</w:t>
+      </w:r>
+      <w:r>
+        <w:t xml:space="preserve"> After every four seasons (one year), overall progress is evaluated, and the</w:t>
+      </w:r>
+      <w:r>
+        <w:t xml:space="preserve"> next year’s</w:t>
+      </w:r>
+      <w:r>
+        <w:t xml:space="preserve"> Keeper is determined. The Keeper cannot produce new material but instead influences others from the position of authority</w:t>
+      </w:r>
+      <w:r>
+        <w:t>, by allowing access to cheaper and specialised services</w:t>
+      </w:r>
+      <w:r>
+        <w:t>.</w:t>
+      </w:r>
+      <w:r>
+        <w:t xml:space="preserve"> The Keeper’s goal is to nurture their</w:t>
+      </w:r>
+      <w:r>
+        <w:t xml:space="preserve"> personal</w:t>
+      </w:r>
+      <w:r>
+        <w:t xml:space="preserve"> legacy by </w:t>
+      </w:r>
+      <w:r>
+        <w:t>lifting</w:t>
+      </w:r>
+      <w:r>
+        <w:t xml:space="preserve"> </w:t>
+      </w:r>
+      <w:r>
+        <w:t xml:space="preserve">bands that are following </w:t>
+      </w:r>
+      <w:r>
+        <w:t>the Keeper’s sound</w:t>
+      </w:r>
+      <w:r>
+        <w:t xml:space="preserve">, instead of bands that are doing their own thing. </w:t>
+      </w:r>
+    </w:p>
+    <w:p>
+      <w:pPr>
+        <w:pStyle w:val="Normaali2"/>
+      </w:pPr>
+    </w:p>
+    <w:p>
+      <w:pPr>
+        <w:pStyle w:val="Normaali2"/>
+      </w:pPr>
+      <w:r>
+        <w:t>A band that gets on the wrong side of the Keeper must efficiently exist in the minds of the rest of the scene as the most radical and true cult example of it, up to a point in which the Keepers manoeuvring against them fails. This is accomplished by getting funded by sheer success and siphoning street credibility from the elites.</w:t>
+      </w:r>
+    </w:p>
+    <w:p>
+      <w:pPr>
+        <w:pStyle w:val="Normaali2"/>
+      </w:pPr>
+    </w:p>
+    <w:p>
+      <w:pPr>
+        <w:pStyle w:val="Normaali2"/>
+      </w:pPr>
+      <w:r>
+        <w:t xml:space="preserve">The loop repeats </w:t>
+      </w:r>
+      <w:r>
+        <w:t xml:space="preserve">indefinitely, until an end-game </w:t>
+      </w:r>
+      <w:r>
+        <w:t>event</w:t>
+      </w:r>
+      <w:r>
+        <w:t xml:space="preserve"> terminates the scene. An end-game action can be an outside force halting the scene’s free action (because of too </w:t>
       </w:r>
       <w:r>
         <w:lastRenderedPageBreak/>
-        <w:t>allowed to perform. A band that is rehearsing can only perform rehearsal-related actions; a band that is gestating can only perform gestation-related actions, and so on.</w:t>
-      </w:r>
-    </w:p>
-    <w:p>
-      <w:pPr>
-        <w:pStyle w:val="Normaali2"/>
-      </w:pPr>
-    </w:p>
-    <w:p>
-      <w:pPr>
-        <w:pStyle w:val="Normaali2"/>
-      </w:pPr>
-      <w:r>
-        <w:t>During their character actions, controllers and actors generate ideas through their aspects, acquire transient tags from the world through interactions, and combine their existing tags into materials that can later be used in the recording process.</w:t>
-      </w:r>
-      <w:r>
-        <w:t xml:space="preserve"> </w:t>
-      </w:r>
-      <w:r>
-        <w:t>Transient tags must be used quickly or they expire, and they are required for the creation of tag-pairs, which are necessary for producing tracks that are perceived as TRUE.</w:t>
-      </w:r>
-      <w:r>
-        <w:t xml:space="preserve"> Besides producing tracks, the band is expected to promote their art by playing shows at underground venues. Without visibility, they are at the mercy of the Keeper.</w:t>
-      </w:r>
-    </w:p>
-    <w:p>
-      <w:pPr>
-        <w:pStyle w:val="Normaali2"/>
-      </w:pPr>
-    </w:p>
-    <w:p>
-      <w:pPr>
-        <w:pStyle w:val="Normaali2"/>
-      </w:pPr>
-      <w:r>
-        <w:t xml:space="preserve">At the end of every season, the results of these actions update the band’s creative progress, ideological profile, and influence </w:t>
-      </w:r>
-      <w:r>
-        <w:t>over</w:t>
-      </w:r>
-      <w:r>
-        <w:t xml:space="preserve"> the scene. After every four seasons (one year), overall progress is evaluated, and the Keeper is determined. The Keeper cannot produce new material but instead influences others from the position of authority</w:t>
-      </w:r>
-      <w:r>
-        <w:t>, by allowing access to cheaper and specialised services</w:t>
+        <w:t>much notoriety), or the concept of true getting somehow lost in the process.</w:t>
+      </w:r>
+      <w:r>
+        <w:t xml:space="preserve"> The elites can also determine </w:t>
+      </w:r>
+      <w:r>
+        <w:t>all</w:t>
+      </w:r>
+      <w:r>
+        <w:t xml:space="preserve"> the scene’s actors as posers and </w:t>
+      </w:r>
+      <w:r>
+        <w:t>declare the scene dead</w:t>
       </w:r>
       <w:r>
         <w:t>.</w:t>
       </w:r>
-      <w:r>
-        <w:t xml:space="preserve"> The Keeper’s goal is to nurture their</w:t>
-      </w:r>
-      <w:r>
-        <w:t xml:space="preserve"> personal</w:t>
-      </w:r>
-      <w:r>
-        <w:t xml:space="preserve"> legacy by </w:t>
-      </w:r>
-      <w:r>
-        <w:t>lifting</w:t>
-      </w:r>
-      <w:r>
-        <w:t xml:space="preserve"> </w:t>
-      </w:r>
-      <w:r>
-        <w:t xml:space="preserve">bands that are following </w:t>
-      </w:r>
-      <w:r>
-        <w:t>the Keeper’s sound</w:t>
-      </w:r>
-      <w:r>
-        <w:t xml:space="preserve">, instead of bands that are doing their own thing. </w:t>
-      </w:r>
-    </w:p>
-    <w:p>
-      <w:pPr>
-        <w:pStyle w:val="Normaali2"/>
-      </w:pPr>
-    </w:p>
-    <w:p>
-      <w:pPr>
-        <w:pStyle w:val="Normaali2"/>
-      </w:pPr>
-      <w:r>
-        <w:t>A band that gets on the wrong side of the Keeper must efficiently exist in the minds of the rest of the scene as the most radical and true cult example of it, up to a point in which the Keepers manoeuvring against them fails. This is accomplished by getting funded by sheer success and siphoning street credibility from the elites.</w:t>
-      </w:r>
-    </w:p>
-    <w:p>
-      <w:pPr>
-        <w:pStyle w:val="Normaali2"/>
-      </w:pPr>
-    </w:p>
-    <w:p>
-      <w:pPr>
-        <w:pStyle w:val="Normaali2"/>
-      </w:pPr>
-      <w:r>
-        <w:t xml:space="preserve">The loop repeats </w:t>
-      </w:r>
-      <w:r>
-        <w:t>indefinitely, until an end-game action terminates the scene. An end-game action can be an outside force halting the scene’s free action (because of too much notoriety), or the concept of true getting somehow lost in the process.</w:t>
-      </w:r>
-      <w:r>
-        <w:t xml:space="preserve"> The elites can also determine </w:t>
-      </w:r>
-      <w:r>
-        <w:t>all</w:t>
-      </w:r>
-      <w:r>
-        <w:t xml:space="preserve"> the scene’s actors as posers and move to follow other artists.</w:t>
-      </w:r>
+    </w:p>
+    <w:p>
+      <w:pPr>
+        <w:pStyle w:val="Normaali2"/>
+      </w:pPr>
     </w:p>
     <w:p/>
     <w:p/>
@@ -5626,7 +5796,7 @@
       <w:r>
         <w:t xml:space="preserve">  </w:t>
       </w:r>
-      <w:bookmarkStart w:id="7" w:name="_Toc220496098"/>
+      <w:bookmarkStart w:id="7" w:name="_Toc221100887"/>
       <w:r>
         <w:t>4.</w:t>
       </w:r>
@@ -5673,11 +5843,7 @@
         <w:t>Collectives</w:t>
       </w:r>
       <w:r>
-        <w:t xml:space="preserve"> are usually bands (such as Not_saved), but any game entity that operates via agents could be </w:t>
-      </w:r>
-      <w:r>
-        <w:lastRenderedPageBreak/>
-        <w:t xml:space="preserve">depicted as a collective if such a scale is necessary. </w:t>
+        <w:t xml:space="preserve"> are usually bands (such as Not_saved), but any game entity that operates via agents could be depicted as a collective if such a scale is necessary. </w:t>
       </w:r>
       <w:r>
         <w:rPr>
@@ -5831,6 +5997,7 @@
         <w:pStyle w:val="Normaali2"/>
       </w:pPr>
       <w:r>
+        <w:lastRenderedPageBreak/>
         <w:t xml:space="preserve">The distinction between collectives and game entities </w:t>
       </w:r>
       <w:r>
@@ -5876,88 +6043,88 @@
         <w:t xml:space="preserve">“tired” status, which can be rested away with one skip character action </w:t>
       </w:r>
       <w:r>
+        <w:t>per</w:t>
+      </w:r>
+      <w:r>
+        <w:t xml:space="preserve"> character. </w:t>
+      </w:r>
+      <w:r>
+        <w:t xml:space="preserve">A character who is considered “tired”, cannot take a third action. </w:t>
+      </w:r>
+      <w:r>
+        <w:t xml:space="preserve">Each type of action has its own special cost for the </w:t>
+      </w:r>
+      <w:r>
+        <w:t>tiredness status</w:t>
+      </w:r>
+      <w:r>
+        <w:t>, called strain penalty</w:t>
+      </w:r>
+      <w:r>
+        <w:t>, which is active in play alongside the tired status</w:t>
+      </w:r>
+      <w:r>
+        <w:t>.</w:t>
+      </w:r>
+      <w:r>
+        <w:t xml:space="preserve"> When the tired status is cured, so is the penalty.</w:t>
+      </w:r>
+      <w:r>
+        <w:t xml:space="preserve"> The strain penalty can only influence game play once per season. When the strain penalty is about to influence play, the character can opt out by taking a rest action.</w:t>
+      </w:r>
+      <w:r>
+        <w:t xml:space="preserve"> Keepers handle their Keeper strain penalty automatically, but their actions can keep them in the tired state indefinitely.</w:t>
+      </w:r>
+    </w:p>
+    <w:p>
+      <w:pPr>
+        <w:pStyle w:val="Normaali2"/>
+      </w:pPr>
+    </w:p>
+    <w:p>
+      <w:pPr>
+        <w:pStyle w:val="Normaali2"/>
+      </w:pPr>
+      <w:r>
+        <w:t>All character actions are declared asynchronously without players knowing about each other’s actions. The actions are resolved at the end of the turn, and in cases of shared targets between players, these actions are considered taken together. The current Keeper will interact with some character actions at the end of each turn</w:t>
+      </w:r>
+      <w:r>
+        <w:t>, siding with them or against them.</w:t>
+      </w:r>
+    </w:p>
+    <w:p>
+      <w:pPr>
+        <w:pStyle w:val="Normaali2"/>
+      </w:pPr>
+    </w:p>
+    <w:p>
+      <w:pPr>
+        <w:pStyle w:val="Normaali2"/>
+      </w:pPr>
+      <w:r>
+        <w:t xml:space="preserve">As a point of clarification: If a character makes three actions in a season, regardless of their outcome, they will begin their next season tired. This tiredness then </w:t>
+      </w:r>
+      <w:r>
+        <w:t xml:space="preserve">sets them up for a strain penalty in </w:t>
+      </w:r>
+      <w:r>
+        <w:t>whatever</w:t>
+      </w:r>
+      <w:r>
+        <w:t xml:space="preserve"> collective action they have chosen. The only exception to this rule is if they get to be the next Keeper. Keeper doesn’t inherit tiredness from non-keeper actions. Likewise, the player who overplayed as keeper and then lost the position, won’t start their next season as a regular player tired.</w:t>
+      </w:r>
+    </w:p>
+    <w:p>
+      <w:pPr>
+        <w:pStyle w:val="Normaali2"/>
+      </w:pPr>
+    </w:p>
+    <w:p>
+      <w:pPr>
+        <w:pStyle w:val="Otsikko4"/>
+      </w:pPr>
+      <w:r>
         <w:lastRenderedPageBreak/>
-        <w:t>per</w:t>
-      </w:r>
-      <w:r>
-        <w:t xml:space="preserve"> character. </w:t>
-      </w:r>
-      <w:r>
-        <w:t xml:space="preserve">A character who is considered “tired”, cannot take a third action. </w:t>
-      </w:r>
-      <w:r>
-        <w:t xml:space="preserve">Each type of action has its own special cost for the </w:t>
-      </w:r>
-      <w:r>
-        <w:t>tiredness status</w:t>
-      </w:r>
-      <w:r>
-        <w:t>, called strain penalty</w:t>
-      </w:r>
-      <w:r>
-        <w:t>, which is active in play alongside the tired status</w:t>
-      </w:r>
-      <w:r>
-        <w:t>.</w:t>
-      </w:r>
-      <w:r>
-        <w:t xml:space="preserve"> When the tired status is cured, so is the penalty.</w:t>
-      </w:r>
-      <w:r>
-        <w:t xml:space="preserve"> The strain penalty can only influence game play once per season. When the strain penalty is about to influence play, the character can opt out by taking a rest action.</w:t>
-      </w:r>
-      <w:r>
-        <w:t xml:space="preserve"> Keepers handle their Keeper strain penalty automatically, but their actions can keep them in the tired state indefinitely.</w:t>
-      </w:r>
-    </w:p>
-    <w:p>
-      <w:pPr>
-        <w:pStyle w:val="Normaali2"/>
-      </w:pPr>
-    </w:p>
-    <w:p>
-      <w:pPr>
-        <w:pStyle w:val="Normaali2"/>
-      </w:pPr>
-      <w:r>
-        <w:t>All character actions are declared asynchronously without players knowing about each other’s actions. The actions are resolved at the end of the turn, and in cases of shared targets between players, these actions are considered taken together. The current Keeper will interact with some character actions at the end of each turn</w:t>
-      </w:r>
-      <w:r>
-        <w:t>, siding with them or against them.</w:t>
-      </w:r>
-    </w:p>
-    <w:p>
-      <w:pPr>
-        <w:pStyle w:val="Normaali2"/>
-      </w:pPr>
-    </w:p>
-    <w:p>
-      <w:pPr>
-        <w:pStyle w:val="Normaali2"/>
-      </w:pPr>
-      <w:r>
-        <w:t xml:space="preserve">As a point of clarification: If a character makes three actions in a season, regardless of their outcome, they will begin their next season tired. This tiredness then </w:t>
-      </w:r>
-      <w:r>
-        <w:t xml:space="preserve">sets them up for a strain penalty in </w:t>
-      </w:r>
-      <w:r>
-        <w:t>whatever</w:t>
-      </w:r>
-      <w:r>
-        <w:t xml:space="preserve"> collective action they have chosen. The only exception to this rule is if they get to be the next Keeper. Keeper doesn’t inherit tiredness from non-keeper actions. Likewise, the player who overplayed as keeper and then lost the position, won’t start their next season as a regular player tired.</w:t>
-      </w:r>
-    </w:p>
-    <w:p>
-      <w:pPr>
-        <w:pStyle w:val="Normaali2"/>
-      </w:pPr>
-    </w:p>
-    <w:p>
-      <w:pPr>
-        <w:pStyle w:val="Otsikko4"/>
-      </w:pPr>
-      <w:r>
         <w:t>4.</w:t>
       </w:r>
       <w:r>
@@ -6065,7 +6232,6 @@
         <w:pStyle w:val="Otsikko4"/>
       </w:pPr>
       <w:r>
-        <w:lastRenderedPageBreak/>
         <w:t>4.</w:t>
       </w:r>
       <w:r>
@@ -6158,7 +6324,11 @@
         <w:t xml:space="preserve">A track that has not been recorded yet exists as an open game object (a VHS tape with its name) that is interacted with via rehearse actions. </w:t>
       </w:r>
       <w:r>
-        <w:t xml:space="preserve">If a C-cassette is available, the band leader may choose the </w:t>
+        <w:t xml:space="preserve">If a C-cassette </w:t>
+      </w:r>
+      <w:r>
+        <w:lastRenderedPageBreak/>
+        <w:t xml:space="preserve">is available, the band leader may choose the </w:t>
       </w:r>
       <w:r>
         <w:rPr>
@@ -6265,6 +6435,111 @@
       <w:r>
         <w:t xml:space="preserve">Promotional actions are for getting others acquainted with your materials beyond the Keeper’s supervision. </w:t>
       </w:r>
+    </w:p>
+    <w:p>
+      <w:pPr>
+        <w:pStyle w:val="Normaali2"/>
+      </w:pPr>
+      <w:r>
+        <w:rPr>
+          <w:b/>
+          <w:bCs/>
+        </w:rPr>
+        <w:t>Strain penalty:</w:t>
+      </w:r>
+      <w:r>
+        <w:t xml:space="preserve"> </w:t>
+      </w:r>
+      <w:r>
+        <w:rPr>
+          <w:b/>
+          <w:bCs/>
+        </w:rPr>
+        <w:t>Too on the nose.</w:t>
+      </w:r>
+      <w:r>
+        <w:t xml:space="preserve"> </w:t>
+      </w:r>
+      <w:r>
+        <w:t>The character must interact</w:t>
+      </w:r>
+      <w:r>
+        <w:t xml:space="preserve"> negatively</w:t>
+      </w:r>
+      <w:r>
+        <w:t xml:space="preserve"> with any instance of their convictional anti-tag at the next convenient moment</w:t>
+      </w:r>
+      <w:r>
+        <w:t>, unless they take a rest instead.</w:t>
+      </w:r>
+    </w:p>
+    <w:p>
+      <w:pPr>
+        <w:pStyle w:val="Otsikko4"/>
+      </w:pPr>
+      <w:r>
+        <w:t>4.</w:t>
+      </w:r>
+      <w:r>
+        <w:t>3</w:t>
+      </w:r>
+      <w:r>
+        <w:t>.4 Keeper Actions</w:t>
+      </w:r>
+      <w:r>
+        <w:br/>
+      </w:r>
+    </w:p>
+    <w:p>
+      <w:pPr>
+        <w:pStyle w:val="Normaali2"/>
+        <w:rPr>
+          <w:i/>
+          <w:iCs/>
+        </w:rPr>
+      </w:pPr>
+      <w:r>
+        <w:rPr>
+          <w:i/>
+          <w:iCs/>
+        </w:rPr>
+        <w:t>Design intent: Keeper mechanics model informal gatekeeping common to small subcultures, where authority is influential but neither fully centralized nor fully transparent.</w:t>
+      </w:r>
+    </w:p>
+    <w:p>
+      <w:pPr>
+        <w:pStyle w:val="Normaali2"/>
+      </w:pPr>
+    </w:p>
+    <w:p>
+      <w:pPr>
+        <w:pStyle w:val="Normaali2"/>
+      </w:pPr>
+      <w:r>
+        <w:t>The Keeper has powerful, genre-bending decisions at their disposal. For example, they can declare a demo as black metal even if it lacks the genre defining re-sacralising tag-pair (see 4.5). They can lose other people’s demos and thus hinder their circulation in the scene. They can also take credit from other people’s actions at slightest hints of involvement.</w:t>
+      </w:r>
+      <w:r>
+        <w:t xml:space="preserve"> </w:t>
+      </w:r>
+      <w:r>
+        <w:t>They can declare a relatively weak aspect or tag as heretical to the sound, or conversely, bring an aspect or tag that seems on the periphery of True into the fold legitimately. The price for these actions is that the next Keeper in line has access to the same actions and might be able to retaliate.</w:t>
+      </w:r>
+      <w:r>
+        <w:t xml:space="preserve"> </w:t>
+      </w:r>
+    </w:p>
+    <w:p>
+      <w:pPr>
+        <w:pStyle w:val="Normaali2"/>
+      </w:pPr>
+      <w:r>
+        <w:t xml:space="preserve">Keepers have a trait called “Pull”, that is derived from their influence at the start of their position as Keeper. It is an expendable resource, that gets somewhat replenished at the start of each new round (unless the Keeper changes). All Keeper actions cost Pull, and the bigger the actions, the bigger the cost. If a keeper goes past their max Pull with an action, they can no longer do Keeper actions and are considered tired and suffer the strain penalty. </w:t>
+      </w:r>
+    </w:p>
+    <w:p>
+      <w:pPr>
+        <w:pStyle w:val="Normaali2"/>
+      </w:pPr>
     </w:p>
     <w:p>
       <w:pPr>
@@ -6286,111 +6561,6 @@
           <w:b/>
           <w:bCs/>
         </w:rPr>
-        <w:t>Too on the nose.</w:t>
-      </w:r>
-      <w:r>
-        <w:t xml:space="preserve"> </w:t>
-      </w:r>
-      <w:r>
-        <w:t>The character must interact</w:t>
-      </w:r>
-      <w:r>
-        <w:t xml:space="preserve"> negatively</w:t>
-      </w:r>
-      <w:r>
-        <w:t xml:space="preserve"> with any instance of their convictional anti-tag at the next convenient moment</w:t>
-      </w:r>
-      <w:r>
-        <w:t>, unless they take a rest instead.</w:t>
-      </w:r>
-    </w:p>
-    <w:p>
-      <w:pPr>
-        <w:pStyle w:val="Otsikko4"/>
-      </w:pPr>
-      <w:r>
-        <w:t>4.</w:t>
-      </w:r>
-      <w:r>
-        <w:t>3</w:t>
-      </w:r>
-      <w:r>
-        <w:t>.4 Keeper Actions</w:t>
-      </w:r>
-      <w:r>
-        <w:br/>
-      </w:r>
-    </w:p>
-    <w:p>
-      <w:pPr>
-        <w:pStyle w:val="Normaali2"/>
-        <w:rPr>
-          <w:i/>
-          <w:iCs/>
-        </w:rPr>
-      </w:pPr>
-      <w:r>
-        <w:rPr>
-          <w:i/>
-          <w:iCs/>
-        </w:rPr>
-        <w:t>Design intent: Keeper mechanics model informal gatekeeping common to small subcultures, where authority is influential but neither fully centralized nor fully transparent.</w:t>
-      </w:r>
-    </w:p>
-    <w:p>
-      <w:pPr>
-        <w:pStyle w:val="Normaali2"/>
-      </w:pPr>
-    </w:p>
-    <w:p>
-      <w:pPr>
-        <w:pStyle w:val="Normaali2"/>
-      </w:pPr>
-      <w:r>
-        <w:t>The Keeper has powerful, genre-bending decisions at their disposal. For example, they can declare a demo as black metal even if it lacks the genre defining re-sacralising tag-pair (see 4.5). They can lose other people’s demos and thus hinder their circulation in the scene. They can also take credit from other people’s actions at slightest hints of involvement.</w:t>
-      </w:r>
-      <w:r>
-        <w:t xml:space="preserve"> </w:t>
-      </w:r>
-      <w:r>
-        <w:t>They can declare a relatively weak aspect or tag as heretical to the sound, or conversely, bring an aspect or tag that seems on the periphery of True into the fold legitimately. The price for these actions is that the next Keeper in line has access to the same actions and might be able to retaliate.</w:t>
-      </w:r>
-      <w:r>
-        <w:t xml:space="preserve"> </w:t>
-      </w:r>
-    </w:p>
-    <w:p>
-      <w:pPr>
-        <w:pStyle w:val="Normaali2"/>
-      </w:pPr>
-      <w:r>
-        <w:t xml:space="preserve">Keepers have a trait called “Pull”, that is derived from their influence at the start of their position as Keeper. It is an expendable resource, that gets somewhat replenished at the start of each new round (unless the Keeper changes). All Keeper actions cost Pull, and the bigger the actions, the bigger the cost. If a keeper goes past their max Pull with an action, they can no longer do Keeper actions and are considered tired and suffer the strain penalty. </w:t>
-      </w:r>
-    </w:p>
-    <w:p>
-      <w:pPr>
-        <w:pStyle w:val="Normaali2"/>
-      </w:pPr>
-    </w:p>
-    <w:p>
-      <w:pPr>
-        <w:pStyle w:val="Normaali2"/>
-      </w:pPr>
-      <w:r>
-        <w:rPr>
-          <w:b/>
-          <w:bCs/>
-        </w:rPr>
-        <w:t>Strain penalty:</w:t>
-      </w:r>
-      <w:r>
-        <w:t xml:space="preserve"> </w:t>
-      </w:r>
-      <w:r>
-        <w:rPr>
-          <w:b/>
-          <w:bCs/>
-        </w:rPr>
         <w:t>Overreach.</w:t>
       </w:r>
       <w:r>
@@ -6438,7 +6608,7 @@
       <w:r>
         <w:t xml:space="preserve">  </w:t>
       </w:r>
-      <w:bookmarkStart w:id="8" w:name="_Toc220496099"/>
+      <w:bookmarkStart w:id="8" w:name="_Toc221100888"/>
       <w:r>
         <w:t>4.</w:t>
       </w:r>
@@ -6462,7 +6632,6 @@
         <w:pStyle w:val="Normaali2"/>
       </w:pPr>
       <w:r>
-        <w:lastRenderedPageBreak/>
         <w:t xml:space="preserve">An aspect is </w:t>
       </w:r>
       <w:r>
@@ -6595,9 +6764,10 @@
         <w:spacing w:before="0" w:line="240" w:lineRule="auto"/>
       </w:pPr>
       <w:r>
+        <w:lastRenderedPageBreak/>
         <w:t xml:space="preserve">  </w:t>
       </w:r>
-      <w:bookmarkStart w:id="9" w:name="_Toc220496100"/>
+      <w:bookmarkStart w:id="9" w:name="_Toc221100889"/>
       <w:r>
         <w:t>4.</w:t>
       </w:r>
@@ -6817,6 +6987,7 @@
         <w:pStyle w:val="Normaali2"/>
       </w:pPr>
       <w:r>
+        <w:lastRenderedPageBreak/>
         <w:t xml:space="preserve">The exact lists of tags follow another design principle, </w:t>
       </w:r>
       <w:r>
@@ -6856,11 +7027,7 @@
         <w:t>Tag permutations</w:t>
       </w:r>
       <w:r>
-        <w:t xml:space="preserve"> are the actual, concrete form in which the tag manifests in the game. Permutations themselves have further determination principles. For example, the tag Sacred, must manifest in a permutation such as “polytheist Nordic paganism”. Polytheism is the actual permutation, and the “Nordic paganism” part is a specific type of polytheism.  Some permutations can be shared with different tags, so they can be played as any of these tags when they come to play – for example the permutation “energetic” is shared by the tags “Vital”, “Warm” and “Fast”. It is the permutation that is in play that is owned by the player who originally made it, but only in the context of </w:t>
-      </w:r>
-      <w:r>
-        <w:lastRenderedPageBreak/>
-        <w:t>the tag it manifests: If Player 1 introduced Energetic as a permutation of Fast, but Player 2 brought Energetic as a permutation of Vital, they are a different instance of Energetic.</w:t>
+        <w:t xml:space="preserve"> are the actual, concrete form in which the tag manifests in the game. Permutations themselves have further determination principles. For example, the tag Sacred, must manifest in a permutation such as “polytheist Nordic paganism”. Polytheism is the actual permutation, and the “Nordic paganism” part is a specific type of polytheism.  Some permutations can be shared with different tags, so they can be played as any of these tags when they come to play – for example the permutation “energetic” is shared by the tags “Vital”, “Warm” and “Fast”. It is the permutation that is in play that is owned by the player who originally made it, but only in the context of the tag it manifests: If Player 1 introduced Energetic as a permutation of Fast, but Player 2 brought Energetic as a permutation of Vital, they are a different instance of Energetic.</w:t>
       </w:r>
       <w:r>
         <w:t xml:space="preserve"> Player 3 must bring in Energetic as Warmth, or their progress is shared with player 1 or 2 (who played Energetic earlier and are likely already ahead).</w:t>
@@ -6879,9 +7046,15 @@
         <w:pStyle w:val="Otsikko3"/>
         <w:spacing w:before="0" w:line="240" w:lineRule="auto"/>
       </w:pPr>
-      <w:bookmarkStart w:id="10" w:name="_Toc220496101"/>
-      <w:r>
-        <w:t>4.5 Tag-Pairs and genre specific systems</w:t>
+      <w:bookmarkStart w:id="10" w:name="_Toc221100890"/>
+      <w:r>
+        <w:t>4.</w:t>
+      </w:r>
+      <w:r>
+        <w:t>6</w:t>
+      </w:r>
+      <w:r>
+        <w:t xml:space="preserve"> Tag-Pairs and genre specific systems</w:t>
       </w:r>
       <w:bookmarkEnd w:id="10"/>
     </w:p>
@@ -6948,7 +7121,11 @@
         <w:pStyle w:val="Normaali2"/>
       </w:pPr>
       <w:r>
-        <w:t>Nullsvorn can write lyrics about paganism all day long, but they must actively mock organized religion by building a pagan – organized religion tag-pair to their lyrics. The act of engaging with the subject matter is disturbing and builds into a visceral reaction on the record, which the listener can hear. The outcome is “serious”, not just a surface act. So, a re-sacralising tag-pair is made of tag and its anti-tag, the latter which evaporates quickly unless it is pinned down somehow.</w:t>
+        <w:t xml:space="preserve">Nullsvorn can write lyrics about paganism all day long, but they must actively mock organized religion by building a pagan – organized religion tag-pair to their lyrics. The act of engaging with the subject matter is disturbing and builds into a visceral reaction on the record, which the listener can hear. The outcome is “serious”, not just a surface </w:t>
+      </w:r>
+      <w:r>
+        <w:lastRenderedPageBreak/>
+        <w:t>act. So, a re-sacralising tag-pair is made of tag and its anti-tag, the latter which evaporates quickly unless it is pinned down somehow.</w:t>
       </w:r>
     </w:p>
     <w:p/>
@@ -6958,9 +7135,15 @@
       <w:pPr>
         <w:pStyle w:val="Otsikko3"/>
       </w:pPr>
-      <w:bookmarkStart w:id="11" w:name="_Toc220496102"/>
-      <w:r>
-        <w:t xml:space="preserve">4.6. </w:t>
+      <w:bookmarkStart w:id="11" w:name="_Toc221100891"/>
+      <w:r>
+        <w:t>4.</w:t>
+      </w:r>
+      <w:r>
+        <w:t>7</w:t>
+      </w:r>
+      <w:r>
+        <w:t xml:space="preserve">. </w:t>
       </w:r>
       <w:r>
         <w:t>TRUE vs true, novelty, and gravity</w:t>
@@ -6990,95 +7173,95 @@
         <w:pStyle w:val="Normaali2"/>
       </w:pPr>
       <w:r>
+        <w:t>The tag-pair concept is a deeper game mechanic tha</w:t>
+      </w:r>
+      <w:r>
+        <w:t>n</w:t>
+      </w:r>
+      <w:r>
+        <w:t xml:space="preserve"> what is superficially considered “true” in the game. The surface level true is just the prevalent tags already present in the game as influential demo tapes. This simplistic level of true is the primary way in which the players accumulate resources. They make “true sounding” music for the scene by matching the correct tags and aspects to what is expected of them. “Screaming about the devil alongside basic band instruments played in a certain fashion” passes for true to most listeners. Each tag they manage to put to play, gives them a score yield (along with the person who originally put the tag in play).</w:t>
+      </w:r>
+      <w:r>
+        <w:t xml:space="preserve"> </w:t>
+      </w:r>
+    </w:p>
+    <w:p>
+      <w:pPr>
+        <w:pStyle w:val="Normaali2"/>
+      </w:pPr>
+    </w:p>
+    <w:p>
+      <w:pPr>
+        <w:pStyle w:val="Normaali2"/>
+      </w:pPr>
+      <w:r>
+        <w:t xml:space="preserve">However, if a release doesn’t contain a single instance of the blackened tag-pair, it is disqualified unless the Keeper declares the record as true black metal. Besides that, any aspect that carries a blackened tag pair can be played, even if the aspect itself is unconventional, and it automatically gains </w:t>
+      </w:r>
+      <w:r>
+        <w:t>the novelty factor</w:t>
+      </w:r>
+      <w:r>
+        <w:t xml:space="preserve"> as an advantage. The only way to get a true black metal record ignored is if it isn’t promoted at all while the conveyance score of the demos in circulation erodes to such a low point that the intent doesn’t transmit to the listener </w:t>
+      </w:r>
+      <w:r>
+        <w:t xml:space="preserve">at all, the master is destroyed, </w:t>
+      </w:r>
+      <w:r>
+        <w:t>and the Keeper loses</w:t>
+      </w:r>
+      <w:r>
+        <w:t xml:space="preserve"> their copy “</w:t>
+      </w:r>
+      <w:r>
+        <w:t>by mistake”.</w:t>
+      </w:r>
+    </w:p>
+    <w:p>
+      <w:pPr>
+        <w:pStyle w:val="Normaali2"/>
+      </w:pPr>
+    </w:p>
+    <w:p>
+      <w:pPr>
+        <w:pStyle w:val="Normaali2"/>
+      </w:pPr>
+      <w:r>
+        <w:t>A distinction between what is true on superficial level and what is true because of the tag-pair must be made. Hence, lowercase true means things that are accepted into the scene for the time being, and uppercase T</w:t>
+      </w:r>
+      <w:r>
+        <w:t xml:space="preserve">RUE </w:t>
+      </w:r>
+      <w:r>
+        <w:t>means the things that are undeniably legitimate no matter the perspective. A re-sacralising tag-pair is always T</w:t>
+      </w:r>
+      <w:r>
+        <w:t>RUE</w:t>
+      </w:r>
+      <w:r>
+        <w:t xml:space="preserve">. If something is considered True, it has a trait called </w:t>
+      </w:r>
+      <w:r>
+        <w:rPr>
+          <w:b/>
+          <w:bCs/>
+        </w:rPr>
+        <w:t>gravity</w:t>
+      </w:r>
+      <w:r>
+        <w:t xml:space="preserve">. </w:t>
+      </w:r>
+    </w:p>
+    <w:p>
+      <w:pPr>
+        <w:pStyle w:val="Normaali2"/>
+      </w:pPr>
+    </w:p>
+    <w:p>
+      <w:pPr>
+        <w:pStyle w:val="Normaali2"/>
+      </w:pPr>
+      <w:r>
         <w:lastRenderedPageBreak/>
-        <w:t>The tag-pair concept is a deeper game mechanic tha</w:t>
-      </w:r>
-      <w:r>
-        <w:t>n</w:t>
-      </w:r>
-      <w:r>
-        <w:t xml:space="preserve"> what is superficially considered “true” in the game. The surface level true is just the prevalent tags already present in the game as influential demo tapes. This simplistic level of true is the primary way in which the players accumulate resources. They make “true sounding” music for the scene by matching the correct tags and aspects to what is expected of them. “Screaming about the devil alongside basic band instruments played in a certain fashion” passes for true to most listeners. Each tag they manage to put to play, gives them a score yield (along with the person who originally put the tag in play).</w:t>
-      </w:r>
-      <w:r>
-        <w:t xml:space="preserve"> </w:t>
-      </w:r>
-    </w:p>
-    <w:p>
-      <w:pPr>
-        <w:pStyle w:val="Normaali2"/>
-      </w:pPr>
-    </w:p>
-    <w:p>
-      <w:pPr>
-        <w:pStyle w:val="Normaali2"/>
-      </w:pPr>
-      <w:r>
-        <w:t xml:space="preserve">However, if a release doesn’t contain a single instance of the blackened tag-pair, it is disqualified unless the Keeper declares the record as true black metal. Besides that, any aspect that carries a blackened tag pair can be played, even if the aspect itself is unconventional, and it automatically gains </w:t>
-      </w:r>
-      <w:r>
-        <w:t>the novelty factor</w:t>
-      </w:r>
-      <w:r>
-        <w:t xml:space="preserve"> as an advantage. The only way to get a true black metal record ignored is if it isn’t promoted at all while the conveyance score of the demos in circulation erodes to such a low point that the intent doesn’t transmit to the listener </w:t>
-      </w:r>
-      <w:r>
-        <w:t xml:space="preserve">at all, the master is destroyed, </w:t>
-      </w:r>
-      <w:r>
-        <w:t>and the Keeper loses</w:t>
-      </w:r>
-      <w:r>
-        <w:t xml:space="preserve"> their copy “</w:t>
-      </w:r>
-      <w:r>
-        <w:t>by mistake”.</w:t>
-      </w:r>
-    </w:p>
-    <w:p>
-      <w:pPr>
-        <w:pStyle w:val="Normaali2"/>
-      </w:pPr>
-    </w:p>
-    <w:p>
-      <w:pPr>
-        <w:pStyle w:val="Normaali2"/>
-      </w:pPr>
-      <w:r>
-        <w:t>A distinction between what is true on superficial level and what is true because of the tag-pair must be made. Hence, lowercase true means things that are accepted into the scene for the time being, and uppercase T</w:t>
-      </w:r>
-      <w:r>
-        <w:t xml:space="preserve">RUE </w:t>
-      </w:r>
-      <w:r>
-        <w:t>means the things that are undeniably legitimate no matter the perspective. A re-sacralising tag-pair is always T</w:t>
-      </w:r>
-      <w:r>
-        <w:t>RUE</w:t>
-      </w:r>
-      <w:r>
-        <w:t xml:space="preserve">. If something is considered True, it has a trait called </w:t>
-      </w:r>
-      <w:r>
-        <w:rPr>
-          <w:b/>
-          <w:bCs/>
-        </w:rPr>
-        <w:t>gravity</w:t>
-      </w:r>
-      <w:r>
-        <w:t xml:space="preserve">. </w:t>
-      </w:r>
-    </w:p>
-    <w:p>
-      <w:pPr>
-        <w:pStyle w:val="Normaali2"/>
-      </w:pPr>
-    </w:p>
-    <w:p>
-      <w:pPr>
-        <w:pStyle w:val="Normaali2"/>
-      </w:pPr>
-      <w:r>
         <w:t>When a tag or tag-pair gets played as TRUE, it pulls all the other tags it accompanies on the recording with it further into the centre of the scene’s thematics by the factor of its gravity. It also pushes against the anti-tag component with the same factor, if viable (the anti-tag is not likely in play as an individual entity). Gravity is also the value the Keeper must work against if they want to remove it from the table.</w:t>
       </w:r>
       <w:r>
@@ -7109,12 +7292,12 @@
       <w:r>
         <w:t xml:space="preserve">  </w:t>
       </w:r>
-      <w:bookmarkStart w:id="12" w:name="_Toc220496103"/>
+      <w:bookmarkStart w:id="12" w:name="_Toc221100892"/>
       <w:r>
         <w:t>4.</w:t>
       </w:r>
       <w:r>
-        <w:t>7</w:t>
+        <w:t>8</w:t>
       </w:r>
       <w:r>
         <w:t xml:space="preserve"> Track Construction and Recording</w:t>
@@ -7177,7 +7360,43 @@
         <w:t xml:space="preserve"> permutations</w:t>
       </w:r>
       <w:r>
-        <w:t xml:space="preserve">. The aspects and tags are owned by game objects of the game entity class, such as buildings, environments and people. </w:t>
+        <w:t>. The aspects</w:t>
+      </w:r>
+      <w:r>
+        <w:t xml:space="preserve"> are held by actor and controller class game entities</w:t>
+      </w:r>
+      <w:r>
+        <w:t xml:space="preserve"> and tags are owned by </w:t>
+      </w:r>
+      <w:r>
+        <w:t xml:space="preserve">all </w:t>
+      </w:r>
+      <w:r>
+        <w:t>game entit</w:t>
+      </w:r>
+      <w:r>
+        <w:t>ies</w:t>
+      </w:r>
+      <w:r>
+        <w:t>, such as buildings</w:t>
+      </w:r>
+      <w:r>
+        <w:t xml:space="preserve"> and</w:t>
+      </w:r>
+      <w:r>
+        <w:t xml:space="preserve"> environments</w:t>
+      </w:r>
+      <w:r>
+        <w:t>,</w:t>
+      </w:r>
+      <w:r>
+        <w:t xml:space="preserve"> </w:t>
+      </w:r>
+      <w:r>
+        <w:t>not just</w:t>
+      </w:r>
+      <w:r>
+        <w:t xml:space="preserve"> people. </w:t>
       </w:r>
     </w:p>
     <w:p>
@@ -7222,8 +7441,28 @@
       <w:pPr>
         <w:pStyle w:val="Normaali2"/>
       </w:pPr>
-      <w:r>
-        <w:t xml:space="preserve">A demo recording of any length is created when a band collective is chosen to exist in rehearsal state. The rehearsal state does not necessitate a product of a demo tape, instead, rehearsal by necessity produces </w:t>
+    </w:p>
+    <w:p>
+      <w:pPr>
+        <w:pStyle w:val="Normaali2"/>
+      </w:pPr>
+      <w:r>
+        <w:t xml:space="preserve">A demo recording of any length is created </w:t>
+      </w:r>
+      <w:r>
+        <w:t>after</w:t>
+      </w:r>
+      <w:r>
+        <w:t xml:space="preserve"> a band collective is chosen to exist in rehearsal </w:t>
+      </w:r>
+      <w:r>
+        <w:t>state and</w:t>
+      </w:r>
+      <w:r>
+        <w:t xml:space="preserve"> uses the demo recording action</w:t>
+      </w:r>
+      <w:r>
+        <w:t xml:space="preserve">. The rehearsal state does not necessitate a product of a demo tape, instead, rehearsal by necessity produces </w:t>
       </w:r>
       <w:r>
         <w:t xml:space="preserve">or improves </w:t>
@@ -7235,15 +7474,37 @@
         <w:t xml:space="preserve"> for the current VHS tape that the audio recording is created. The player can then choose other tracks for the recording from the shelf as well, up to the maximum running time of the C-Cassette (46, 60 or 90 minutes).</w:t>
       </w:r>
       <w:r>
-        <w:t xml:space="preserve"> The entire recording process takes one action per collaborator, regardless of the length of the tape. </w:t>
-      </w:r>
-    </w:p>
-    <w:p>
-      <w:pPr>
-        <w:pStyle w:val="Normaali2"/>
-      </w:pPr>
+        <w:t xml:space="preserve"> The </w:t>
+      </w:r>
       <w:r>
         <w:lastRenderedPageBreak/>
+        <w:t xml:space="preserve">entire recording process takes one action per collaborator, regardless of the length of the tape. </w:t>
+      </w:r>
+      <w:r>
+        <w:t xml:space="preserve">It is possible to record </w:t>
+      </w:r>
+      <w:proofErr w:type="gramStart"/>
+      <w:r>
+        <w:t>ones</w:t>
+      </w:r>
+      <w:proofErr w:type="gramEnd"/>
+      <w:r>
+        <w:t xml:space="preserve"> own material over another bands demo, and even copy a third party’s effort over another, should a copy ever reach </w:t>
+      </w:r>
+      <w:proofErr w:type="gramStart"/>
+      <w:r>
+        <w:t>ones</w:t>
+      </w:r>
+      <w:proofErr w:type="gramEnd"/>
+      <w:r>
+        <w:t xml:space="preserve"> hands. </w:t>
+      </w:r>
+    </w:p>
+    <w:p>
+      <w:pPr>
+        <w:pStyle w:val="Normaali2"/>
+      </w:pPr>
+      <w:r>
         <w:t>A track that ends up on a demo tape while considered not fully composed receives “sketchy” trait</w:t>
       </w:r>
       <w:r>
@@ -7260,7 +7521,13 @@
         <w:pStyle w:val="Normaali2"/>
       </w:pPr>
       <w:r>
-        <w:t>Once recorded, a demo tape enters circulation and becomes eligible for promotion, degradation through copying, Keeper intervention, and representation on the thematic scene map.</w:t>
+        <w:t xml:space="preserve">Once recorded, a demo tape </w:t>
+      </w:r>
+      <w:r>
+        <w:t xml:space="preserve">usually </w:t>
+      </w:r>
+      <w:r>
+        <w:t>enters circulation and becomes eligible for promotion, degradation through copying, Keeper intervention, and representation on the thematic scene map.</w:t>
       </w:r>
     </w:p>
     <w:p/>
@@ -7272,39 +7539,110 @@
       <w:r>
         <w:t xml:space="preserve">  </w:t>
       </w:r>
-      <w:bookmarkStart w:id="13" w:name="_Toc220496104"/>
-      <w:r>
-        <w:t>4.</w:t>
-      </w:r>
-      <w:r>
-        <w:t>8</w:t>
-      </w:r>
-      <w:r>
-        <w:t xml:space="preserve"> Band and Collective Systems</w:t>
-      </w:r>
-      <w:bookmarkEnd w:id="13"/>
+    </w:p>
+    <w:p>
+      <w:pPr>
+        <w:rPr>
+          <w:color w:val="434343"/>
+          <w:sz w:val="28"/>
+          <w:szCs w:val="28"/>
+        </w:rPr>
+      </w:pPr>
+      <w:r>
+        <w:br w:type="page"/>
+      </w:r>
     </w:p>
     <w:p>
       <w:pPr>
         <w:pStyle w:val="Otsikko3"/>
         <w:spacing w:before="0" w:line="240" w:lineRule="auto"/>
       </w:pPr>
-      <w:r>
-        <w:t xml:space="preserve">  </w:t>
-      </w:r>
-      <w:bookmarkStart w:id="14" w:name="_Toc220496105"/>
-      <w:r>
+      <w:bookmarkStart w:id="13" w:name="_Toc221100893"/>
+      <w:r>
+        <w:lastRenderedPageBreak/>
         <w:t>4.</w:t>
       </w:r>
       <w:r>
         <w:t>9</w:t>
       </w:r>
       <w:r>
-        <w:t xml:space="preserve"> Multiplayer Mode</w:t>
+        <w:t xml:space="preserve"> Band and Collective Systems</w:t>
+      </w:r>
+      <w:bookmarkEnd w:id="13"/>
+    </w:p>
+    <w:p>
+      <w:pPr>
+        <w:rPr>
+          <w:color w:val="434343"/>
+          <w:sz w:val="28"/>
+          <w:szCs w:val="28"/>
+        </w:rPr>
+      </w:pPr>
+      <w:r>
+        <w:t>- The tape exchange and cultural dynamics are going to be explained here</w:t>
+      </w:r>
+      <w:r>
+        <w:br w:type="page"/>
+      </w:r>
+    </w:p>
+    <w:p>
+      <w:pPr>
+        <w:pStyle w:val="Otsikko3"/>
+        <w:spacing w:before="0" w:line="240" w:lineRule="auto"/>
+      </w:pPr>
+      <w:bookmarkStart w:id="14" w:name="_Toc221100894"/>
+      <w:r>
+        <w:lastRenderedPageBreak/>
+        <w:t>4.</w:t>
+      </w:r>
+      <w:r>
+        <w:t>10</w:t>
+      </w:r>
+      <w:r>
+        <w:t xml:space="preserve"> </w:t>
+      </w:r>
+      <w:r>
+        <w:t>Items and Item Mechanisms</w:t>
       </w:r>
       <w:bookmarkEnd w:id="14"/>
     </w:p>
-    <w:p/>
+    <w:p>
+      <w:r>
+        <w:t>- I will be explaining tape and cassette mechanisms here, along with the soft economy of the game</w:t>
+      </w:r>
+      <w:r>
+        <w:br w:type="page"/>
+      </w:r>
+    </w:p>
+    <w:p>
+      <w:pPr>
+        <w:pStyle w:val="Otsikko3"/>
+        <w:spacing w:before="0" w:line="240" w:lineRule="auto"/>
+      </w:pPr>
+      <w:bookmarkStart w:id="15" w:name="_Toc221100895"/>
+      <w:r>
+        <w:lastRenderedPageBreak/>
+        <w:t>4.</w:t>
+      </w:r>
+      <w:r>
+        <w:t>1</w:t>
+      </w:r>
+      <w:r>
+        <w:t>1</w:t>
+      </w:r>
+      <w:r>
+        <w:t xml:space="preserve"> </w:t>
+      </w:r>
+      <w:r>
+        <w:t>Multiplayer Mode (The only game in town)</w:t>
+      </w:r>
+      <w:bookmarkEnd w:id="15"/>
+    </w:p>
+    <w:p>
+      <w:r>
+        <w:t>- A short description of how a game session of Demo(N)Tapes works at a networking level</w:t>
+      </w:r>
+    </w:p>
     <w:p>
       <w:pPr>
         <w:rPr>
@@ -7321,12 +7659,12 @@
         <w:pStyle w:val="Otsikko2"/>
         <w:spacing w:before="0" w:line="240" w:lineRule="auto"/>
       </w:pPr>
-      <w:bookmarkStart w:id="15" w:name="_Toc220496106"/>
+      <w:bookmarkStart w:id="16" w:name="_Toc221100896"/>
       <w:r>
         <w:lastRenderedPageBreak/>
         <w:t>5. Genre, Setting, Concept Art book*</w:t>
       </w:r>
-      <w:bookmarkEnd w:id="15"/>
+      <w:bookmarkEnd w:id="16"/>
     </w:p>
     <w:p>
       <w:pPr>
@@ -7336,6 +7674,9 @@
         </w:rPr>
       </w:pPr>
       <w:r>
+        <w:t>- Keep this short</w:t>
+      </w:r>
+      <w:r>
         <w:br w:type="page"/>
       </w:r>
     </w:p>
@@ -7344,12 +7685,12 @@
         <w:pStyle w:val="Otsikko2"/>
         <w:spacing w:before="0" w:line="240" w:lineRule="auto"/>
       </w:pPr>
-      <w:bookmarkStart w:id="16" w:name="_Toc220496107"/>
+      <w:bookmarkStart w:id="17" w:name="_Toc221100897"/>
       <w:r>
         <w:lastRenderedPageBreak/>
         <w:t>6. Enemies, NPCs, Other objects</w:t>
       </w:r>
-      <w:bookmarkEnd w:id="16"/>
+      <w:bookmarkEnd w:id="17"/>
     </w:p>
     <w:p>
       <w:pPr>
@@ -7359,6 +7700,9 @@
         </w:rPr>
       </w:pPr>
       <w:r>
+        <w:t>I can describe classes here in technical detail if I want to</w:t>
+      </w:r>
+      <w:r>
         <w:br w:type="page"/>
       </w:r>
     </w:p>
@@ -7367,12 +7711,12 @@
         <w:pStyle w:val="Otsikko2"/>
         <w:spacing w:before="0" w:line="240" w:lineRule="auto"/>
       </w:pPr>
-      <w:bookmarkStart w:id="17" w:name="_Toc220496108"/>
+      <w:bookmarkStart w:id="18" w:name="_Toc221100898"/>
       <w:r>
         <w:lastRenderedPageBreak/>
         <w:t>7. Story board, script*</w:t>
       </w:r>
-      <w:bookmarkEnd w:id="17"/>
+      <w:bookmarkEnd w:id="18"/>
     </w:p>
     <w:p>
       <w:pPr>
@@ -7382,11 +7726,11 @@
       <w:r>
         <w:t xml:space="preserve">  </w:t>
       </w:r>
-      <w:bookmarkStart w:id="18" w:name="_Toc220496109"/>
+      <w:bookmarkStart w:id="19" w:name="_Toc221100899"/>
       <w:r>
         <w:t>7.1 Story overview</w:t>
       </w:r>
-      <w:bookmarkEnd w:id="18"/>
+      <w:bookmarkEnd w:id="19"/>
     </w:p>
     <w:p>
       <w:pPr>
@@ -7396,11 +7740,11 @@
       <w:r>
         <w:t xml:space="preserve">  </w:t>
       </w:r>
-      <w:bookmarkStart w:id="19" w:name="_Toc220496110"/>
+      <w:bookmarkStart w:id="20" w:name="_Toc221100900"/>
       <w:r>
         <w:t>7.2 Progression, World 1</w:t>
       </w:r>
-      <w:bookmarkEnd w:id="19"/>
+      <w:bookmarkEnd w:id="20"/>
     </w:p>
     <w:p>
       <w:pPr>
@@ -7410,14 +7754,20 @@
       <w:r>
         <w:t xml:space="preserve">  </w:t>
       </w:r>
-      <w:bookmarkStart w:id="20" w:name="_Toc220496111"/>
+      <w:bookmarkStart w:id="21" w:name="_Toc221100901"/>
       <w:r>
         <w:t xml:space="preserve">7.9 Progression, World </w:t>
       </w:r>
       <w:r>
         <w:t>2 …</w:t>
       </w:r>
-      <w:bookmarkEnd w:id="20"/>
+      <w:bookmarkEnd w:id="21"/>
+    </w:p>
+    <w:p/>
+    <w:p>
+      <w:r>
+        <w:t>Here I will describe the 2 or three ways the game can run in the largest scope with the endings.</w:t>
+      </w:r>
     </w:p>
     <w:p>
       <w:pPr>
@@ -7435,12 +7785,12 @@
         <w:pStyle w:val="Otsikko2"/>
         <w:spacing w:before="0" w:line="240" w:lineRule="auto"/>
       </w:pPr>
-      <w:bookmarkStart w:id="21" w:name="_Toc220496112"/>
+      <w:bookmarkStart w:id="22" w:name="_Toc221100902"/>
       <w:r>
         <w:lastRenderedPageBreak/>
         <w:t>8. Technical definitions, Tech guide*</w:t>
       </w:r>
-      <w:bookmarkEnd w:id="21"/>
+      <w:bookmarkEnd w:id="22"/>
     </w:p>
     <w:p>
       <w:pPr>
@@ -7450,11 +7800,11 @@
       <w:r>
         <w:t xml:space="preserve">  </w:t>
       </w:r>
-      <w:bookmarkStart w:id="22" w:name="_Toc220496113"/>
+      <w:bookmarkStart w:id="23" w:name="_Toc221100903"/>
       <w:r>
         <w:t>8.1 Platforms, versions</w:t>
       </w:r>
-      <w:bookmarkEnd w:id="22"/>
+      <w:bookmarkEnd w:id="23"/>
     </w:p>
     <w:p>
       <w:pPr>
@@ -7464,11 +7814,11 @@
       <w:r>
         <w:t xml:space="preserve">  </w:t>
       </w:r>
-      <w:bookmarkStart w:id="23" w:name="_Toc220496114"/>
+      <w:bookmarkStart w:id="24" w:name="_Toc221100904"/>
       <w:r>
         <w:t>8.2 Control Scheme</w:t>
       </w:r>
-      <w:bookmarkEnd w:id="23"/>
+      <w:bookmarkEnd w:id="24"/>
     </w:p>
     <w:p>
       <w:pPr>
@@ -7478,11 +7828,11 @@
       <w:r>
         <w:t xml:space="preserve">  </w:t>
       </w:r>
-      <w:bookmarkStart w:id="24" w:name="_Toc220496115"/>
+      <w:bookmarkStart w:id="25" w:name="_Toc221100905"/>
       <w:r>
         <w:t>8.3 Limitations</w:t>
       </w:r>
-      <w:bookmarkEnd w:id="24"/>
+      <w:bookmarkEnd w:id="25"/>
     </w:p>
     <w:p>
       <w:pPr>
@@ -7500,12 +7850,12 @@
         <w:pStyle w:val="Otsikko2"/>
         <w:spacing w:before="0" w:line="240" w:lineRule="auto"/>
       </w:pPr>
-      <w:bookmarkStart w:id="25" w:name="_Toc220496116"/>
+      <w:bookmarkStart w:id="26" w:name="_Toc221100906"/>
       <w:r>
         <w:lastRenderedPageBreak/>
         <w:t>9. Business definitions*</w:t>
       </w:r>
-      <w:bookmarkEnd w:id="25"/>
+      <w:bookmarkEnd w:id="26"/>
     </w:p>
     <w:p>
       <w:pPr>
@@ -7515,11 +7865,11 @@
       <w:r>
         <w:t xml:space="preserve">  </w:t>
       </w:r>
-      <w:bookmarkStart w:id="26" w:name="_Toc220496117"/>
+      <w:bookmarkStart w:id="27" w:name="_Toc221100907"/>
       <w:r>
         <w:t>9.1 In-app purchases</w:t>
       </w:r>
-      <w:bookmarkEnd w:id="26"/>
+      <w:bookmarkEnd w:id="27"/>
     </w:p>
     <w:p>
       <w:pPr>
@@ -7529,11 +7879,11 @@
       <w:r>
         <w:t xml:space="preserve">  </w:t>
       </w:r>
-      <w:bookmarkStart w:id="27" w:name="_Toc220496118"/>
+      <w:bookmarkStart w:id="28" w:name="_Toc221100908"/>
       <w:r>
         <w:t>9.2 DLC packs</w:t>
       </w:r>
-      <w:bookmarkEnd w:id="27"/>
+      <w:bookmarkEnd w:id="28"/>
     </w:p>
     <w:p>
       <w:pPr>
@@ -7551,12 +7901,12 @@
         <w:pStyle w:val="Otsikko2"/>
         <w:spacing w:before="0" w:line="240" w:lineRule="auto"/>
       </w:pPr>
-      <w:bookmarkStart w:id="28" w:name="_Toc220496119"/>
+      <w:bookmarkStart w:id="29" w:name="_Toc221100909"/>
       <w:r>
         <w:lastRenderedPageBreak/>
         <w:t>10. Outsourced/Bought Assets</w:t>
       </w:r>
-      <w:bookmarkEnd w:id="28"/>
+      <w:bookmarkEnd w:id="29"/>
     </w:p>
     <w:p>
       <w:pPr>
@@ -7641,7 +7991,7 @@
       <w:pPr>
         <w:pStyle w:val="Otsikko2"/>
       </w:pPr>
-      <w:bookmarkStart w:id="29" w:name="_Toc220496120"/>
+      <w:bookmarkStart w:id="30" w:name="_Toc221100910"/>
       <w:r>
         <w:lastRenderedPageBreak/>
         <w:t>11.</w:t>
@@ -7649,7 +7999,7 @@
       <w:r>
         <w:t xml:space="preserve"> Technical Terms</w:t>
       </w:r>
-      <w:bookmarkEnd w:id="29"/>
+      <w:bookmarkEnd w:id="30"/>
     </w:p>
     <w:p>
       <w:pPr>
@@ -13661,6 +14011,7 @@
   <w:style w:type="character" w:default="1" w:styleId="Kappaleenoletusfontti">
     <w:name w:val="Default Paragraph Font"/>
     <w:uiPriority w:val="1"/>
+    <w:semiHidden/>
     <w:unhideWhenUsed/>
   </w:style>
   <w:style w:type="table" w:default="1" w:styleId="Normaalitaulukko">

</xml_diff>